<commit_message>
[requirement] workflow into doc
</commit_message>
<xml_diff>
--- a/Document/02_Requirement/tanh/LiveBox_Report3_Software_Requirement_Specification.docx
+++ b/Document/02_Requirement/tanh/LiveBox_Report3_Software_Requirement_Specification.docx
@@ -1,6 +1,6 @@
 
 <file path=word/document.xml><?xml version="1.0" encoding="utf-8"?>
-<w:document xmlns:wpc="http://schemas.microsoft.com/office/word/2010/wordprocessingCanvas" xmlns:cx="http://schemas.microsoft.com/office/drawing/2014/chartex" xmlns:cx1="http://schemas.microsoft.com/office/drawing/2015/9/8/chartex" xmlns:cx2="http://schemas.microsoft.com/office/drawing/2015/10/21/chartex" xmlns:cx3="http://schemas.microsoft.com/office/drawing/2016/5/9/chartex" xmlns:cx4="http://schemas.microsoft.com/office/drawing/2016/5/10/chartex" xmlns:cx5="http://schemas.microsoft.com/office/drawing/2016/5/11/chartex" xmlns:cx6="http://schemas.microsoft.com/office/drawing/2016/5/12/chartex" xmlns:cx7="http://schemas.microsoft.com/office/drawing/2016/5/13/chartex" xmlns:cx8="http://schemas.microsoft.com/office/drawing/2016/5/14/chartex" xmlns:mc="http://schemas.openxmlformats.org/markup-compatibility/2006" xmlns:aink="http://schemas.microsoft.com/office/drawing/2016/ink" xmlns:am3d="http://schemas.microsoft.com/office/drawing/2017/model3d" xmlns:o="urn:schemas-microsoft-com:office:office" xmlns:oel="http://schemas.microsoft.com/office/2019/extlst" xmlns:r="http://schemas.openxmlformats.org/officeDocument/2006/relationships" xmlns:m="http://schemas.openxmlformats.org/officeDocument/2006/math" xmlns:v="urn:schemas-microsoft-com:vml" xmlns:wp14="http://schemas.microsoft.com/office/word/2010/wordprocessingDrawing" xmlns:wp="http://schemas.openxmlformats.org/drawingml/2006/wordprocessingDrawing" xmlns:w10="urn:schemas-microsoft-com:office:word" xmlns:w="http://schemas.openxmlformats.org/wordprocessingml/2006/main" xmlns:w14="http://schemas.microsoft.com/office/word/2010/wordml" xmlns:w15="http://schemas.microsoft.com/office/word/2012/wordml" xmlns:w16cex="http://schemas.microsoft.com/office/word/2018/wordml/cex" xmlns:w16cid="http://schemas.microsoft.com/office/word/2016/wordml/cid" xmlns:w16="http://schemas.microsoft.com/office/word/2018/wordml" xmlns:w16du="http://schemas.microsoft.com/office/word/2023/wordml/word16du" xmlns:w16sdtdh="http://schemas.microsoft.com/office/word/2020/wordml/sdtdatahash" xmlns:w16sdtfl="http://schemas.microsoft.com/office/word/2024/wordml/sdtformatlock" xmlns:w16se="http://schemas.microsoft.com/office/word/2015/wordml/symex" xmlns:wpg="http://schemas.microsoft.com/office/word/2010/wordprocessingGroup" xmlns:wpi="http://schemas.microsoft.com/office/word/2010/wordprocessingInk" xmlns:wne="http://schemas.microsoft.com/office/word/2006/wordml" xmlns:wps="http://schemas.microsoft.com/office/word/2010/wordprocessingShape" mc:Ignorable="w14 w15 w16se w16cid w16 w16cex w16sdtdh w16sdtfl w16du wp14">
+<w:document xmlns:wpc="http://schemas.microsoft.com/office/word/2010/wordprocessingCanvas" xmlns:cx="http://schemas.microsoft.com/office/drawing/2014/chartex" xmlns:cx1="http://schemas.microsoft.com/office/drawing/2015/9/8/chartex" xmlns:cx2="http://schemas.microsoft.com/office/drawing/2015/10/21/chartex" xmlns:cx3="http://schemas.microsoft.com/office/drawing/2016/5/9/chartex" xmlns:cx4="http://schemas.microsoft.com/office/drawing/2016/5/10/chartex" xmlns:cx5="http://schemas.microsoft.com/office/drawing/2016/5/11/chartex" xmlns:cx6="http://schemas.microsoft.com/office/drawing/2016/5/12/chartex" xmlns:cx7="http://schemas.microsoft.com/office/drawing/2016/5/13/chartex" xmlns:cx8="http://schemas.microsoft.com/office/drawing/2016/5/14/chartex" xmlns:mc="http://schemas.openxmlformats.org/markup-compatibility/2006" xmlns:aink="http://schemas.microsoft.com/office/drawing/2016/ink" xmlns:am3d="http://schemas.microsoft.com/office/drawing/2017/model3d" xmlns:o="urn:schemas-microsoft-com:office:office" xmlns:r="http://schemas.openxmlformats.org/officeDocument/2006/relationships" xmlns:m="http://schemas.openxmlformats.org/officeDocument/2006/math" xmlns:v="urn:schemas-microsoft-com:vml" xmlns:wp14="http://schemas.microsoft.com/office/word/2010/wordprocessingDrawing" xmlns:wp="http://schemas.openxmlformats.org/drawingml/2006/wordprocessingDrawing" xmlns:w10="urn:schemas-microsoft-com:office:word" xmlns:w="http://schemas.openxmlformats.org/wordprocessingml/2006/main" xmlns:w14="http://schemas.microsoft.com/office/word/2010/wordml" xmlns:w15="http://schemas.microsoft.com/office/word/2012/wordml" xmlns:w16cid="http://schemas.microsoft.com/office/word/2016/wordml/cid" xmlns:w16se="http://schemas.microsoft.com/office/word/2015/wordml/symex" xmlns:wpg="http://schemas.microsoft.com/office/word/2010/wordprocessingGroup" xmlns:wpi="http://schemas.microsoft.com/office/word/2010/wordprocessingInk" xmlns:wne="http://schemas.microsoft.com/office/word/2006/wordml" xmlns:wps="http://schemas.microsoft.com/office/word/2010/wordprocessingShape" mc:Ignorable="w14 w15 w16se w16cid wp14">
   <w:body>
     <w:p/>
     <w:p>
@@ -246,7 +246,7 @@
       <w:sdtContent>
         <w:p>
           <w:pPr>
-            <w:pStyle w:val="Mucluc1"/>
+            <w:pStyle w:val="TOC1"/>
             <w:tabs>
               <w:tab w:val="right" w:leader="dot" w:pos="9040"/>
             </w:tabs>
@@ -268,7 +268,7 @@
           <w:hyperlink w:anchor="_Toc187341930" w:history="1">
             <w:r>
               <w:rPr>
-                <w:rStyle w:val="Siuktni"/>
+                <w:rStyle w:val="Hyperlink"/>
                 <w:noProof/>
               </w:rPr>
               <w:t>I. Record of Changes</w:t>
@@ -325,7 +325,7 @@
         </w:p>
         <w:p>
           <w:pPr>
-            <w:pStyle w:val="Mucluc1"/>
+            <w:pStyle w:val="TOC1"/>
             <w:tabs>
               <w:tab w:val="right" w:leader="dot" w:pos="9040"/>
             </w:tabs>
@@ -338,7 +338,7 @@
           <w:hyperlink w:anchor="_Toc187341931" w:history="1">
             <w:r>
               <w:rPr>
-                <w:rStyle w:val="Siuktni"/>
+                <w:rStyle w:val="Hyperlink"/>
                 <w:noProof/>
               </w:rPr>
               <w:t>II. Software Requirement Specification</w:t>
@@ -395,7 +395,7 @@
         </w:p>
         <w:p>
           <w:pPr>
-            <w:pStyle w:val="Mucluc2"/>
+            <w:pStyle w:val="TOC2"/>
             <w:tabs>
               <w:tab w:val="right" w:leader="dot" w:pos="9040"/>
             </w:tabs>
@@ -408,7 +408,7 @@
           <w:hyperlink w:anchor="_Toc187341932" w:history="1">
             <w:r>
               <w:rPr>
-                <w:rStyle w:val="Siuktni"/>
+                <w:rStyle w:val="Hyperlink"/>
                 <w:noProof/>
               </w:rPr>
               <w:t>1. Overall Requirements</w:t>
@@ -465,7 +465,7 @@
         </w:p>
         <w:p>
           <w:pPr>
-            <w:pStyle w:val="Mucluc3"/>
+            <w:pStyle w:val="TOC3"/>
             <w:tabs>
               <w:tab w:val="right" w:leader="dot" w:pos="9040"/>
             </w:tabs>
@@ -478,7 +478,7 @@
           <w:hyperlink w:anchor="_Toc187341933" w:history="1">
             <w:r>
               <w:rPr>
-                <w:rStyle w:val="Siuktni"/>
+                <w:rStyle w:val="Hyperlink"/>
                 <w:noProof/>
               </w:rPr>
               <w:t>1.1 Context Diagram</w:t>
@@ -535,7 +535,7 @@
         </w:p>
         <w:p>
           <w:pPr>
-            <w:pStyle w:val="Mucluc3"/>
+            <w:pStyle w:val="TOC3"/>
             <w:tabs>
               <w:tab w:val="right" w:leader="dot" w:pos="9040"/>
             </w:tabs>
@@ -548,7 +548,7 @@
           <w:hyperlink w:anchor="_Toc187341934" w:history="1">
             <w:r>
               <w:rPr>
-                <w:rStyle w:val="Siuktni"/>
+                <w:rStyle w:val="Hyperlink"/>
                 <w:noProof/>
               </w:rPr>
               <w:t>1.2 Main Workflows</w:t>
@@ -605,7 +605,7 @@
         </w:p>
         <w:p>
           <w:pPr>
-            <w:pStyle w:val="Mucluc3"/>
+            <w:pStyle w:val="TOC3"/>
             <w:tabs>
               <w:tab w:val="right" w:leader="dot" w:pos="9040"/>
             </w:tabs>
@@ -618,7 +618,7 @@
           <w:hyperlink w:anchor="_Toc187341935" w:history="1">
             <w:r>
               <w:rPr>
-                <w:rStyle w:val="Siuktni"/>
+                <w:rStyle w:val="Hyperlink"/>
                 <w:noProof/>
               </w:rPr>
               <w:t>1.3 User Requirements</w:t>
@@ -675,7 +675,7 @@
         </w:p>
         <w:p>
           <w:pPr>
-            <w:pStyle w:val="Mucluc3"/>
+            <w:pStyle w:val="TOC3"/>
             <w:tabs>
               <w:tab w:val="right" w:leader="dot" w:pos="9040"/>
             </w:tabs>
@@ -688,7 +688,7 @@
           <w:hyperlink w:anchor="_Toc187341936" w:history="1">
             <w:r>
               <w:rPr>
-                <w:rStyle w:val="Siuktni"/>
+                <w:rStyle w:val="Hyperlink"/>
                 <w:noProof/>
               </w:rPr>
               <w:t>1.4 System Functionalities</w:t>
@@ -745,7 +745,7 @@
         </w:p>
         <w:p>
           <w:pPr>
-            <w:pStyle w:val="Mucluc3"/>
+            <w:pStyle w:val="TOC3"/>
             <w:tabs>
               <w:tab w:val="right" w:leader="dot" w:pos="9040"/>
             </w:tabs>
@@ -758,7 +758,7 @@
           <w:hyperlink w:anchor="_Toc187341937" w:history="1">
             <w:r>
               <w:rPr>
-                <w:rStyle w:val="Siuktni"/>
+                <w:rStyle w:val="Hyperlink"/>
                 <w:noProof/>
               </w:rPr>
               <w:t>1.5 Entity Relationship Diagram</w:t>
@@ -815,7 +815,7 @@
         </w:p>
         <w:p>
           <w:pPr>
-            <w:pStyle w:val="Mucluc2"/>
+            <w:pStyle w:val="TOC2"/>
             <w:tabs>
               <w:tab w:val="right" w:leader="dot" w:pos="9040"/>
             </w:tabs>
@@ -828,7 +828,7 @@
           <w:hyperlink w:anchor="_Toc187341938" w:history="1">
             <w:r>
               <w:rPr>
-                <w:rStyle w:val="Siuktni"/>
+                <w:rStyle w:val="Hyperlink"/>
                 <w:noProof/>
               </w:rPr>
               <w:t>2. Use Case Specifications</w:t>
@@ -885,7 +885,7 @@
         </w:p>
         <w:p>
           <w:pPr>
-            <w:pStyle w:val="Mucluc3"/>
+            <w:pStyle w:val="TOC3"/>
             <w:tabs>
               <w:tab w:val="right" w:leader="dot" w:pos="9040"/>
             </w:tabs>
@@ -898,7 +898,7 @@
           <w:hyperlink w:anchor="_Toc187341939" w:history="1">
             <w:r>
               <w:rPr>
-                <w:rStyle w:val="Siuktni"/>
+                <w:rStyle w:val="Hyperlink"/>
                 <w:noProof/>
               </w:rPr>
               <w:t>2.1 &lt;&lt;Feature Name1&gt;&gt;</w:t>
@@ -955,7 +955,7 @@
         </w:p>
         <w:p>
           <w:pPr>
-            <w:pStyle w:val="Mucluc3"/>
+            <w:pStyle w:val="TOC3"/>
             <w:tabs>
               <w:tab w:val="right" w:leader="dot" w:pos="9040"/>
             </w:tabs>
@@ -968,7 +968,7 @@
           <w:hyperlink w:anchor="_Toc187341940" w:history="1">
             <w:r>
               <w:rPr>
-                <w:rStyle w:val="Siuktni"/>
+                <w:rStyle w:val="Hyperlink"/>
                 <w:noProof/>
               </w:rPr>
               <w:t>2.2 Xyz Feature</w:t>
@@ -1025,7 +1025,7 @@
         </w:p>
         <w:p>
           <w:pPr>
-            <w:pStyle w:val="Mucluc2"/>
+            <w:pStyle w:val="TOC2"/>
             <w:tabs>
               <w:tab w:val="right" w:leader="dot" w:pos="9040"/>
             </w:tabs>
@@ -1038,7 +1038,7 @@
           <w:hyperlink w:anchor="_Toc187341941" w:history="1">
             <w:r>
               <w:rPr>
-                <w:rStyle w:val="Siuktni"/>
+                <w:rStyle w:val="Hyperlink"/>
                 <w:noProof/>
               </w:rPr>
               <w:t>3. Functional Requirements</w:t>
@@ -1095,7 +1095,7 @@
         </w:p>
         <w:p>
           <w:pPr>
-            <w:pStyle w:val="Mucluc3"/>
+            <w:pStyle w:val="TOC3"/>
             <w:tabs>
               <w:tab w:val="right" w:leader="dot" w:pos="9040"/>
             </w:tabs>
@@ -1108,14 +1108,14 @@
           <w:hyperlink w:anchor="_Toc187341942" w:history="1">
             <w:r>
               <w:rPr>
-                <w:rStyle w:val="Siuktni"/>
+                <w:rStyle w:val="Hyperlink"/>
                 <w:noProof/>
               </w:rPr>
               <w:t xml:space="preserve">3.1 </w:t>
             </w:r>
             <w:r>
               <w:rPr>
-                <w:rStyle w:val="Siuktni"/>
+                <w:rStyle w:val="Hyperlink"/>
                 <w:noProof/>
                 <w:lang w:val="vi-VN"/>
               </w:rPr>
@@ -1123,7 +1123,7 @@
             </w:r>
             <w:r>
               <w:rPr>
-                <w:rStyle w:val="Siuktni"/>
+                <w:rStyle w:val="Hyperlink"/>
                 <w:noProof/>
               </w:rPr>
               <w:t>1</w:t>
@@ -1180,7 +1180,7 @@
         </w:p>
         <w:p>
           <w:pPr>
-            <w:pStyle w:val="Mucluc3"/>
+            <w:pStyle w:val="TOC3"/>
             <w:tabs>
               <w:tab w:val="right" w:leader="dot" w:pos="9040"/>
             </w:tabs>
@@ -1193,7 +1193,7 @@
           <w:hyperlink w:anchor="_Toc187341943" w:history="1">
             <w:r>
               <w:rPr>
-                <w:rStyle w:val="Siuktni"/>
+                <w:rStyle w:val="Hyperlink"/>
                 <w:noProof/>
               </w:rPr>
               <w:t>3.2 User Authentication</w:t>
@@ -1250,7 +1250,7 @@
         </w:p>
         <w:p>
           <w:pPr>
-            <w:pStyle w:val="Mucluc3"/>
+            <w:pStyle w:val="TOC3"/>
             <w:tabs>
               <w:tab w:val="right" w:leader="dot" w:pos="9040"/>
             </w:tabs>
@@ -1263,7 +1263,7 @@
           <w:hyperlink w:anchor="_Toc187341944" w:history="1">
             <w:r>
               <w:rPr>
-                <w:rStyle w:val="Siuktni"/>
+                <w:rStyle w:val="Hyperlink"/>
                 <w:noProof/>
               </w:rPr>
               <w:t>3.3 System Administration</w:t>
@@ -1320,7 +1320,7 @@
         </w:p>
         <w:p>
           <w:pPr>
-            <w:pStyle w:val="Mucluc2"/>
+            <w:pStyle w:val="TOC2"/>
             <w:tabs>
               <w:tab w:val="right" w:leader="dot" w:pos="9040"/>
             </w:tabs>
@@ -1333,7 +1333,7 @@
           <w:hyperlink w:anchor="_Toc187341945" w:history="1">
             <w:r>
               <w:rPr>
-                <w:rStyle w:val="Siuktni"/>
+                <w:rStyle w:val="Hyperlink"/>
                 <w:noProof/>
               </w:rPr>
               <w:t>4. Non-Functional Requirements</w:t>
@@ -1390,7 +1390,7 @@
         </w:p>
         <w:p>
           <w:pPr>
-            <w:pStyle w:val="Mucluc3"/>
+            <w:pStyle w:val="TOC3"/>
             <w:tabs>
               <w:tab w:val="right" w:leader="dot" w:pos="9040"/>
             </w:tabs>
@@ -1403,7 +1403,7 @@
           <w:hyperlink w:anchor="_Toc187341946" w:history="1">
             <w:r>
               <w:rPr>
-                <w:rStyle w:val="Siuktni"/>
+                <w:rStyle w:val="Hyperlink"/>
                 <w:noProof/>
               </w:rPr>
               <w:t>3.1 External Interfaces</w:t>
@@ -1460,7 +1460,7 @@
         </w:p>
         <w:p>
           <w:pPr>
-            <w:pStyle w:val="Mucluc3"/>
+            <w:pStyle w:val="TOC3"/>
             <w:tabs>
               <w:tab w:val="right" w:leader="dot" w:pos="9040"/>
             </w:tabs>
@@ -1473,7 +1473,7 @@
           <w:hyperlink w:anchor="_Toc187341947" w:history="1">
             <w:r>
               <w:rPr>
-                <w:rStyle w:val="Siuktni"/>
+                <w:rStyle w:val="Hyperlink"/>
                 <w:noProof/>
               </w:rPr>
               <w:t>3.2 Quality Attributes</w:t>
@@ -1530,7 +1530,7 @@
         </w:p>
         <w:p>
           <w:pPr>
-            <w:pStyle w:val="Mucluc2"/>
+            <w:pStyle w:val="TOC2"/>
             <w:tabs>
               <w:tab w:val="right" w:leader="dot" w:pos="9040"/>
             </w:tabs>
@@ -1543,7 +1543,7 @@
           <w:hyperlink w:anchor="_Toc187341948" w:history="1">
             <w:r>
               <w:rPr>
-                <w:rStyle w:val="Siuktni"/>
+                <w:rStyle w:val="Hyperlink"/>
                 <w:noProof/>
               </w:rPr>
               <w:t>5. Requirement Appendix</w:t>
@@ -1600,7 +1600,7 @@
         </w:p>
         <w:p>
           <w:pPr>
-            <w:pStyle w:val="Mucluc3"/>
+            <w:pStyle w:val="TOC3"/>
             <w:tabs>
               <w:tab w:val="right" w:leader="dot" w:pos="9040"/>
             </w:tabs>
@@ -1613,7 +1613,7 @@
           <w:hyperlink w:anchor="_Toc187341949" w:history="1">
             <w:r>
               <w:rPr>
-                <w:rStyle w:val="Siuktni"/>
+                <w:rStyle w:val="Hyperlink"/>
                 <w:noProof/>
               </w:rPr>
               <w:t>5.1 Business Rules</w:t>
@@ -1670,7 +1670,7 @@
         </w:p>
         <w:p>
           <w:pPr>
-            <w:pStyle w:val="Mucluc3"/>
+            <w:pStyle w:val="TOC3"/>
             <w:tabs>
               <w:tab w:val="right" w:leader="dot" w:pos="9040"/>
             </w:tabs>
@@ -1683,7 +1683,7 @@
           <w:hyperlink w:anchor="_Toc187341950" w:history="1">
             <w:r>
               <w:rPr>
-                <w:rStyle w:val="Siuktni"/>
+                <w:rStyle w:val="Hyperlink"/>
                 <w:noProof/>
               </w:rPr>
               <w:t>5.2 System Messages</w:t>
@@ -1740,7 +1740,7 @@
         </w:p>
         <w:p>
           <w:pPr>
-            <w:pStyle w:val="Mucluc3"/>
+            <w:pStyle w:val="TOC3"/>
             <w:tabs>
               <w:tab w:val="right" w:leader="dot" w:pos="9040"/>
             </w:tabs>
@@ -1753,7 +1753,7 @@
           <w:hyperlink w:anchor="_Toc187341951" w:history="1">
             <w:r>
               <w:rPr>
-                <w:rStyle w:val="Siuktni"/>
+                <w:rStyle w:val="Hyperlink"/>
                 <w:noProof/>
               </w:rPr>
               <w:t>5.3 Other Requirements…</w:t>
@@ -1830,7 +1830,7 @@
     </w:p>
     <w:p>
       <w:pPr>
-        <w:pStyle w:val="u1"/>
+        <w:pStyle w:val="Heading1"/>
       </w:pPr>
       <w:bookmarkStart w:id="0" w:name="_Toc187341930"/>
       <w:r>
@@ -3271,7 +3271,7 @@
     </w:p>
     <w:p>
       <w:pPr>
-        <w:pStyle w:val="u1"/>
+        <w:pStyle w:val="Heading1"/>
       </w:pPr>
       <w:bookmarkStart w:id="1" w:name="_Toc187341931"/>
       <w:r>
@@ -3282,7 +3282,7 @@
     </w:p>
     <w:p>
       <w:pPr>
-        <w:pStyle w:val="u2"/>
+        <w:pStyle w:val="Heading2"/>
       </w:pPr>
       <w:bookmarkStart w:id="2" w:name="_Toc187341932"/>
       <w:r>
@@ -3292,7 +3292,7 @@
     </w:p>
     <w:p>
       <w:pPr>
-        <w:pStyle w:val="u3"/>
+        <w:pStyle w:val="Heading3"/>
       </w:pPr>
       <w:bookmarkStart w:id="3" w:name="_Toc187341933"/>
       <w:r>
@@ -3389,7 +3389,7 @@
     </w:p>
     <w:p>
       <w:pPr>
-        <w:pStyle w:val="u3"/>
+        <w:pStyle w:val="Heading3"/>
       </w:pPr>
       <w:bookmarkStart w:id="4" w:name="_Toc187341934"/>
       <w:r>
@@ -3406,23 +3406,7 @@
     </w:p>
     <w:p>
       <w:pPr>
-        <w:spacing w:after="60" w:line="240" w:lineRule="auto"/>
-        <w:rPr>
-          <w:i/>
-          <w:color w:val="0000FF"/>
-        </w:rPr>
-      </w:pPr>
-      <w:r>
-        <w:rPr>
-          <w:i/>
-          <w:color w:val="0000FF"/>
-        </w:rPr>
-        <w:t>[Provide main workflows (business processes) using the swim-lane diagram(s) like sample below]</w:t>
-      </w:r>
-    </w:p>
-    <w:p>
-      <w:pPr>
-        <w:pStyle w:val="u4"/>
+        <w:pStyle w:val="Heading4"/>
       </w:pPr>
       <w:r>
         <w:t>1.</w:t>
@@ -3431,7 +3415,19 @@
         <w:t>2</w:t>
       </w:r>
       <w:r>
-        <w:t>.1 Order Processing</w:t>
+        <w:t xml:space="preserve">.1 </w:t>
+      </w:r>
+      <w:r>
+        <w:t xml:space="preserve">Onboarding </w:t>
+      </w:r>
+      <w:r>
+        <w:t>a</w:t>
+      </w:r>
+      <w:r>
+        <w:t xml:space="preserve">nd </w:t>
+      </w:r>
+      <w:r>
+        <w:t>Server Access Flow</w:t>
       </w:r>
     </w:p>
     <w:p>
@@ -3440,34 +3436,47 @@
           <w:noProof/>
         </w:rPr>
         <w:drawing>
-          <wp:inline distT="0" distB="0" distL="0" distR="0" wp14:anchorId="6B1ACD32" wp14:editId="7E3EEC59">
-            <wp:extent cx="5746750" cy="2310765"/>
+          <wp:inline distT="0" distB="0" distL="0" distR="0" wp14:anchorId="03B397CE" wp14:editId="660633E9">
+            <wp:extent cx="5746750" cy="4203505"/>
             <wp:effectExtent l="0" t="0" r="0" b="0"/>
-            <wp:docPr id="25" name="image3.png"/>
-            <wp:cNvGraphicFramePr/>
+            <wp:docPr id="1" name="Picture 1" descr="C:\Users\Admin\AppData\Local\Microsoft\Windows\INetCache\Content.MSO\B5E65E2A.tmp"/>
+            <wp:cNvGraphicFramePr>
+              <a:graphicFrameLocks xmlns:a="http://schemas.openxmlformats.org/drawingml/2006/main" noChangeAspect="1"/>
+            </wp:cNvGraphicFramePr>
             <a:graphic xmlns:a="http://schemas.openxmlformats.org/drawingml/2006/main">
               <a:graphicData uri="http://schemas.openxmlformats.org/drawingml/2006/picture">
                 <pic:pic xmlns:pic="http://schemas.openxmlformats.org/drawingml/2006/picture">
                   <pic:nvPicPr>
-                    <pic:cNvPr id="0" name="image3.png"/>
-                    <pic:cNvPicPr preferRelativeResize="0"/>
+                    <pic:cNvPr id="0" name="Picture 1" descr="C:\Users\Admin\AppData\Local\Microsoft\Windows\INetCache\Content.MSO\B5E65E2A.tmp"/>
+                    <pic:cNvPicPr>
+                      <a:picLocks noChangeAspect="1" noChangeArrowheads="1"/>
+                    </pic:cNvPicPr>
                   </pic:nvPicPr>
                   <pic:blipFill>
-                    <a:blip r:embed="rId10"/>
+                    <a:blip r:embed="rId10" cstate="print">
+                      <a:extLst>
+                        <a:ext uri="{28A0092B-C50C-407E-A947-70E740481C1C}">
+                          <a14:useLocalDpi xmlns:a14="http://schemas.microsoft.com/office/drawing/2010/main" val="0"/>
+                        </a:ext>
+                      </a:extLst>
+                    </a:blip>
                     <a:srcRect/>
                     <a:stretch>
                       <a:fillRect/>
                     </a:stretch>
                   </pic:blipFill>
-                  <pic:spPr>
+                  <pic:spPr bwMode="auto">
                     <a:xfrm>
                       <a:off x="0" y="0"/>
-                      <a:ext cx="5746750" cy="2310765"/>
+                      <a:ext cx="5746750" cy="4203505"/>
                     </a:xfrm>
                     <a:prstGeom prst="rect">
                       <a:avLst/>
                     </a:prstGeom>
-                    <a:ln/>
+                    <a:noFill/>
+                    <a:ln>
+                      <a:noFill/>
+                    </a:ln>
                   </pic:spPr>
                 </pic:pic>
               </a:graphicData>
@@ -3478,7 +3487,10 @@
     </w:p>
     <w:p>
       <w:pPr>
-        <w:pStyle w:val="u4"/>
+        <w:pStyle w:val="Heading4"/>
+        <w:rPr>
+          <w:noProof/>
+        </w:rPr>
       </w:pPr>
       <w:r>
         <w:t>1.</w:t>
@@ -3487,7 +3499,16 @@
         <w:t>2</w:t>
       </w:r>
       <w:r>
-        <w:t>.2 Customer Support</w:t>
+        <w:t xml:space="preserve">.2 </w:t>
+      </w:r>
+      <w:r>
+        <w:t xml:space="preserve">Messaging </w:t>
+      </w:r>
+      <w:r>
+        <w:t>and</w:t>
+      </w:r>
+      <w:r>
+        <w:t xml:space="preserve"> Unread Badge</w:t>
       </w:r>
     </w:p>
     <w:p>
@@ -3495,15 +3516,139 @@
         <w:rPr>
           <w:noProof/>
         </w:rPr>
-        <w:t>…</w:t>
-      </w:r>
-    </w:p>
-    <w:p/>
-    <w:p>
-      <w:pPr>
-        <w:pStyle w:val="u3"/>
-      </w:pPr>
-      <w:bookmarkStart w:id="5" w:name="_Toc187341935"/>
+        <w:drawing>
+          <wp:inline distT="0" distB="0" distL="0" distR="0" wp14:anchorId="37F48389" wp14:editId="7968EF76">
+            <wp:extent cx="5746750" cy="3406069"/>
+            <wp:effectExtent l="0" t="0" r="0" b="0"/>
+            <wp:docPr id="2" name="Picture 2" descr="C:\Users\Admin\AppData\Local\Microsoft\Windows\INetCache\Content.MSO\9FB1B1DB.tmp"/>
+            <wp:cNvGraphicFramePr>
+              <a:graphicFrameLocks xmlns:a="http://schemas.openxmlformats.org/drawingml/2006/main" noChangeAspect="1"/>
+            </wp:cNvGraphicFramePr>
+            <a:graphic xmlns:a="http://schemas.openxmlformats.org/drawingml/2006/main">
+              <a:graphicData uri="http://schemas.openxmlformats.org/drawingml/2006/picture">
+                <pic:pic xmlns:pic="http://schemas.openxmlformats.org/drawingml/2006/picture">
+                  <pic:nvPicPr>
+                    <pic:cNvPr id="0" name="Picture 3" descr="C:\Users\Admin\AppData\Local\Microsoft\Windows\INetCache\Content.MSO\9FB1B1DB.tmp"/>
+                    <pic:cNvPicPr>
+                      <a:picLocks noChangeAspect="1" noChangeArrowheads="1"/>
+                    </pic:cNvPicPr>
+                  </pic:nvPicPr>
+                  <pic:blipFill>
+                    <a:blip r:embed="rId11" cstate="print">
+                      <a:extLst>
+                        <a:ext uri="{28A0092B-C50C-407E-A947-70E740481C1C}">
+                          <a14:useLocalDpi xmlns:a14="http://schemas.microsoft.com/office/drawing/2010/main" val="0"/>
+                        </a:ext>
+                      </a:extLst>
+                    </a:blip>
+                    <a:srcRect/>
+                    <a:stretch>
+                      <a:fillRect/>
+                    </a:stretch>
+                  </pic:blipFill>
+                  <pic:spPr bwMode="auto">
+                    <a:xfrm>
+                      <a:off x="0" y="0"/>
+                      <a:ext cx="5746750" cy="3406069"/>
+                    </a:xfrm>
+                    <a:prstGeom prst="rect">
+                      <a:avLst/>
+                    </a:prstGeom>
+                    <a:noFill/>
+                    <a:ln>
+                      <a:noFill/>
+                    </a:ln>
+                  </pic:spPr>
+                </pic:pic>
+              </a:graphicData>
+            </a:graphic>
+          </wp:inline>
+        </w:drawing>
+      </w:r>
+    </w:p>
+    <w:p>
+      <w:pPr>
+        <w:pStyle w:val="Heading4"/>
+        <w:rPr>
+          <w:noProof/>
+        </w:rPr>
+      </w:pPr>
+      <w:r>
+        <w:lastRenderedPageBreak/>
+        <w:t>1.2.</w:t>
+      </w:r>
+      <w:r>
+        <w:t>3</w:t>
+      </w:r>
+      <w:r>
+        <w:t xml:space="preserve"> </w:t>
+      </w:r>
+      <w:r>
+        <w:t>Voice Connection Setup</w:t>
+      </w:r>
+    </w:p>
+    <w:p>
+      <w:r>
+        <w:rPr>
+          <w:noProof/>
+        </w:rPr>
+        <w:drawing>
+          <wp:inline distT="0" distB="0" distL="0" distR="0" wp14:anchorId="20EBFFFD" wp14:editId="53A766C1">
+            <wp:extent cx="5746750" cy="3355923"/>
+            <wp:effectExtent l="0" t="0" r="0" b="0"/>
+            <wp:docPr id="4" name="Picture 4" descr="C:\Users\Admin\AppData\Local\Microsoft\Windows\INetCache\Content.MSO\55402757.tmp"/>
+            <wp:cNvGraphicFramePr>
+              <a:graphicFrameLocks xmlns:a="http://schemas.openxmlformats.org/drawingml/2006/main" noChangeAspect="1"/>
+            </wp:cNvGraphicFramePr>
+            <a:graphic xmlns:a="http://schemas.openxmlformats.org/drawingml/2006/main">
+              <a:graphicData uri="http://schemas.openxmlformats.org/drawingml/2006/picture">
+                <pic:pic xmlns:pic="http://schemas.openxmlformats.org/drawingml/2006/picture">
+                  <pic:nvPicPr>
+                    <pic:cNvPr id="0" name="Picture 10" descr="C:\Users\Admin\AppData\Local\Microsoft\Windows\INetCache\Content.MSO\55402757.tmp"/>
+                    <pic:cNvPicPr>
+                      <a:picLocks noChangeAspect="1" noChangeArrowheads="1"/>
+                    </pic:cNvPicPr>
+                  </pic:nvPicPr>
+                  <pic:blipFill>
+                    <a:blip r:embed="rId12" cstate="print">
+                      <a:extLst>
+                        <a:ext uri="{28A0092B-C50C-407E-A947-70E740481C1C}">
+                          <a14:useLocalDpi xmlns:a14="http://schemas.microsoft.com/office/drawing/2010/main" val="0"/>
+                        </a:ext>
+                      </a:extLst>
+                    </a:blip>
+                    <a:srcRect/>
+                    <a:stretch>
+                      <a:fillRect/>
+                    </a:stretch>
+                  </pic:blipFill>
+                  <pic:spPr bwMode="auto">
+                    <a:xfrm>
+                      <a:off x="0" y="0"/>
+                      <a:ext cx="5746750" cy="3355923"/>
+                    </a:xfrm>
+                    <a:prstGeom prst="rect">
+                      <a:avLst/>
+                    </a:prstGeom>
+                    <a:noFill/>
+                    <a:ln>
+                      <a:noFill/>
+                    </a:ln>
+                  </pic:spPr>
+                </pic:pic>
+              </a:graphicData>
+            </a:graphic>
+          </wp:inline>
+        </w:drawing>
+      </w:r>
+      <w:bookmarkStart w:id="5" w:name="_GoBack"/>
+      <w:bookmarkEnd w:id="5"/>
+    </w:p>
+    <w:p>
+      <w:pPr>
+        <w:pStyle w:val="Heading3"/>
+      </w:pPr>
+      <w:bookmarkStart w:id="6" w:name="_Toc187341935"/>
       <w:r>
         <w:t>1.</w:t>
       </w:r>
@@ -3513,11 +3658,11 @@
       <w:r>
         <w:t xml:space="preserve"> User Requirements</w:t>
       </w:r>
-      <w:bookmarkEnd w:id="5"/>
-    </w:p>
-    <w:p>
-      <w:pPr>
-        <w:pStyle w:val="u4"/>
+      <w:bookmarkEnd w:id="6"/>
+    </w:p>
+    <w:p>
+      <w:pPr>
+        <w:pStyle w:val="Heading4"/>
       </w:pPr>
       <w:r>
         <w:t>1.</w:t>
@@ -3536,7 +3681,7 @@
     </w:p>
     <w:tbl>
       <w:tblPr>
-        <w:tblStyle w:val="LiBang"/>
+        <w:tblStyle w:val="TableGrid"/>
         <w:tblW w:w="9085" w:type="dxa"/>
         <w:tblLook w:val="04A0" w:firstRow="1" w:lastRow="0" w:firstColumn="1" w:lastColumn="0" w:noHBand="0" w:noVBand="1"/>
       </w:tblPr>
@@ -3707,7 +3852,7 @@
     </w:p>
     <w:p>
       <w:pPr>
-        <w:pStyle w:val="u4"/>
+        <w:pStyle w:val="Heading4"/>
         <w:rPr>
           <w:lang w:val="vi-VN"/>
         </w:rPr>
@@ -4489,7 +4634,7 @@
     </w:p>
     <w:p>
       <w:pPr>
-        <w:pStyle w:val="u4"/>
+        <w:pStyle w:val="Heading4"/>
       </w:pPr>
       <w:r>
         <w:t>1.3.3 Use Case Diagrams</w:t>
@@ -4508,219 +4653,203 @@
           <w:i/>
           <w:color w:val="0000FF"/>
         </w:rPr>
-        <w:t xml:space="preserve">In this section, you need to provide the UC diagram(s) to show the actor-UCs and UC-UC relationships like the sample below. You can have multiple UC diagrams for the </w:t>
-      </w:r>
-      <w:proofErr w:type="gramStart"/>
-      <w:r>
+        <w:t>In this section, you need to provide the UC diagram(s) to show the actor-UCs and UC-UC relationships like the sample below. You can have multiple UC diagrams for the system, each diagram is for one actor or one workflow]</w:t>
+      </w:r>
+    </w:p>
+    <w:p>
+      <w:r>
+        <w:t>This diagram illustrates the capabilities of the Server Owner, whose main goals are managing the server, channels, and members.</w:t>
+      </w:r>
+    </w:p>
+    <w:p>
+      <w:r>
+        <w:t>- UC-201: Tạo server mới</w:t>
+      </w:r>
+    </w:p>
+    <w:p>
+      <w:r>
+        <w:t>- UC-202: Mời thành viên qua invite link</w:t>
+      </w:r>
+    </w:p>
+    <w:p>
+      <w:r>
+        <w:t>- UC-203: Kick / Ban thành viên khỏi server</w:t>
+      </w:r>
+    </w:p>
+    <w:p>
+      <w:r>
+        <w:t>- UC-302: Tạo và quản lý kênh text trong server</w:t>
+      </w:r>
+    </w:p>
+    <w:p>
+      <w:pPr>
+        <w:jc w:val="center"/>
+      </w:pPr>
+      <w:r>
+        <w:t>[Insert Server Owner UC Diagram Here]</w:t>
+      </w:r>
+      <w:r>
+        <w:br/>
+      </w:r>
+    </w:p>
+    <w:p>
+      <w:pPr>
+        <w:pStyle w:val="Heading5"/>
+      </w:pPr>
+      <w:r>
+        <w:t>1.3.3.1 UCs for Server Owner (P01)</w:t>
+      </w:r>
+    </w:p>
+    <w:p>
+      <w:pPr>
+        <w:jc w:val="center"/>
+        <w:rPr>
+          <w:i/>
+          <w:lang w:val="vi-VN"/>
+        </w:rPr>
+      </w:pPr>
+      <w:r>
+        <w:rPr>
+          <w:i/>
+          <w:noProof/>
+        </w:rPr>
+        <w:t>Diagram</w:t>
+      </w:r>
+    </w:p>
+    <w:p/>
+    <w:p>
+      <w:r>
+        <w:t>This diagram captures the core communication features used by regular active members in the server.</w:t>
+      </w:r>
+    </w:p>
+    <w:p>
+      <w:r>
+        <w:t>- UC-204: Rời khỏi server</w:t>
+      </w:r>
+    </w:p>
+    <w:p>
+      <w:r>
+        <w:t>- UC-301: Gửi và nhận tin nhắn thời gian thực</w:t>
+      </w:r>
+    </w:p>
+    <w:p>
+      <w:r>
+        <w:t>- UC-303: Xem danh sách thành viên và trạng thái online</w:t>
+      </w:r>
+    </w:p>
+    <w:p>
+      <w:r>
+        <w:t>- UC-401: Tham gia và rời voice channel</w:t>
+      </w:r>
+    </w:p>
+    <w:p>
+      <w:r>
+        <w:t>- UC-501: Thông báo tin nhắn chưa đọc</w:t>
+      </w:r>
+    </w:p>
+    <w:p>
+      <w:r>
+        <w:t>- UC-601: Cập nhật hồ sơ cá nhân</w:t>
+      </w:r>
+    </w:p>
+    <w:p>
+      <w:r>
+        <w:t>- UC-103: Đăng xuất an toàn</w:t>
+      </w:r>
+    </w:p>
+    <w:p>
+      <w:r>
+        <w:t>[Insert Active Member UC Diagram Here]</w:t>
+      </w:r>
+      <w:r>
+        <w:br/>
+      </w:r>
+    </w:p>
+    <w:p>
+      <w:pPr>
+        <w:pStyle w:val="Heading5"/>
+      </w:pPr>
+      <w:r>
+        <w:lastRenderedPageBreak/>
+        <w:t>1.3.3.2 UCs for Active Member (P02)</w:t>
+      </w:r>
+    </w:p>
+    <w:p>
+      <w:pPr>
+        <w:jc w:val="center"/>
+        <w:rPr>
+          <w:i/>
+        </w:rPr>
+      </w:pPr>
+      <w:r>
+        <w:rPr>
+          <w:i/>
+          <w:noProof/>
+        </w:rPr>
+        <w:t>Diagram</w:t>
+      </w:r>
+    </w:p>
+    <w:p>
+      <w:r>
+        <w:t>This diagram focuses on the onboarding flow for new or guest users entering the platform.</w:t>
+      </w:r>
+    </w:p>
+    <w:p>
+      <w:r>
+        <w:t>- UC-101: Đăng ký tài khoản mới</w:t>
+      </w:r>
+    </w:p>
+    <w:p>
+      <w:r>
+        <w:t>- UC-102: Đăng nhập và duy trì phiên làm việc</w:t>
+      </w:r>
+    </w:p>
+    <w:p>
+      <w:r>
+        <w:t>[Insert Guest User UC Diagram Here]</w:t>
+      </w:r>
+      <w:r>
+        <w:br/>
+      </w:r>
+    </w:p>
+    <w:p>
+      <w:pPr>
+        <w:pStyle w:val="Heading5"/>
+      </w:pPr>
+      <w:r>
+        <w:t>1.3.3.3 UCs for Guest User (P03)</w:t>
+      </w:r>
+    </w:p>
+    <w:p/>
+    <w:p>
+      <w:pPr>
+        <w:pStyle w:val="Heading3"/>
+      </w:pPr>
+      <w:bookmarkStart w:id="7" w:name="_Toc187341936"/>
+      <w:r>
+        <w:t>1.4 System Functionalities</w:t>
+      </w:r>
+      <w:bookmarkEnd w:id="7"/>
+    </w:p>
+    <w:p>
+      <w:pPr>
+        <w:spacing w:after="60" w:line="240" w:lineRule="auto"/>
         <w:rPr>
           <w:i/>
           <w:color w:val="0000FF"/>
         </w:rPr>
-        <w:t>system,</w:t>
-      </w:r>
-      <w:proofErr w:type="gramEnd"/>
+      </w:pPr>
       <w:r>
         <w:rPr>
           <w:i/>
           <w:color w:val="0000FF"/>
         </w:rPr>
-        <w:t xml:space="preserve"> each diagram is for one actor or one workflow]</w:t>
-      </w:r>
-    </w:p>
-    <w:p>
-      <w:r>
-        <w:t>This diagram illustrates the capabilities of the Server Owner, whose main goals are managing the server, channels, and members.</w:t>
-      </w:r>
-    </w:p>
-    <w:p>
-      <w:r>
-        <w:t>- UC-201: Tạo server mới</w:t>
-      </w:r>
-    </w:p>
-    <w:p>
-      <w:r>
-        <w:t>- UC-202: Mời thành viên qua invite link</w:t>
-      </w:r>
-    </w:p>
-    <w:p>
-      <w:r>
-        <w:t>- UC-203: Kick / Ban thành viên khỏi server</w:t>
-      </w:r>
-    </w:p>
-    <w:p>
-      <w:r>
-        <w:t>- UC-302: Tạo và quản lý kênh text trong server</w:t>
-      </w:r>
-    </w:p>
-    <w:p>
-      <w:pPr>
-        <w:jc w:val="center"/>
-      </w:pPr>
-      <w:r>
-        <w:t>[Insert Server Owner UC Diagram Here]</w:t>
-      </w:r>
-      <w:r>
-        <w:br/>
-      </w:r>
-    </w:p>
-    <w:p>
-      <w:pPr>
-        <w:pStyle w:val="u5"/>
-      </w:pPr>
-      <w:r>
-        <w:t>1.3.3.1 UCs for Server Owner (P01)</w:t>
-      </w:r>
-    </w:p>
-    <w:p>
-      <w:pPr>
-        <w:jc w:val="center"/>
-        <w:rPr>
-          <w:i/>
-          <w:lang w:val="vi-VN"/>
-        </w:rPr>
-      </w:pPr>
-      <w:r>
-        <w:rPr>
-          <w:i/>
-          <w:noProof/>
-        </w:rPr>
-        <w:t>Diagram</w:t>
-      </w:r>
-    </w:p>
-    <w:p/>
-    <w:p>
-      <w:r>
-        <w:t>This diagram captures the core communication features used by regular active members in the server.</w:t>
-      </w:r>
-    </w:p>
-    <w:p>
-      <w:r>
-        <w:t>- UC-204: Rời khỏi server</w:t>
-      </w:r>
-    </w:p>
-    <w:p>
-      <w:r>
-        <w:t>- UC-301: Gửi và nhận tin nhắn thời gian thực</w:t>
-      </w:r>
-    </w:p>
-    <w:p>
-      <w:r>
-        <w:t>- UC-303: Xem danh sách thành viên và trạng thái online</w:t>
-      </w:r>
-    </w:p>
-    <w:p>
-      <w:r>
-        <w:t>- UC-401: Tham gia và rời voice channel</w:t>
-      </w:r>
-    </w:p>
-    <w:p>
-      <w:r>
-        <w:t>- UC-501: Thông báo tin nhắn chưa đọc</w:t>
-      </w:r>
-    </w:p>
-    <w:p>
-      <w:r>
-        <w:t>- UC-601: Cập nhật hồ sơ cá nhân</w:t>
-      </w:r>
-    </w:p>
-    <w:p>
-      <w:r>
-        <w:t>- UC-103: Đăng xuất an toàn</w:t>
-      </w:r>
-    </w:p>
-    <w:p>
-      <w:r>
-        <w:t>[Insert Active Member UC Diagram Here]</w:t>
-      </w:r>
-      <w:r>
-        <w:br/>
-      </w:r>
-    </w:p>
-    <w:p>
-      <w:pPr>
-        <w:pStyle w:val="u5"/>
-      </w:pPr>
-      <w:r>
-        <w:lastRenderedPageBreak/>
-        <w:t>1.3.3.2 UCs for Active Member (P02)</w:t>
-      </w:r>
-    </w:p>
-    <w:p>
-      <w:pPr>
-        <w:jc w:val="center"/>
-        <w:rPr>
-          <w:i/>
-        </w:rPr>
-      </w:pPr>
-      <w:r>
-        <w:rPr>
-          <w:i/>
-          <w:noProof/>
-        </w:rPr>
-        <w:t>Diagram</w:t>
-      </w:r>
-    </w:p>
-    <w:p>
-      <w:r>
-        <w:t>This diagram focuses on the onboarding flow for new or guest users entering the platform.</w:t>
-      </w:r>
-    </w:p>
-    <w:p>
-      <w:r>
-        <w:t>- UC-101: Đăng ký tài khoản mới</w:t>
-      </w:r>
-    </w:p>
-    <w:p>
-      <w:r>
-        <w:t>- UC-102: Đăng nhập và duy trì phiên làm việc</w:t>
-      </w:r>
-    </w:p>
-    <w:p>
-      <w:r>
-        <w:t>[Insert Guest User UC Diagram Here]</w:t>
-      </w:r>
-      <w:r>
-        <w:br/>
-      </w:r>
-    </w:p>
-    <w:p>
-      <w:pPr>
-        <w:pStyle w:val="u5"/>
-      </w:pPr>
-      <w:r>
-        <w:t>1.3.3.3 UCs for Guest User (P03)</w:t>
-      </w:r>
-    </w:p>
-    <w:p/>
-    <w:p>
-      <w:pPr>
-        <w:pStyle w:val="u3"/>
-      </w:pPr>
-      <w:bookmarkStart w:id="6" w:name="_Toc187341936"/>
-      <w:r>
-        <w:t>1.4 System Functionalities</w:t>
-      </w:r>
-      <w:bookmarkEnd w:id="6"/>
-    </w:p>
-    <w:p>
-      <w:pPr>
-        <w:spacing w:after="60" w:line="240" w:lineRule="auto"/>
-        <w:rPr>
-          <w:i/>
-          <w:color w:val="0000FF"/>
-        </w:rPr>
-      </w:pPr>
-      <w:r>
-        <w:rPr>
-          <w:i/>
-          <w:color w:val="0000FF"/>
-        </w:rPr>
         <w:t>[Provide functionality overview of software system: screen flow, screen descriptions, system user roles, screen authorization, non-screen functions, ERD]</w:t>
       </w:r>
     </w:p>
     <w:p>
       <w:pPr>
-        <w:pStyle w:val="u4"/>
+        <w:pStyle w:val="Heading4"/>
       </w:pPr>
       <w:r>
         <w:t>1.4.1 Screens Flow</w:t>
@@ -4764,7 +4893,7 @@
                     <pic:cNvPicPr preferRelativeResize="0"/>
                   </pic:nvPicPr>
                   <pic:blipFill>
-                    <a:blip r:embed="rId11"/>
+                    <a:blip r:embed="rId13"/>
                     <a:srcRect/>
                     <a:stretch>
                       <a:fillRect/>
@@ -4789,7 +4918,7 @@
     </w:p>
     <w:p>
       <w:pPr>
-        <w:pStyle w:val="u4"/>
+        <w:pStyle w:val="Heading4"/>
       </w:pPr>
       <w:r>
         <w:t>1.4.2 Screen Authorization</w:t>
@@ -5241,7 +5370,7 @@
     </w:p>
     <w:p>
       <w:pPr>
-        <w:pStyle w:val="u4"/>
+        <w:pStyle w:val="Heading4"/>
       </w:pPr>
       <w:r>
         <w:t>1.4.3 Non-UI Functions</w:t>
@@ -5513,13 +5642,13 @@
     <w:p/>
     <w:p>
       <w:pPr>
-        <w:pStyle w:val="u3"/>
-      </w:pPr>
-      <w:bookmarkStart w:id="7" w:name="_Toc187341937"/>
+        <w:pStyle w:val="Heading3"/>
+      </w:pPr>
+      <w:bookmarkStart w:id="8" w:name="_Toc187341937"/>
       <w:r>
         <w:t>1.5 Entity Relationship Diagram</w:t>
       </w:r>
-      <w:bookmarkEnd w:id="7"/>
+      <w:bookmarkEnd w:id="8"/>
     </w:p>
     <w:p>
       <w:pPr>
@@ -5587,7 +5716,7 @@
                     <pic:cNvPicPr preferRelativeResize="0"/>
                   </pic:nvPicPr>
                   <pic:blipFill>
-                    <a:blip r:embed="rId12"/>
+                    <a:blip r:embed="rId14"/>
                     <a:srcRect/>
                     <a:stretch>
                       <a:fillRect/>
@@ -5902,13 +6031,13 @@
     <w:p/>
     <w:p>
       <w:pPr>
-        <w:pStyle w:val="u2"/>
-      </w:pPr>
-      <w:bookmarkStart w:id="8" w:name="_Toc187341938"/>
+        <w:pStyle w:val="Heading2"/>
+      </w:pPr>
+      <w:bookmarkStart w:id="9" w:name="_Toc187341938"/>
       <w:r>
         <w:t>2. Use Case Specifications</w:t>
       </w:r>
-      <w:bookmarkEnd w:id="8"/>
+      <w:bookmarkEnd w:id="9"/>
     </w:p>
     <w:p>
       <w:pPr>
@@ -5975,17 +6104,17 @@
     </w:p>
     <w:p>
       <w:pPr>
-        <w:pStyle w:val="u3"/>
-      </w:pPr>
-      <w:bookmarkStart w:id="9" w:name="_Toc187341939"/>
+        <w:pStyle w:val="Heading3"/>
+      </w:pPr>
+      <w:bookmarkStart w:id="10" w:name="_Toc187341939"/>
       <w:r>
         <w:t>2.1 &lt;&lt;Feature Name1&gt;&gt;</w:t>
       </w:r>
-      <w:bookmarkEnd w:id="9"/>
-    </w:p>
-    <w:p>
-      <w:pPr>
-        <w:pStyle w:val="u4"/>
+      <w:bookmarkEnd w:id="10"/>
+    </w:p>
+    <w:p>
+      <w:pPr>
+        <w:pStyle w:val="Heading4"/>
       </w:pPr>
       <w:r>
         <w:t>2.1.1 UC Name1</w:t>
@@ -6425,7 +6554,7 @@
     <w:p/>
     <w:p>
       <w:pPr>
-        <w:pStyle w:val="u4"/>
+        <w:pStyle w:val="Heading4"/>
       </w:pPr>
       <w:r>
         <w:t>2.1.2 Login System</w:t>
@@ -6761,21 +6890,7 @@
               <w:rPr>
                 <w:color w:val="000000"/>
               </w:rPr>
-              <w:t xml:space="preserve">System </w:t>
-            </w:r>
-            <w:proofErr w:type="gramStart"/>
-            <w:r>
-              <w:rPr>
-                <w:color w:val="000000"/>
-              </w:rPr>
-              <w:t>show</w:t>
-            </w:r>
-            <w:proofErr w:type="gramEnd"/>
-            <w:r>
-              <w:rPr>
-                <w:color w:val="000000"/>
-              </w:rPr>
-              <w:t xml:space="preserve"> the User Login screen</w:t>
+              <w:t>System show the User Login screen</w:t>
             </w:r>
           </w:p>
           <w:p>
@@ -7095,21 +7210,7 @@
               <w:rPr>
                 <w:color w:val="000000"/>
               </w:rPr>
-              <w:t xml:space="preserve">Google validates user’s login information successfully and </w:t>
-            </w:r>
-            <w:proofErr w:type="gramStart"/>
-            <w:r>
-              <w:rPr>
-                <w:color w:val="000000"/>
-              </w:rPr>
-              <w:t>redirect</w:t>
-            </w:r>
-            <w:proofErr w:type="gramEnd"/>
-            <w:r>
-              <w:rPr>
-                <w:color w:val="000000"/>
-              </w:rPr>
-              <w:t xml:space="preserve"> him/her back to the system</w:t>
+              <w:t>Google validates user’s login information successfully and redirect him/her back to the system</w:t>
             </w:r>
           </w:p>
           <w:p>
@@ -7289,7 +7390,7 @@
     <w:p/>
     <w:p>
       <w:pPr>
-        <w:pStyle w:val="u4"/>
+        <w:pStyle w:val="Heading4"/>
       </w:pPr>
       <w:r>
         <w:t>2.1.</w:t>
@@ -7308,9 +7409,9 @@
     </w:p>
     <w:p>
       <w:pPr>
-        <w:pStyle w:val="u3"/>
-      </w:pPr>
-      <w:bookmarkStart w:id="10" w:name="_Toc187341940"/>
+        <w:pStyle w:val="Heading3"/>
+      </w:pPr>
+      <w:bookmarkStart w:id="11" w:name="_Toc187341940"/>
       <w:r>
         <w:t>2.</w:t>
       </w:r>
@@ -7328,7 +7429,7 @@
       <w:r>
         <w:t xml:space="preserve"> Feature</w:t>
       </w:r>
-      <w:bookmarkEnd w:id="10"/>
+      <w:bookmarkEnd w:id="11"/>
     </w:p>
     <w:p>
       <w:r>
@@ -7349,14 +7450,14 @@
     </w:p>
     <w:p>
       <w:pPr>
-        <w:pStyle w:val="u2"/>
-      </w:pPr>
-      <w:bookmarkStart w:id="11" w:name="_Toc187341941"/>
+        <w:pStyle w:val="Heading2"/>
+      </w:pPr>
+      <w:bookmarkStart w:id="12" w:name="_Toc187341941"/>
       <w:r>
         <w:lastRenderedPageBreak/>
         <w:t>3. Functional Requirements</w:t>
       </w:r>
-      <w:bookmarkEnd w:id="11"/>
+      <w:bookmarkEnd w:id="12"/>
     </w:p>
     <w:p>
       <w:pPr>
@@ -7365,10 +7466,10 @@
           <w:color w:val="0000FF"/>
         </w:rPr>
       </w:pPr>
-      <w:bookmarkStart w:id="12" w:name="_Toc143617359"/>
-      <w:bookmarkStart w:id="13" w:name="_Toc146703157"/>
-      <w:bookmarkStart w:id="14" w:name="_Toc179689383"/>
-      <w:bookmarkStart w:id="15" w:name="_Hlk180308893"/>
+      <w:bookmarkStart w:id="13" w:name="_Toc143617359"/>
+      <w:bookmarkStart w:id="14" w:name="_Toc146703157"/>
+      <w:bookmarkStart w:id="15" w:name="_Toc179689383"/>
+      <w:bookmarkStart w:id="16" w:name="_Hlk180308893"/>
       <w:r>
         <w:rPr>
           <w:i/>
@@ -7379,123 +7480,75 @@
     </w:p>
     <w:p>
       <w:pPr>
-        <w:pStyle w:val="u3"/>
-      </w:pPr>
-      <w:bookmarkStart w:id="16" w:name="_Toc187228345"/>
-      <w:bookmarkStart w:id="17" w:name="_Toc187341942"/>
-      <w:bookmarkEnd w:id="12"/>
+        <w:pStyle w:val="Heading3"/>
+      </w:pPr>
+      <w:bookmarkStart w:id="17" w:name="_Toc187228345"/>
+      <w:bookmarkStart w:id="18" w:name="_Toc187341942"/>
       <w:bookmarkEnd w:id="13"/>
       <w:bookmarkEnd w:id="14"/>
       <w:bookmarkEnd w:id="15"/>
+      <w:bookmarkEnd w:id="16"/>
       <w:r>
         <w:t xml:space="preserve">3.1 </w:t>
       </w:r>
-      <w:proofErr w:type="spellStart"/>
       <w:r>
         <w:rPr>
           <w:lang w:val="vi-VN"/>
         </w:rPr>
-        <w:t>Feature</w:t>
-      </w:r>
-      <w:proofErr w:type="spellEnd"/>
+        <w:t>Feature Name</w:t>
+      </w:r>
+      <w:r>
+        <w:t>1</w:t>
+      </w:r>
+      <w:bookmarkEnd w:id="17"/>
+      <w:bookmarkEnd w:id="18"/>
+    </w:p>
+    <w:p>
+      <w:pPr>
+        <w:pStyle w:val="Heading4"/>
+      </w:pPr>
+      <w:bookmarkStart w:id="19" w:name="_Toc143617360"/>
+      <w:bookmarkStart w:id="20" w:name="_Toc179689384"/>
+      <w:bookmarkStart w:id="21" w:name="_Toc187228346"/>
+      <w:bookmarkStart w:id="22" w:name="_Hlk144402728"/>
+      <w:r>
+        <w:t>3.1</w:t>
+      </w:r>
       <w:r>
         <w:rPr>
           <w:lang w:val="vi-VN"/>
         </w:rPr>
-        <w:t xml:space="preserve"> </w:t>
-      </w:r>
-      <w:proofErr w:type="spellStart"/>
+        <w:t>.1 SubFeature Name</w:t>
+      </w:r>
+      <w:bookmarkEnd w:id="19"/>
+      <w:r>
+        <w:t>1.1</w:t>
+      </w:r>
+      <w:bookmarkEnd w:id="20"/>
+      <w:bookmarkEnd w:id="21"/>
+    </w:p>
+    <w:p>
+      <w:pPr>
+        <w:pStyle w:val="Heading5"/>
+      </w:pPr>
+      <w:r>
+        <w:t xml:space="preserve">3.1.1.1 </w:t>
+      </w:r>
       <w:r>
         <w:rPr>
           <w:lang w:val="vi-VN"/>
         </w:rPr>
-        <w:t>Name</w:t>
-      </w:r>
-      <w:proofErr w:type="spellEnd"/>
-      <w:r>
-        <w:t>1</w:t>
-      </w:r>
-      <w:bookmarkEnd w:id="16"/>
-      <w:bookmarkEnd w:id="17"/>
-    </w:p>
-    <w:p>
-      <w:pPr>
-        <w:pStyle w:val="u4"/>
-      </w:pPr>
-      <w:bookmarkStart w:id="18" w:name="_Toc143617360"/>
-      <w:bookmarkStart w:id="19" w:name="_Toc179689384"/>
-      <w:bookmarkStart w:id="20" w:name="_Toc187228346"/>
-      <w:bookmarkStart w:id="21" w:name="_Hlk144402728"/>
-      <w:r>
-        <w:t>3.1</w:t>
+        <w:t>Screen</w:t>
+      </w:r>
+      <w:r>
+        <w:t>/Function</w:t>
       </w:r>
       <w:r>
         <w:rPr>
           <w:lang w:val="vi-VN"/>
         </w:rPr>
-        <w:t xml:space="preserve">.1 </w:t>
-      </w:r>
-      <w:proofErr w:type="spellStart"/>
-      <w:r>
-        <w:rPr>
-          <w:lang w:val="vi-VN"/>
-        </w:rPr>
-        <w:t>SubFeature</w:t>
-      </w:r>
-      <w:proofErr w:type="spellEnd"/>
-      <w:r>
-        <w:rPr>
-          <w:lang w:val="vi-VN"/>
-        </w:rPr>
-        <w:t xml:space="preserve"> </w:t>
-      </w:r>
-      <w:proofErr w:type="spellStart"/>
-      <w:r>
-        <w:rPr>
-          <w:lang w:val="vi-VN"/>
-        </w:rPr>
-        <w:t>Name</w:t>
-      </w:r>
-      <w:bookmarkEnd w:id="18"/>
-      <w:proofErr w:type="spellEnd"/>
-      <w:r>
-        <w:t>1.1</w:t>
-      </w:r>
-      <w:bookmarkEnd w:id="19"/>
-      <w:bookmarkEnd w:id="20"/>
-    </w:p>
-    <w:p>
-      <w:pPr>
-        <w:pStyle w:val="u5"/>
-      </w:pPr>
-      <w:r>
-        <w:t xml:space="preserve">3.1.1.1 </w:t>
-      </w:r>
-      <w:proofErr w:type="spellStart"/>
-      <w:r>
-        <w:rPr>
-          <w:lang w:val="vi-VN"/>
-        </w:rPr>
-        <w:t>Screen</w:t>
-      </w:r>
-      <w:proofErr w:type="spellEnd"/>
-      <w:r>
-        <w:t>/Function</w:t>
-      </w:r>
-      <w:r>
-        <w:rPr>
-          <w:lang w:val="vi-VN"/>
-        </w:rPr>
-        <w:t xml:space="preserve"> </w:t>
-      </w:r>
-      <w:proofErr w:type="spellStart"/>
-      <w:r>
-        <w:rPr>
-          <w:lang w:val="vi-VN"/>
-        </w:rPr>
-        <w:t>Name</w:t>
-      </w:r>
-      <w:proofErr w:type="spellEnd"/>
+        <w:t xml:space="preserve"> Name</w:t>
+      </w:r>
       <w:r>
         <w:t>1</w:t>
       </w:r>
@@ -7653,7 +7706,7 @@
     </w:p>
     <w:tbl>
       <w:tblPr>
-        <w:tblStyle w:val="LiBang"/>
+        <w:tblStyle w:val="TableGrid"/>
         <w:tblW w:w="9067" w:type="dxa"/>
         <w:tblLook w:val="04A0" w:firstRow="1" w:lastRow="0" w:firstColumn="1" w:lastColumn="0" w:noHBand="0" w:noVBand="1"/>
       </w:tblPr>
@@ -7879,7 +7932,7 @@
     </w:p>
     <w:p>
       <w:pPr>
-        <w:pStyle w:val="u5"/>
+        <w:pStyle w:val="Heading5"/>
       </w:pPr>
       <w:r>
         <w:t>3.1.1.2 Screen/Function Name2</w:t>
@@ -7892,14 +7945,14 @@
     </w:p>
     <w:p>
       <w:pPr>
-        <w:pStyle w:val="u4"/>
+        <w:pStyle w:val="Heading4"/>
         <w:rPr>
           <w:lang w:val="vi-VN"/>
         </w:rPr>
       </w:pPr>
-      <w:bookmarkStart w:id="22" w:name="_Toc179689385"/>
-      <w:bookmarkStart w:id="23" w:name="_Toc187228347"/>
-      <w:bookmarkEnd w:id="21"/>
+      <w:bookmarkStart w:id="23" w:name="_Toc179689385"/>
+      <w:bookmarkStart w:id="24" w:name="_Toc187228347"/>
+      <w:bookmarkEnd w:id="22"/>
       <w:r>
         <w:t>3.1</w:t>
       </w:r>
@@ -7916,35 +7969,13 @@
         <w:rPr>
           <w:lang w:val="vi-VN"/>
         </w:rPr>
-        <w:t xml:space="preserve"> </w:t>
-      </w:r>
-      <w:proofErr w:type="spellStart"/>
-      <w:r>
-        <w:rPr>
-          <w:lang w:val="vi-VN"/>
-        </w:rPr>
-        <w:t>SubFeature</w:t>
-      </w:r>
-      <w:proofErr w:type="spellEnd"/>
-      <w:r>
-        <w:rPr>
-          <w:lang w:val="vi-VN"/>
-        </w:rPr>
-        <w:t xml:space="preserve"> </w:t>
-      </w:r>
-      <w:proofErr w:type="spellStart"/>
-      <w:r>
-        <w:rPr>
-          <w:lang w:val="vi-VN"/>
-        </w:rPr>
-        <w:t>Name</w:t>
-      </w:r>
-      <w:proofErr w:type="spellEnd"/>
+        <w:t xml:space="preserve"> SubFeature Name</w:t>
+      </w:r>
       <w:r>
         <w:t>1.2</w:t>
       </w:r>
-      <w:bookmarkEnd w:id="22"/>
       <w:bookmarkEnd w:id="23"/>
+      <w:bookmarkEnd w:id="24"/>
     </w:p>
     <w:p>
       <w:r>
@@ -7953,30 +7984,30 @@
     </w:p>
     <w:p>
       <w:pPr>
-        <w:pStyle w:val="u3"/>
-      </w:pPr>
-      <w:bookmarkStart w:id="24" w:name="_Toc179689386"/>
-      <w:bookmarkStart w:id="25" w:name="_Toc187228348"/>
-      <w:bookmarkStart w:id="26" w:name="_Toc187341943"/>
+        <w:pStyle w:val="Heading3"/>
+      </w:pPr>
+      <w:bookmarkStart w:id="25" w:name="_Toc179689386"/>
+      <w:bookmarkStart w:id="26" w:name="_Toc187228348"/>
+      <w:bookmarkStart w:id="27" w:name="_Toc187341943"/>
       <w:r>
         <w:t>3.2 User Authentication</w:t>
       </w:r>
-      <w:bookmarkEnd w:id="24"/>
       <w:bookmarkEnd w:id="25"/>
       <w:bookmarkEnd w:id="26"/>
-    </w:p>
-    <w:p>
-      <w:pPr>
-        <w:pStyle w:val="u4"/>
-      </w:pPr>
-      <w:bookmarkStart w:id="27" w:name="_Toc179689388"/>
-      <w:bookmarkStart w:id="28" w:name="_Toc187228349"/>
-      <w:bookmarkStart w:id="29" w:name="_Toc179689387"/>
+      <w:bookmarkEnd w:id="27"/>
+    </w:p>
+    <w:p>
+      <w:pPr>
+        <w:pStyle w:val="Heading4"/>
+      </w:pPr>
+      <w:bookmarkStart w:id="28" w:name="_Toc179689388"/>
+      <w:bookmarkStart w:id="29" w:name="_Toc187228349"/>
+      <w:bookmarkStart w:id="30" w:name="_Toc179689387"/>
       <w:r>
         <w:t>3.2.1 User Register</w:t>
       </w:r>
-      <w:bookmarkEnd w:id="27"/>
       <w:bookmarkEnd w:id="28"/>
+      <w:bookmarkEnd w:id="29"/>
     </w:p>
     <w:p>
       <w:pPr>
@@ -7988,12 +8019,12 @@
     </w:p>
     <w:p>
       <w:pPr>
-        <w:pStyle w:val="u4"/>
+        <w:pStyle w:val="Heading4"/>
         <w:rPr>
           <w:lang w:val="vi-VN"/>
         </w:rPr>
       </w:pPr>
-      <w:bookmarkStart w:id="30" w:name="_Toc187228350"/>
+      <w:bookmarkStart w:id="31" w:name="_Toc187228350"/>
       <w:r>
         <w:t>3.2.2</w:t>
       </w:r>
@@ -8001,18 +8032,10 @@
         <w:rPr>
           <w:lang w:val="vi-VN"/>
         </w:rPr>
-        <w:t xml:space="preserve"> User </w:t>
-      </w:r>
-      <w:proofErr w:type="spellStart"/>
-      <w:r>
-        <w:rPr>
-          <w:lang w:val="vi-VN"/>
-        </w:rPr>
-        <w:t>Login</w:t>
-      </w:r>
-      <w:bookmarkEnd w:id="29"/>
+        <w:t xml:space="preserve"> User Login</w:t>
+      </w:r>
       <w:bookmarkEnd w:id="30"/>
-      <w:proofErr w:type="spellEnd"/>
+      <w:bookmarkEnd w:id="31"/>
     </w:p>
     <w:p>
       <w:r>
@@ -8021,13 +8044,13 @@
     </w:p>
     <w:p>
       <w:pPr>
-        <w:pStyle w:val="u4"/>
-      </w:pPr>
-      <w:bookmarkStart w:id="31" w:name="_Toc187228351"/>
+        <w:pStyle w:val="Heading4"/>
+      </w:pPr>
+      <w:bookmarkStart w:id="32" w:name="_Toc187228351"/>
       <w:r>
         <w:t>3.2.3 Password Reset</w:t>
       </w:r>
-      <w:bookmarkEnd w:id="31"/>
+      <w:bookmarkEnd w:id="32"/>
     </w:p>
     <w:p>
       <w:r>
@@ -8036,11 +8059,11 @@
     </w:p>
     <w:p>
       <w:pPr>
-        <w:pStyle w:val="u3"/>
-      </w:pPr>
-      <w:bookmarkStart w:id="32" w:name="_Toc179689390"/>
-      <w:bookmarkStart w:id="33" w:name="_Toc187228353"/>
-      <w:bookmarkStart w:id="34" w:name="_Toc187341944"/>
+        <w:pStyle w:val="Heading3"/>
+      </w:pPr>
+      <w:bookmarkStart w:id="33" w:name="_Toc179689390"/>
+      <w:bookmarkStart w:id="34" w:name="_Toc187228353"/>
+      <w:bookmarkStart w:id="35" w:name="_Toc187341944"/>
       <w:r>
         <w:lastRenderedPageBreak/>
         <w:t>3.</w:t>
@@ -8048,31 +8071,31 @@
       <w:r>
         <w:t>3 System Administration</w:t>
       </w:r>
-      <w:bookmarkEnd w:id="32"/>
       <w:bookmarkEnd w:id="33"/>
       <w:bookmarkEnd w:id="34"/>
-    </w:p>
-    <w:p>
-      <w:pPr>
-        <w:pStyle w:val="u4"/>
-      </w:pPr>
-      <w:bookmarkStart w:id="35" w:name="_Toc179689391"/>
-      <w:bookmarkStart w:id="36" w:name="_Toc187228354"/>
+      <w:bookmarkEnd w:id="35"/>
+    </w:p>
+    <w:p>
+      <w:pPr>
+        <w:pStyle w:val="Heading4"/>
+      </w:pPr>
+      <w:bookmarkStart w:id="36" w:name="_Toc179689391"/>
+      <w:bookmarkStart w:id="37" w:name="_Toc187228354"/>
       <w:r>
         <w:t>3.</w:t>
       </w:r>
       <w:r>
         <w:t xml:space="preserve">3.1 </w:t>
       </w:r>
-      <w:bookmarkEnd w:id="35"/>
+      <w:bookmarkEnd w:id="36"/>
       <w:r>
         <w:t>Master Data</w:t>
       </w:r>
-      <w:bookmarkEnd w:id="36"/>
-    </w:p>
-    <w:p>
-      <w:pPr>
-        <w:pStyle w:val="u5"/>
+      <w:bookmarkEnd w:id="37"/>
+    </w:p>
+    <w:p>
+      <w:pPr>
+        <w:pStyle w:val="Heading5"/>
       </w:pPr>
       <w:r>
         <w:t>3.</w:t>
@@ -8147,7 +8170,7 @@
           </mc:Choice>
           <mc:Fallback>
             <w:pict>
-              <v:rect w14:anchorId="6D697A5F" id="Rectangle 22" o:spid="_x0000_s1026" style="position:absolute;margin-left:404.85pt;margin-top:101pt;width:26.6pt;height:17.25pt;z-index:251661312;visibility:visible;mso-wrap-style:square;mso-wrap-distance-left:9pt;mso-wrap-distance-top:0;mso-wrap-distance-right:9pt;mso-wrap-distance-bottom:0;mso-position-horizontal:absolute;mso-position-horizontal-relative:text;mso-position-vertical:absolute;mso-position-vertical-relative:text;v-text-anchor:top" o:gfxdata="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" filled="f" stroked="f">
+              <v:rect w14:anchorId="6D697A5F" id="Rectangle 22" o:spid="_x0000_s1026" style="position:absolute;margin-left:404.85pt;margin-top:101pt;width:26.6pt;height:17.25pt;z-index:251661312;visibility:visible;mso-wrap-style:square;mso-wrap-distance-left:9pt;mso-wrap-distance-top:0;mso-wrap-distance-right:9pt;mso-wrap-distance-bottom:0;mso-position-horizontal:absolute;mso-position-horizontal-relative:text;mso-position-vertical:absolute;mso-position-vertical-relative:text;v-text-anchor:top" o:gfxdata="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" filled="f" stroked="f">
                 <v:textbox inset="2.53958mm,1.2694mm,2.53958mm,1.2694mm">
                   <w:txbxContent>
                     <w:p>
@@ -8235,7 +8258,7 @@
           </mc:Choice>
           <mc:Fallback>
             <w:pict>
-              <v:rect w14:anchorId="4965306C" id="Rectangle 23" o:spid="_x0000_s1027" style="position:absolute;margin-left:57.85pt;margin-top:14pt;width:26.6pt;height:17.25pt;z-index:251660288;visibility:visible;mso-wrap-style:square;mso-wrap-distance-left:9pt;mso-wrap-distance-top:0;mso-wrap-distance-right:9pt;mso-wrap-distance-bottom:0;mso-position-horizontal:absolute;mso-position-horizontal-relative:text;mso-position-vertical:absolute;mso-position-vertical-relative:text;v-text-anchor:top" o:gfxdata="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" filled="f" stroked="f">
+              <v:rect w14:anchorId="4965306C" id="Rectangle 23" o:spid="_x0000_s1027" style="position:absolute;margin-left:57.85pt;margin-top:14pt;width:26.6pt;height:17.25pt;z-index:251660288;visibility:visible;mso-wrap-style:square;mso-wrap-distance-left:9pt;mso-wrap-distance-top:0;mso-wrap-distance-right:9pt;mso-wrap-distance-bottom:0;mso-position-horizontal:absolute;mso-position-horizontal-relative:text;mso-position-vertical:absolute;mso-position-vertical-relative:text;v-text-anchor:top" o:gfxdata="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" filled="f" stroked="f">
                 <v:textbox inset="2.53958mm,1.2694mm,2.53958mm,1.2694mm">
                   <w:txbxContent>
                     <w:p>
@@ -8323,7 +8346,7 @@
           </mc:Choice>
           <mc:Fallback>
             <w:pict>
-              <v:rect w14:anchorId="667631DD" id="Rectangle 21" o:spid="_x0000_s1028" style="position:absolute;margin-left:3.85pt;margin-top:15pt;width:26.6pt;height:17.25pt;z-index:251659264;visibility:visible;mso-wrap-style:square;mso-wrap-distance-left:9pt;mso-wrap-distance-top:0;mso-wrap-distance-right:9pt;mso-wrap-distance-bottom:0;mso-position-horizontal:absolute;mso-position-horizontal-relative:text;mso-position-vertical:absolute;mso-position-vertical-relative:text;v-text-anchor:top" o:gfxdata="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" filled="f" stroked="f">
+              <v:rect w14:anchorId="667631DD" id="Rectangle 21" o:spid="_x0000_s1028" style="position:absolute;margin-left:3.85pt;margin-top:15pt;width:26.6pt;height:17.25pt;z-index:251659264;visibility:visible;mso-wrap-style:square;mso-wrap-distance-left:9pt;mso-wrap-distance-top:0;mso-wrap-distance-right:9pt;mso-wrap-distance-bottom:0;mso-position-horizontal:absolute;mso-position-horizontal-relative:text;mso-position-vertical:absolute;mso-position-vertical-relative:text;v-text-anchor:top" o:gfxdata="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" filled="f" stroked="f">
                 <v:textbox inset="2.53958mm,1.2694mm,2.53958mm,1.2694mm">
                   <w:txbxContent>
                     <w:p>
@@ -8364,7 +8387,7 @@
                     <pic:cNvPicPr preferRelativeResize="0"/>
                   </pic:nvPicPr>
                   <pic:blipFill>
-                    <a:blip r:embed="rId13"/>
+                    <a:blip r:embed="rId15"/>
                     <a:srcRect/>
                     <a:stretch>
                       <a:fillRect/>
@@ -8401,7 +8424,7 @@
     </w:p>
     <w:p>
       <w:pPr>
-        <w:pStyle w:val="oancuaDanhsach"/>
+        <w:pStyle w:val="ListParagraph"/>
         <w:numPr>
           <w:ilvl w:val="0"/>
           <w:numId w:val="9"/>
@@ -8414,7 +8437,7 @@
     </w:p>
     <w:p>
       <w:pPr>
-        <w:pStyle w:val="oancuaDanhsach"/>
+        <w:pStyle w:val="ListParagraph"/>
         <w:numPr>
           <w:ilvl w:val="0"/>
           <w:numId w:val="9"/>
@@ -8427,7 +8450,7 @@
     </w:p>
     <w:p>
       <w:pPr>
-        <w:pStyle w:val="oancuaDanhsach"/>
+        <w:pStyle w:val="ListParagraph"/>
         <w:numPr>
           <w:ilvl w:val="0"/>
           <w:numId w:val="9"/>
@@ -8440,7 +8463,7 @@
     </w:p>
     <w:p>
       <w:pPr>
-        <w:pStyle w:val="oancuaDanhsach"/>
+        <w:pStyle w:val="ListParagraph"/>
         <w:numPr>
           <w:ilvl w:val="0"/>
           <w:numId w:val="9"/>
@@ -8461,7 +8484,7 @@
     </w:p>
     <w:p>
       <w:pPr>
-        <w:pStyle w:val="oancuaDanhsach"/>
+        <w:pStyle w:val="ListParagraph"/>
         <w:numPr>
           <w:ilvl w:val="0"/>
           <w:numId w:val="9"/>
@@ -8474,7 +8497,7 @@
     </w:p>
     <w:p>
       <w:pPr>
-        <w:pStyle w:val="oancuaDanhsach"/>
+        <w:pStyle w:val="ListParagraph"/>
         <w:numPr>
           <w:ilvl w:val="0"/>
           <w:numId w:val="9"/>
@@ -8507,7 +8530,7 @@
     </w:p>
     <w:tbl>
       <w:tblPr>
-        <w:tblStyle w:val="LiBang"/>
+        <w:tblStyle w:val="TableGrid"/>
         <w:tblW w:w="9064" w:type="dxa"/>
         <w:tblInd w:w="3" w:type="dxa"/>
         <w:tblLook w:val="04A0" w:firstRow="1" w:lastRow="0" w:firstColumn="1" w:lastColumn="0" w:noHBand="0" w:noVBand="1"/>
@@ -8659,7 +8682,7 @@
     <w:p/>
     <w:p>
       <w:pPr>
-        <w:pStyle w:val="u5"/>
+        <w:pStyle w:val="Heading5"/>
       </w:pPr>
       <w:r>
         <w:t>3.</w:t>
@@ -8687,7 +8710,7 @@
                     <pic:cNvPicPr preferRelativeResize="0"/>
                   </pic:nvPicPr>
                   <pic:blipFill>
-                    <a:blip r:embed="rId14"/>
+                    <a:blip r:embed="rId16"/>
                     <a:srcRect/>
                     <a:stretch>
                       <a:fillRect/>
@@ -8726,7 +8749,7 @@
     </w:p>
     <w:p>
       <w:pPr>
-        <w:pStyle w:val="oancuaDanhsach"/>
+        <w:pStyle w:val="ListParagraph"/>
         <w:numPr>
           <w:ilvl w:val="0"/>
           <w:numId w:val="9"/>
@@ -8739,7 +8762,7 @@
     </w:p>
     <w:p>
       <w:pPr>
-        <w:pStyle w:val="oancuaDanhsach"/>
+        <w:pStyle w:val="ListParagraph"/>
         <w:numPr>
           <w:ilvl w:val="0"/>
           <w:numId w:val="9"/>
@@ -8766,7 +8789,7 @@
     </w:p>
     <w:tbl>
       <w:tblPr>
-        <w:tblStyle w:val="LiBang"/>
+        <w:tblStyle w:val="TableGrid"/>
         <w:tblW w:w="9064" w:type="dxa"/>
         <w:tblInd w:w="3" w:type="dxa"/>
         <w:tblLook w:val="04A0" w:firstRow="1" w:lastRow="0" w:firstColumn="1" w:lastColumn="0" w:noHBand="0" w:noVBand="1"/>
@@ -8947,20 +8970,20 @@
     <w:p/>
     <w:p>
       <w:pPr>
-        <w:pStyle w:val="u4"/>
-      </w:pPr>
-      <w:bookmarkStart w:id="37" w:name="_Toc187228355"/>
+        <w:pStyle w:val="Heading4"/>
+      </w:pPr>
+      <w:bookmarkStart w:id="38" w:name="_Toc187228355"/>
       <w:r>
         <w:t>3.</w:t>
       </w:r>
       <w:r>
         <w:t>3.2 User Management</w:t>
       </w:r>
-      <w:bookmarkEnd w:id="37"/>
-    </w:p>
-    <w:p>
-      <w:pPr>
-        <w:pStyle w:val="u5"/>
+      <w:bookmarkEnd w:id="38"/>
+    </w:p>
+    <w:p>
+      <w:pPr>
+        <w:pStyle w:val="Heading5"/>
       </w:pPr>
       <w:r>
         <w:t>3.</w:t>
@@ -8976,7 +8999,7 @@
     </w:p>
     <w:p>
       <w:pPr>
-        <w:pStyle w:val="u5"/>
+        <w:pStyle w:val="Heading5"/>
       </w:pPr>
       <w:r>
         <w:t>3.</w:t>
@@ -8992,23 +9015,23 @@
     </w:p>
     <w:p>
       <w:pPr>
-        <w:pStyle w:val="u2"/>
-      </w:pPr>
-      <w:bookmarkStart w:id="38" w:name="_Toc187341945"/>
+        <w:pStyle w:val="Heading2"/>
+      </w:pPr>
+      <w:bookmarkStart w:id="39" w:name="_Toc187341945"/>
       <w:r>
         <w:t>4. Non-Functional Requirements</w:t>
       </w:r>
-      <w:bookmarkEnd w:id="38"/>
-    </w:p>
-    <w:p>
-      <w:pPr>
-        <w:pStyle w:val="u3"/>
-      </w:pPr>
-      <w:bookmarkStart w:id="39" w:name="_Toc187341946"/>
+      <w:bookmarkEnd w:id="39"/>
+    </w:p>
+    <w:p>
+      <w:pPr>
+        <w:pStyle w:val="Heading3"/>
+      </w:pPr>
+      <w:bookmarkStart w:id="40" w:name="_Toc187341946"/>
       <w:r>
         <w:t>3.1 External Interfaces</w:t>
       </w:r>
-      <w:bookmarkEnd w:id="39"/>
+      <w:bookmarkEnd w:id="40"/>
     </w:p>
     <w:p>
       <w:pPr>
@@ -9027,13 +9050,13 @@
     </w:p>
     <w:p>
       <w:pPr>
-        <w:pStyle w:val="u3"/>
-      </w:pPr>
-      <w:bookmarkStart w:id="40" w:name="_Toc187341947"/>
+        <w:pStyle w:val="Heading3"/>
+      </w:pPr>
+      <w:bookmarkStart w:id="41" w:name="_Toc187341947"/>
       <w:r>
         <w:t>3.2 Quality Attributes</w:t>
       </w:r>
-      <w:bookmarkEnd w:id="40"/>
+      <w:bookmarkEnd w:id="41"/>
     </w:p>
     <w:p>
       <w:pPr>
@@ -9052,10 +9075,10 @@
     </w:p>
     <w:p>
       <w:pPr>
-        <w:pStyle w:val="u4"/>
-      </w:pPr>
-      <w:bookmarkStart w:id="41" w:name="_heading=h.1y810tw" w:colFirst="0" w:colLast="0"/>
-      <w:bookmarkEnd w:id="41"/>
+        <w:pStyle w:val="Heading4"/>
+      </w:pPr>
+      <w:bookmarkStart w:id="42" w:name="_heading=h.1y810tw" w:colFirst="0" w:colLast="0"/>
+      <w:bookmarkEnd w:id="42"/>
       <w:r>
         <w:t xml:space="preserve">3.2.1 Usability </w:t>
       </w:r>
@@ -9078,10 +9101,10 @@
     </w:p>
     <w:p>
       <w:pPr>
-        <w:pStyle w:val="u4"/>
-      </w:pPr>
-      <w:bookmarkStart w:id="42" w:name="_heading=h.4i7ojhp" w:colFirst="0" w:colLast="0"/>
-      <w:bookmarkEnd w:id="42"/>
+        <w:pStyle w:val="Heading4"/>
+      </w:pPr>
+      <w:bookmarkStart w:id="43" w:name="_heading=h.4i7ojhp" w:colFirst="0" w:colLast="0"/>
+      <w:bookmarkEnd w:id="43"/>
       <w:r>
         <w:t>3.2.2 Performance</w:t>
       </w:r>
@@ -9177,7 +9200,7 @@
     </w:p>
     <w:p>
       <w:pPr>
-        <w:pStyle w:val="u4"/>
+        <w:pStyle w:val="Heading4"/>
       </w:pPr>
       <w:r>
         <w:t>3.2.3 …</w:t>
@@ -9186,14 +9209,14 @@
     <w:p/>
     <w:p>
       <w:pPr>
-        <w:pStyle w:val="u2"/>
-      </w:pPr>
-      <w:bookmarkStart w:id="43" w:name="_Toc187341948"/>
+        <w:pStyle w:val="Heading2"/>
+      </w:pPr>
+      <w:bookmarkStart w:id="44" w:name="_Toc187341948"/>
       <w:r>
         <w:lastRenderedPageBreak/>
         <w:t>5. Requirement Appendix</w:t>
       </w:r>
-      <w:bookmarkEnd w:id="43"/>
+      <w:bookmarkEnd w:id="44"/>
     </w:p>
     <w:p>
       <w:pPr>
@@ -9213,13 +9236,13 @@
     </w:p>
     <w:p>
       <w:pPr>
-        <w:pStyle w:val="u3"/>
-      </w:pPr>
-      <w:bookmarkStart w:id="44" w:name="_Toc187341949"/>
+        <w:pStyle w:val="Heading3"/>
+      </w:pPr>
+      <w:bookmarkStart w:id="45" w:name="_Toc187341949"/>
       <w:r>
         <w:t>5.1 Business Rules</w:t>
       </w:r>
-      <w:bookmarkEnd w:id="44"/>
+      <w:bookmarkEnd w:id="45"/>
     </w:p>
     <w:p>
       <w:pPr>
@@ -9891,13 +9914,13 @@
     <w:p/>
     <w:p>
       <w:pPr>
-        <w:pStyle w:val="u3"/>
-      </w:pPr>
-      <w:bookmarkStart w:id="45" w:name="_Toc187341950"/>
+        <w:pStyle w:val="Heading3"/>
+      </w:pPr>
+      <w:bookmarkStart w:id="46" w:name="_Toc187341950"/>
       <w:r>
         <w:t>5.2 System Messages</w:t>
       </w:r>
-      <w:bookmarkEnd w:id="45"/>
+      <w:bookmarkEnd w:id="46"/>
     </w:p>
     <w:tbl>
       <w:tblPr>
@@ -11281,16 +11304,16 @@
     </w:p>
     <w:p>
       <w:pPr>
-        <w:pStyle w:val="u3"/>
-      </w:pPr>
-      <w:bookmarkStart w:id="46" w:name="_Toc187341951"/>
+        <w:pStyle w:val="Heading3"/>
+      </w:pPr>
+      <w:bookmarkStart w:id="47" w:name="_Toc187341951"/>
       <w:r>
         <w:t>5.3 Other Requirements…</w:t>
       </w:r>
-      <w:bookmarkEnd w:id="46"/>
+      <w:bookmarkEnd w:id="47"/>
     </w:p>
     <w:sectPr>
-      <w:footerReference w:type="default" r:id="rId15"/>
+      <w:footerReference w:type="default" r:id="rId17"/>
       <w:pgSz w:w="11906" w:h="16838"/>
       <w:pgMar w:top="1440" w:right="1416" w:bottom="1440" w:left="1440" w:header="708" w:footer="708" w:gutter="0"/>
       <w:pgNumType w:start="1"/>
@@ -11302,7 +11325,7 @@
 </file>
 
 <file path=word/endnotes.xml><?xml version="1.0" encoding="utf-8"?>
-<w:endnotes xmlns:wpc="http://schemas.microsoft.com/office/word/2010/wordprocessingCanvas" xmlns:cx="http://schemas.microsoft.com/office/drawing/2014/chartex" xmlns:cx1="http://schemas.microsoft.com/office/drawing/2015/9/8/chartex" xmlns:cx2="http://schemas.microsoft.com/office/drawing/2015/10/21/chartex" xmlns:cx3="http://schemas.microsoft.com/office/drawing/2016/5/9/chartex" xmlns:cx4="http://schemas.microsoft.com/office/drawing/2016/5/10/chartex" xmlns:cx5="http://schemas.microsoft.com/office/drawing/2016/5/11/chartex" xmlns:cx6="http://schemas.microsoft.com/office/drawing/2016/5/12/chartex" xmlns:cx7="http://schemas.microsoft.com/office/drawing/2016/5/13/chartex" xmlns:cx8="http://schemas.microsoft.com/office/drawing/2016/5/14/chartex" xmlns:mc="http://schemas.openxmlformats.org/markup-compatibility/2006" xmlns:aink="http://schemas.microsoft.com/office/drawing/2016/ink" xmlns:am3d="http://schemas.microsoft.com/office/drawing/2017/model3d" xmlns:o="urn:schemas-microsoft-com:office:office" xmlns:oel="http://schemas.microsoft.com/office/2019/extlst" xmlns:r="http://schemas.openxmlformats.org/officeDocument/2006/relationships" xmlns:m="http://schemas.openxmlformats.org/officeDocument/2006/math" xmlns:v="urn:schemas-microsoft-com:vml" xmlns:wp14="http://schemas.microsoft.com/office/word/2010/wordprocessingDrawing" xmlns:wp="http://schemas.openxmlformats.org/drawingml/2006/wordprocessingDrawing" xmlns:w10="urn:schemas-microsoft-com:office:word" xmlns:w="http://schemas.openxmlformats.org/wordprocessingml/2006/main" xmlns:w14="http://schemas.microsoft.com/office/word/2010/wordml" xmlns:w15="http://schemas.microsoft.com/office/word/2012/wordml" xmlns:w16cex="http://schemas.microsoft.com/office/word/2018/wordml/cex" xmlns:w16cid="http://schemas.microsoft.com/office/word/2016/wordml/cid" xmlns:w16="http://schemas.microsoft.com/office/word/2018/wordml" xmlns:w16du="http://schemas.microsoft.com/office/word/2023/wordml/word16du" xmlns:w16sdtdh="http://schemas.microsoft.com/office/word/2020/wordml/sdtdatahash" xmlns:w16sdtfl="http://schemas.microsoft.com/office/word/2024/wordml/sdtformatlock" xmlns:w16se="http://schemas.microsoft.com/office/word/2015/wordml/symex" xmlns:wpg="http://schemas.microsoft.com/office/word/2010/wordprocessingGroup" xmlns:wpi="http://schemas.microsoft.com/office/word/2010/wordprocessingInk" xmlns:wne="http://schemas.microsoft.com/office/word/2006/wordml" xmlns:wps="http://schemas.microsoft.com/office/word/2010/wordprocessingShape" mc:Ignorable="w14 w15 w16se w16cid w16 w16cex w16sdtdh w16sdtfl w16du wp14">
+<w:endnotes xmlns:wpc="http://schemas.microsoft.com/office/word/2010/wordprocessingCanvas" xmlns:cx="http://schemas.microsoft.com/office/drawing/2014/chartex" xmlns:cx1="http://schemas.microsoft.com/office/drawing/2015/9/8/chartex" xmlns:cx2="http://schemas.microsoft.com/office/drawing/2015/10/21/chartex" xmlns:cx3="http://schemas.microsoft.com/office/drawing/2016/5/9/chartex" xmlns:cx4="http://schemas.microsoft.com/office/drawing/2016/5/10/chartex" xmlns:cx5="http://schemas.microsoft.com/office/drawing/2016/5/11/chartex" xmlns:cx6="http://schemas.microsoft.com/office/drawing/2016/5/12/chartex" xmlns:cx7="http://schemas.microsoft.com/office/drawing/2016/5/13/chartex" xmlns:cx8="http://schemas.microsoft.com/office/drawing/2016/5/14/chartex" xmlns:mc="http://schemas.openxmlformats.org/markup-compatibility/2006" xmlns:aink="http://schemas.microsoft.com/office/drawing/2016/ink" xmlns:am3d="http://schemas.microsoft.com/office/drawing/2017/model3d" xmlns:o="urn:schemas-microsoft-com:office:office" xmlns:r="http://schemas.openxmlformats.org/officeDocument/2006/relationships" xmlns:m="http://schemas.openxmlformats.org/officeDocument/2006/math" xmlns:v="urn:schemas-microsoft-com:vml" xmlns:wp14="http://schemas.microsoft.com/office/word/2010/wordprocessingDrawing" xmlns:wp="http://schemas.openxmlformats.org/drawingml/2006/wordprocessingDrawing" xmlns:w10="urn:schemas-microsoft-com:office:word" xmlns:w="http://schemas.openxmlformats.org/wordprocessingml/2006/main" xmlns:w14="http://schemas.microsoft.com/office/word/2010/wordml" xmlns:w15="http://schemas.microsoft.com/office/word/2012/wordml" xmlns:w16cid="http://schemas.microsoft.com/office/word/2016/wordml/cid" xmlns:w16se="http://schemas.microsoft.com/office/word/2015/wordml/symex" xmlns:wpg="http://schemas.microsoft.com/office/word/2010/wordprocessingGroup" xmlns:wpi="http://schemas.microsoft.com/office/word/2010/wordprocessingInk" xmlns:wne="http://schemas.microsoft.com/office/word/2006/wordml" xmlns:wps="http://schemas.microsoft.com/office/word/2010/wordprocessingShape" mc:Ignorable="w14 w15 w16se w16cid wp14">
   <w:endnote w:type="separator" w:id="-1">
     <w:p>
       <w:pPr>
@@ -11327,7 +11350,7 @@
 </file>
 
 <file path=word/footer1.xml><?xml version="1.0" encoding="utf-8"?>
-<w:ftr xmlns:wpc="http://schemas.microsoft.com/office/word/2010/wordprocessingCanvas" xmlns:cx="http://schemas.microsoft.com/office/drawing/2014/chartex" xmlns:cx1="http://schemas.microsoft.com/office/drawing/2015/9/8/chartex" xmlns:cx2="http://schemas.microsoft.com/office/drawing/2015/10/21/chartex" xmlns:cx3="http://schemas.microsoft.com/office/drawing/2016/5/9/chartex" xmlns:cx4="http://schemas.microsoft.com/office/drawing/2016/5/10/chartex" xmlns:cx5="http://schemas.microsoft.com/office/drawing/2016/5/11/chartex" xmlns:cx6="http://schemas.microsoft.com/office/drawing/2016/5/12/chartex" xmlns:cx7="http://schemas.microsoft.com/office/drawing/2016/5/13/chartex" xmlns:cx8="http://schemas.microsoft.com/office/drawing/2016/5/14/chartex" xmlns:mc="http://schemas.openxmlformats.org/markup-compatibility/2006" xmlns:aink="http://schemas.microsoft.com/office/drawing/2016/ink" xmlns:am3d="http://schemas.microsoft.com/office/drawing/2017/model3d" xmlns:o="urn:schemas-microsoft-com:office:office" xmlns:oel="http://schemas.microsoft.com/office/2019/extlst" xmlns:r="http://schemas.openxmlformats.org/officeDocument/2006/relationships" xmlns:m="http://schemas.openxmlformats.org/officeDocument/2006/math" xmlns:v="urn:schemas-microsoft-com:vml" xmlns:wp14="http://schemas.microsoft.com/office/word/2010/wordprocessingDrawing" xmlns:wp="http://schemas.openxmlformats.org/drawingml/2006/wordprocessingDrawing" xmlns:w10="urn:schemas-microsoft-com:office:word" xmlns:w="http://schemas.openxmlformats.org/wordprocessingml/2006/main" xmlns:w14="http://schemas.microsoft.com/office/word/2010/wordml" xmlns:w15="http://schemas.microsoft.com/office/word/2012/wordml" xmlns:w16cex="http://schemas.microsoft.com/office/word/2018/wordml/cex" xmlns:w16cid="http://schemas.microsoft.com/office/word/2016/wordml/cid" xmlns:w16="http://schemas.microsoft.com/office/word/2018/wordml" xmlns:w16du="http://schemas.microsoft.com/office/word/2023/wordml/word16du" xmlns:w16sdtdh="http://schemas.microsoft.com/office/word/2020/wordml/sdtdatahash" xmlns:w16sdtfl="http://schemas.microsoft.com/office/word/2024/wordml/sdtformatlock" xmlns:w16se="http://schemas.microsoft.com/office/word/2015/wordml/symex" xmlns:wpg="http://schemas.microsoft.com/office/word/2010/wordprocessingGroup" xmlns:wpi="http://schemas.microsoft.com/office/word/2010/wordprocessingInk" xmlns:wne="http://schemas.microsoft.com/office/word/2006/wordml" xmlns:wps="http://schemas.microsoft.com/office/word/2010/wordprocessingShape" mc:Ignorable="w14 w15 w16se w16cid w16 w16cex w16sdtdh w16sdtfl w16du wp14">
+<w:ftr xmlns:wpc="http://schemas.microsoft.com/office/word/2010/wordprocessingCanvas" xmlns:cx="http://schemas.microsoft.com/office/drawing/2014/chartex" xmlns:cx1="http://schemas.microsoft.com/office/drawing/2015/9/8/chartex" xmlns:cx2="http://schemas.microsoft.com/office/drawing/2015/10/21/chartex" xmlns:cx3="http://schemas.microsoft.com/office/drawing/2016/5/9/chartex" xmlns:cx4="http://schemas.microsoft.com/office/drawing/2016/5/10/chartex" xmlns:cx5="http://schemas.microsoft.com/office/drawing/2016/5/11/chartex" xmlns:cx6="http://schemas.microsoft.com/office/drawing/2016/5/12/chartex" xmlns:cx7="http://schemas.microsoft.com/office/drawing/2016/5/13/chartex" xmlns:cx8="http://schemas.microsoft.com/office/drawing/2016/5/14/chartex" xmlns:mc="http://schemas.openxmlformats.org/markup-compatibility/2006" xmlns:aink="http://schemas.microsoft.com/office/drawing/2016/ink" xmlns:am3d="http://schemas.microsoft.com/office/drawing/2017/model3d" xmlns:o="urn:schemas-microsoft-com:office:office" xmlns:r="http://schemas.openxmlformats.org/officeDocument/2006/relationships" xmlns:m="http://schemas.openxmlformats.org/officeDocument/2006/math" xmlns:v="urn:schemas-microsoft-com:vml" xmlns:wp14="http://schemas.microsoft.com/office/word/2010/wordprocessingDrawing" xmlns:wp="http://schemas.openxmlformats.org/drawingml/2006/wordprocessingDrawing" xmlns:w10="urn:schemas-microsoft-com:office:word" xmlns:w="http://schemas.openxmlformats.org/wordprocessingml/2006/main" xmlns:w14="http://schemas.microsoft.com/office/word/2010/wordml" xmlns:w15="http://schemas.microsoft.com/office/word/2012/wordml" xmlns:w16cid="http://schemas.microsoft.com/office/word/2016/wordml/cid" xmlns:w16se="http://schemas.microsoft.com/office/word/2015/wordml/symex" xmlns:wpg="http://schemas.microsoft.com/office/word/2010/wordprocessingGroup" xmlns:wpi="http://schemas.microsoft.com/office/word/2010/wordprocessingInk" xmlns:wne="http://schemas.microsoft.com/office/word/2006/wordml" xmlns:wps="http://schemas.microsoft.com/office/word/2010/wordprocessingShape" mc:Ignorable="w14 w15 w16se w16cid wp14">
   <w:p>
     <w:pPr>
       <w:widowControl w:val="0"/>
@@ -11534,7 +11557,7 @@
 </file>
 
 <file path=word/footnotes.xml><?xml version="1.0" encoding="utf-8"?>
-<w:footnotes xmlns:wpc="http://schemas.microsoft.com/office/word/2010/wordprocessingCanvas" xmlns:cx="http://schemas.microsoft.com/office/drawing/2014/chartex" xmlns:cx1="http://schemas.microsoft.com/office/drawing/2015/9/8/chartex" xmlns:cx2="http://schemas.microsoft.com/office/drawing/2015/10/21/chartex" xmlns:cx3="http://schemas.microsoft.com/office/drawing/2016/5/9/chartex" xmlns:cx4="http://schemas.microsoft.com/office/drawing/2016/5/10/chartex" xmlns:cx5="http://schemas.microsoft.com/office/drawing/2016/5/11/chartex" xmlns:cx6="http://schemas.microsoft.com/office/drawing/2016/5/12/chartex" xmlns:cx7="http://schemas.microsoft.com/office/drawing/2016/5/13/chartex" xmlns:cx8="http://schemas.microsoft.com/office/drawing/2016/5/14/chartex" xmlns:mc="http://schemas.openxmlformats.org/markup-compatibility/2006" xmlns:aink="http://schemas.microsoft.com/office/drawing/2016/ink" xmlns:am3d="http://schemas.microsoft.com/office/drawing/2017/model3d" xmlns:o="urn:schemas-microsoft-com:office:office" xmlns:oel="http://schemas.microsoft.com/office/2019/extlst" xmlns:r="http://schemas.openxmlformats.org/officeDocument/2006/relationships" xmlns:m="http://schemas.openxmlformats.org/officeDocument/2006/math" xmlns:v="urn:schemas-microsoft-com:vml" xmlns:wp14="http://schemas.microsoft.com/office/word/2010/wordprocessingDrawing" xmlns:wp="http://schemas.openxmlformats.org/drawingml/2006/wordprocessingDrawing" xmlns:w10="urn:schemas-microsoft-com:office:word" xmlns:w="http://schemas.openxmlformats.org/wordprocessingml/2006/main" xmlns:w14="http://schemas.microsoft.com/office/word/2010/wordml" xmlns:w15="http://schemas.microsoft.com/office/word/2012/wordml" xmlns:w16cex="http://schemas.microsoft.com/office/word/2018/wordml/cex" xmlns:w16cid="http://schemas.microsoft.com/office/word/2016/wordml/cid" xmlns:w16="http://schemas.microsoft.com/office/word/2018/wordml" xmlns:w16du="http://schemas.microsoft.com/office/word/2023/wordml/word16du" xmlns:w16sdtdh="http://schemas.microsoft.com/office/word/2020/wordml/sdtdatahash" xmlns:w16sdtfl="http://schemas.microsoft.com/office/word/2024/wordml/sdtformatlock" xmlns:w16se="http://schemas.microsoft.com/office/word/2015/wordml/symex" xmlns:wpg="http://schemas.microsoft.com/office/word/2010/wordprocessingGroup" xmlns:wpi="http://schemas.microsoft.com/office/word/2010/wordprocessingInk" xmlns:wne="http://schemas.microsoft.com/office/word/2006/wordml" xmlns:wps="http://schemas.microsoft.com/office/word/2010/wordprocessingShape" mc:Ignorable="w14 w15 w16se w16cid w16 w16cex w16sdtdh w16sdtfl w16du wp14">
+<w:footnotes xmlns:wpc="http://schemas.microsoft.com/office/word/2010/wordprocessingCanvas" xmlns:cx="http://schemas.microsoft.com/office/drawing/2014/chartex" xmlns:cx1="http://schemas.microsoft.com/office/drawing/2015/9/8/chartex" xmlns:cx2="http://schemas.microsoft.com/office/drawing/2015/10/21/chartex" xmlns:cx3="http://schemas.microsoft.com/office/drawing/2016/5/9/chartex" xmlns:cx4="http://schemas.microsoft.com/office/drawing/2016/5/10/chartex" xmlns:cx5="http://schemas.microsoft.com/office/drawing/2016/5/11/chartex" xmlns:cx6="http://schemas.microsoft.com/office/drawing/2016/5/12/chartex" xmlns:cx7="http://schemas.microsoft.com/office/drawing/2016/5/13/chartex" xmlns:cx8="http://schemas.microsoft.com/office/drawing/2016/5/14/chartex" xmlns:mc="http://schemas.openxmlformats.org/markup-compatibility/2006" xmlns:aink="http://schemas.microsoft.com/office/drawing/2016/ink" xmlns:am3d="http://schemas.microsoft.com/office/drawing/2017/model3d" xmlns:o="urn:schemas-microsoft-com:office:office" xmlns:r="http://schemas.openxmlformats.org/officeDocument/2006/relationships" xmlns:m="http://schemas.openxmlformats.org/officeDocument/2006/math" xmlns:v="urn:schemas-microsoft-com:vml" xmlns:wp14="http://schemas.microsoft.com/office/word/2010/wordprocessingDrawing" xmlns:wp="http://schemas.openxmlformats.org/drawingml/2006/wordprocessingDrawing" xmlns:w10="urn:schemas-microsoft-com:office:word" xmlns:w="http://schemas.openxmlformats.org/wordprocessingml/2006/main" xmlns:w14="http://schemas.microsoft.com/office/word/2010/wordml" xmlns:w15="http://schemas.microsoft.com/office/word/2012/wordml" xmlns:w16cid="http://schemas.microsoft.com/office/word/2016/wordml/cid" xmlns:w16se="http://schemas.microsoft.com/office/word/2015/wordml/symex" xmlns:wpg="http://schemas.microsoft.com/office/word/2010/wordprocessingGroup" xmlns:wpi="http://schemas.microsoft.com/office/word/2010/wordprocessingInk" xmlns:wne="http://schemas.microsoft.com/office/word/2006/wordml" xmlns:wps="http://schemas.microsoft.com/office/word/2010/wordprocessingShape" mc:Ignorable="w14 w15 w16se w16cid wp14">
   <w:footnote w:type="separator" w:id="-1">
     <w:p>
       <w:pPr>
@@ -11559,7 +11582,7 @@
 </file>
 
 <file path=word/numbering.xml><?xml version="1.0" encoding="utf-8"?>
-<w:numbering xmlns:wpc="http://schemas.microsoft.com/office/word/2010/wordprocessingCanvas" xmlns:cx="http://schemas.microsoft.com/office/drawing/2014/chartex" xmlns:cx1="http://schemas.microsoft.com/office/drawing/2015/9/8/chartex" xmlns:cx2="http://schemas.microsoft.com/office/drawing/2015/10/21/chartex" xmlns:cx3="http://schemas.microsoft.com/office/drawing/2016/5/9/chartex" xmlns:cx4="http://schemas.microsoft.com/office/drawing/2016/5/10/chartex" xmlns:cx5="http://schemas.microsoft.com/office/drawing/2016/5/11/chartex" xmlns:cx6="http://schemas.microsoft.com/office/drawing/2016/5/12/chartex" xmlns:cx7="http://schemas.microsoft.com/office/drawing/2016/5/13/chartex" xmlns:cx8="http://schemas.microsoft.com/office/drawing/2016/5/14/chartex" xmlns:mc="http://schemas.openxmlformats.org/markup-compatibility/2006" xmlns:aink="http://schemas.microsoft.com/office/drawing/2016/ink" xmlns:am3d="http://schemas.microsoft.com/office/drawing/2017/model3d" xmlns:o="urn:schemas-microsoft-com:office:office" xmlns:oel="http://schemas.microsoft.com/office/2019/extlst" xmlns:r="http://schemas.openxmlformats.org/officeDocument/2006/relationships" xmlns:m="http://schemas.openxmlformats.org/officeDocument/2006/math" xmlns:v="urn:schemas-microsoft-com:vml" xmlns:wp14="http://schemas.microsoft.com/office/word/2010/wordprocessingDrawing" xmlns:wp="http://schemas.openxmlformats.org/drawingml/2006/wordprocessingDrawing" xmlns:w10="urn:schemas-microsoft-com:office:word" xmlns:w="http://schemas.openxmlformats.org/wordprocessingml/2006/main" xmlns:w14="http://schemas.microsoft.com/office/word/2010/wordml" xmlns:w15="http://schemas.microsoft.com/office/word/2012/wordml" xmlns:w16cex="http://schemas.microsoft.com/office/word/2018/wordml/cex" xmlns:w16cid="http://schemas.microsoft.com/office/word/2016/wordml/cid" xmlns:w16="http://schemas.microsoft.com/office/word/2018/wordml" xmlns:w16du="http://schemas.microsoft.com/office/word/2023/wordml/word16du" xmlns:w16sdtdh="http://schemas.microsoft.com/office/word/2020/wordml/sdtdatahash" xmlns:w16sdtfl="http://schemas.microsoft.com/office/word/2024/wordml/sdtformatlock" xmlns:w16se="http://schemas.microsoft.com/office/word/2015/wordml/symex" xmlns:wpg="http://schemas.microsoft.com/office/word/2010/wordprocessingGroup" xmlns:wpi="http://schemas.microsoft.com/office/word/2010/wordprocessingInk" xmlns:wne="http://schemas.microsoft.com/office/word/2006/wordml" xmlns:wps="http://schemas.microsoft.com/office/word/2010/wordprocessingShape" mc:Ignorable="w14 w15 w16se w16cid w16 w16cex w16sdtdh w16sdtfl w16du wp14">
+<w:numbering xmlns:wpc="http://schemas.microsoft.com/office/word/2010/wordprocessingCanvas" xmlns:cx="http://schemas.microsoft.com/office/drawing/2014/chartex" xmlns:cx1="http://schemas.microsoft.com/office/drawing/2015/9/8/chartex" xmlns:cx2="http://schemas.microsoft.com/office/drawing/2015/10/21/chartex" xmlns:cx3="http://schemas.microsoft.com/office/drawing/2016/5/9/chartex" xmlns:cx4="http://schemas.microsoft.com/office/drawing/2016/5/10/chartex" xmlns:cx5="http://schemas.microsoft.com/office/drawing/2016/5/11/chartex" xmlns:cx6="http://schemas.microsoft.com/office/drawing/2016/5/12/chartex" xmlns:cx7="http://schemas.microsoft.com/office/drawing/2016/5/13/chartex" xmlns:cx8="http://schemas.microsoft.com/office/drawing/2016/5/14/chartex" xmlns:mc="http://schemas.openxmlformats.org/markup-compatibility/2006" xmlns:aink="http://schemas.microsoft.com/office/drawing/2016/ink" xmlns:am3d="http://schemas.microsoft.com/office/drawing/2017/model3d" xmlns:o="urn:schemas-microsoft-com:office:office" xmlns:r="http://schemas.openxmlformats.org/officeDocument/2006/relationships" xmlns:m="http://schemas.openxmlformats.org/officeDocument/2006/math" xmlns:v="urn:schemas-microsoft-com:vml" xmlns:wp14="http://schemas.microsoft.com/office/word/2010/wordprocessingDrawing" xmlns:wp="http://schemas.openxmlformats.org/drawingml/2006/wordprocessingDrawing" xmlns:w10="urn:schemas-microsoft-com:office:word" xmlns:w="http://schemas.openxmlformats.org/wordprocessingml/2006/main" xmlns:w14="http://schemas.microsoft.com/office/word/2010/wordml" xmlns:w15="http://schemas.microsoft.com/office/word/2012/wordml" xmlns:w16cid="http://schemas.microsoft.com/office/word/2016/wordml/cid" xmlns:w16se="http://schemas.microsoft.com/office/word/2015/wordml/symex" xmlns:wpg="http://schemas.microsoft.com/office/word/2010/wordprocessingGroup" xmlns:wpi="http://schemas.microsoft.com/office/word/2010/wordprocessingInk" xmlns:wne="http://schemas.microsoft.com/office/word/2006/wordml" xmlns:wps="http://schemas.microsoft.com/office/word/2010/wordprocessingShape" mc:Ignorable="w14 w15 w16se w16cid wp14">
   <w:abstractNum w:abstractNumId="0" w15:restartNumberingAfterBreak="0">
     <w:nsid w:val="08100D2D"/>
     <w:multiLevelType w:val="hybridMultilevel"/>
@@ -12627,41 +12650,41 @@
       </w:pPr>
     </w:lvl>
   </w:abstractNum>
-  <w:num w:numId="1" w16cid:durableId="637807532">
+  <w:num w:numId="1">
     <w:abstractNumId w:val="8"/>
   </w:num>
-  <w:num w:numId="2" w16cid:durableId="57099775">
+  <w:num w:numId="2">
     <w:abstractNumId w:val="6"/>
   </w:num>
-  <w:num w:numId="3" w16cid:durableId="1978215236">
+  <w:num w:numId="3">
     <w:abstractNumId w:val="2"/>
   </w:num>
-  <w:num w:numId="4" w16cid:durableId="933517778">
+  <w:num w:numId="4">
     <w:abstractNumId w:val="4"/>
   </w:num>
-  <w:num w:numId="5" w16cid:durableId="1192650359">
+  <w:num w:numId="5">
     <w:abstractNumId w:val="7"/>
   </w:num>
-  <w:num w:numId="6" w16cid:durableId="429787818">
+  <w:num w:numId="6">
     <w:abstractNumId w:val="1"/>
   </w:num>
-  <w:num w:numId="7" w16cid:durableId="1706565517">
+  <w:num w:numId="7">
     <w:abstractNumId w:val="9"/>
   </w:num>
-  <w:num w:numId="8" w16cid:durableId="1229417881">
+  <w:num w:numId="8">
     <w:abstractNumId w:val="3"/>
   </w:num>
-  <w:num w:numId="9" w16cid:durableId="683363648">
+  <w:num w:numId="9">
     <w:abstractNumId w:val="0"/>
   </w:num>
-  <w:num w:numId="10" w16cid:durableId="265966065">
+  <w:num w:numId="10">
     <w:abstractNumId w:val="5"/>
   </w:num>
 </w:numbering>
 </file>
 
 <file path=word/styles.xml><?xml version="1.0" encoding="utf-8"?>
-<w:styles xmlns:mc="http://schemas.openxmlformats.org/markup-compatibility/2006" xmlns:r="http://schemas.openxmlformats.org/officeDocument/2006/relationships" xmlns:w="http://schemas.openxmlformats.org/wordprocessingml/2006/main" xmlns:w14="http://schemas.microsoft.com/office/word/2010/wordml" xmlns:w15="http://schemas.microsoft.com/office/word/2012/wordml" xmlns:w16cex="http://schemas.microsoft.com/office/word/2018/wordml/cex" xmlns:w16cid="http://schemas.microsoft.com/office/word/2016/wordml/cid" xmlns:w16="http://schemas.microsoft.com/office/word/2018/wordml" xmlns:w16du="http://schemas.microsoft.com/office/word/2023/wordml/word16du" xmlns:w16sdtdh="http://schemas.microsoft.com/office/word/2020/wordml/sdtdatahash" xmlns:w16sdtfl="http://schemas.microsoft.com/office/word/2024/wordml/sdtformatlock" xmlns:w16se="http://schemas.microsoft.com/office/word/2015/wordml/symex" mc:Ignorable="w14 w15 w16se w16cid w16 w16cex w16sdtdh w16sdtfl w16du">
+<w:styles xmlns:mc="http://schemas.openxmlformats.org/markup-compatibility/2006" xmlns:r="http://schemas.openxmlformats.org/officeDocument/2006/relationships" xmlns:w="http://schemas.openxmlformats.org/wordprocessingml/2006/main" xmlns:w14="http://schemas.microsoft.com/office/word/2010/wordml" xmlns:w15="http://schemas.microsoft.com/office/word/2012/wordml" xmlns:w16cid="http://schemas.microsoft.com/office/word/2016/wordml/cid" xmlns:w16se="http://schemas.microsoft.com/office/word/2015/wordml/symex" mc:Ignorable="w14 w15 w16se w16cid">
   <w:docDefaults>
     <w:rPrDefault>
       <w:rPr>
@@ -12677,7 +12700,7 @@
       </w:pPr>
     </w:pPrDefault>
   </w:docDefaults>
-  <w:latentStyles w:defLockedState="0" w:defUIPriority="99" w:defSemiHidden="0" w:defUnhideWhenUsed="0" w:defQFormat="0" w:count="376">
+  <w:latentStyles w:defLockedState="0" w:defUIPriority="99" w:defSemiHidden="0" w:defUnhideWhenUsed="0" w:defQFormat="0" w:count="375">
     <w:lsdException w:name="Normal" w:uiPriority="0" w:qFormat="1"/>
     <w:lsdException w:name="heading 1" w:uiPriority="9" w:qFormat="1"/>
     <w:lsdException w:name="heading 2" w:semiHidden="1" w:uiPriority="9" w:unhideWhenUsed="1" w:qFormat="1"/>
@@ -13053,18 +13076,17 @@
     <w:lsdException w:name="Smart Hyperlink" w:semiHidden="1" w:unhideWhenUsed="1"/>
     <w:lsdException w:name="Hashtag" w:semiHidden="1" w:unhideWhenUsed="1"/>
     <w:lsdException w:name="Unresolved Mention" w:semiHidden="1" w:unhideWhenUsed="1"/>
-    <w:lsdException w:name="Smart Link" w:semiHidden="1" w:unhideWhenUsed="1"/>
   </w:latentStyles>
-  <w:style w:type="paragraph" w:default="1" w:styleId="Binhthng">
+  <w:style w:type="paragraph" w:default="1" w:styleId="Normal">
     <w:name w:val="Normal"/>
     <w:qFormat/>
     <w:rsid w:val="009A273A"/>
   </w:style>
-  <w:style w:type="paragraph" w:styleId="u1">
+  <w:style w:type="paragraph" w:styleId="Heading1">
     <w:name w:val="heading 1"/>
-    <w:basedOn w:val="Binhthng"/>
-    <w:next w:val="Binhthng"/>
-    <w:link w:val="u1Char"/>
+    <w:basedOn w:val="Normal"/>
+    <w:next w:val="Normal"/>
+    <w:link w:val="Heading1Char"/>
     <w:uiPriority w:val="9"/>
     <w:qFormat/>
     <w:rsid w:val="001A20C1"/>
@@ -13082,11 +13104,11 @@
       <w:szCs w:val="32"/>
     </w:rPr>
   </w:style>
-  <w:style w:type="paragraph" w:styleId="u2">
+  <w:style w:type="paragraph" w:styleId="Heading2">
     <w:name w:val="heading 2"/>
-    <w:basedOn w:val="Binhthng"/>
-    <w:next w:val="Binhthng"/>
-    <w:link w:val="u2Char"/>
+    <w:basedOn w:val="Normal"/>
+    <w:next w:val="Normal"/>
+    <w:link w:val="Heading2Char"/>
     <w:uiPriority w:val="9"/>
     <w:unhideWhenUsed/>
     <w:qFormat/>
@@ -13104,11 +13126,11 @@
       <w:szCs w:val="26"/>
     </w:rPr>
   </w:style>
-  <w:style w:type="paragraph" w:styleId="u3">
+  <w:style w:type="paragraph" w:styleId="Heading3">
     <w:name w:val="heading 3"/>
-    <w:basedOn w:val="Binhthng"/>
-    <w:next w:val="Binhthng"/>
-    <w:link w:val="u3Char"/>
+    <w:basedOn w:val="Normal"/>
+    <w:next w:val="Normal"/>
+    <w:link w:val="Heading3Char"/>
     <w:uiPriority w:val="9"/>
     <w:unhideWhenUsed/>
     <w:qFormat/>
@@ -13127,11 +13149,11 @@
       <w:szCs w:val="24"/>
     </w:rPr>
   </w:style>
-  <w:style w:type="paragraph" w:styleId="u4">
+  <w:style w:type="paragraph" w:styleId="Heading4">
     <w:name w:val="heading 4"/>
-    <w:basedOn w:val="Binhthng"/>
-    <w:next w:val="Binhthng"/>
-    <w:link w:val="u4Char"/>
+    <w:basedOn w:val="Normal"/>
+    <w:next w:val="Normal"/>
+    <w:link w:val="Heading4Char"/>
     <w:uiPriority w:val="9"/>
     <w:unhideWhenUsed/>
     <w:qFormat/>
@@ -13149,11 +13171,11 @@
       <w:iCs/>
     </w:rPr>
   </w:style>
-  <w:style w:type="paragraph" w:styleId="u5">
+  <w:style w:type="paragraph" w:styleId="Heading5">
     <w:name w:val="heading 5"/>
-    <w:basedOn w:val="Binhthng"/>
-    <w:next w:val="Binhthng"/>
-    <w:link w:val="u5Char"/>
+    <w:basedOn w:val="Normal"/>
+    <w:next w:val="Normal"/>
+    <w:link w:val="Heading5Char"/>
     <w:uiPriority w:val="9"/>
     <w:unhideWhenUsed/>
     <w:qFormat/>
@@ -13170,11 +13192,11 @@
       <w:color w:val="2E74B5" w:themeColor="accent1" w:themeShade="BF"/>
     </w:rPr>
   </w:style>
-  <w:style w:type="paragraph" w:styleId="u6">
+  <w:style w:type="paragraph" w:styleId="Heading6">
     <w:name w:val="heading 6"/>
-    <w:basedOn w:val="Binhthng"/>
-    <w:next w:val="Binhthng"/>
-    <w:link w:val="u6Char"/>
+    <w:basedOn w:val="Normal"/>
+    <w:next w:val="Normal"/>
+    <w:link w:val="Heading6Char"/>
     <w:uiPriority w:val="9"/>
     <w:semiHidden/>
     <w:unhideWhenUsed/>
@@ -13191,11 +13213,11 @@
       <w:color w:val="1F4D78" w:themeColor="accent1" w:themeShade="7F"/>
     </w:rPr>
   </w:style>
-  <w:style w:type="paragraph" w:styleId="u7">
+  <w:style w:type="paragraph" w:styleId="Heading7">
     <w:name w:val="heading 7"/>
-    <w:basedOn w:val="Binhthng"/>
-    <w:next w:val="Binhthng"/>
-    <w:link w:val="u7Char"/>
+    <w:basedOn w:val="Normal"/>
+    <w:next w:val="Normal"/>
+    <w:link w:val="Heading7Char"/>
     <w:uiPriority w:val="9"/>
     <w:semiHidden/>
     <w:unhideWhenUsed/>
@@ -13214,13 +13236,13 @@
       <w:color w:val="1F4D78" w:themeColor="accent1" w:themeShade="7F"/>
     </w:rPr>
   </w:style>
-  <w:style w:type="character" w:default="1" w:styleId="Phngmcinhcuaoanvn">
+  <w:style w:type="character" w:default="1" w:styleId="DefaultParagraphFont">
     <w:name w:val="Default Paragraph Font"/>
     <w:uiPriority w:val="1"/>
     <w:semiHidden/>
     <w:unhideWhenUsed/>
   </w:style>
-  <w:style w:type="table" w:default="1" w:styleId="BangThngthng">
+  <w:style w:type="table" w:default="1" w:styleId="TableNormal">
     <w:name w:val="Normal Table"/>
     <w:uiPriority w:val="99"/>
     <w:semiHidden/>
@@ -13235,16 +13257,16 @@
       </w:tblCellMar>
     </w:tblPr>
   </w:style>
-  <w:style w:type="numbering" w:default="1" w:styleId="Khngco">
+  <w:style w:type="numbering" w:default="1" w:styleId="NoList">
     <w:name w:val="No List"/>
     <w:uiPriority w:val="99"/>
     <w:semiHidden/>
     <w:unhideWhenUsed/>
   </w:style>
-  <w:style w:type="paragraph" w:styleId="Tiu">
+  <w:style w:type="paragraph" w:styleId="Title">
     <w:name w:val="Title"/>
-    <w:basedOn w:val="Binhthng"/>
-    <w:next w:val="Binhthng"/>
+    <w:basedOn w:val="Normal"/>
+    <w:next w:val="Normal"/>
     <w:uiPriority w:val="10"/>
     <w:qFormat/>
     <w:pPr>
@@ -13258,9 +13280,9 @@
       <w:szCs w:val="72"/>
     </w:rPr>
   </w:style>
-  <w:style w:type="table" w:styleId="LiBang">
+  <w:style w:type="table" w:styleId="TableGrid">
     <w:name w:val="Table Grid"/>
-    <w:basedOn w:val="BangThngthng"/>
+    <w:basedOn w:val="TableNormal"/>
     <w:rsid w:val="00C87F08"/>
     <w:pPr>
       <w:spacing w:after="0" w:line="240" w:lineRule="auto"/>
@@ -13276,11 +13298,11 @@
       </w:tblBorders>
     </w:tblPr>
   </w:style>
-  <w:style w:type="paragraph" w:styleId="oancuaDanhsach">
+  <w:style w:type="paragraph" w:styleId="ListParagraph">
     <w:name w:val="List Paragraph"/>
     <w:aliases w:val="lp1,List Paragraph1,List Paragraph11,Steps,Bullet 1,bullet"/>
-    <w:basedOn w:val="Binhthng"/>
-    <w:link w:val="oancuaDanhsachChar"/>
+    <w:basedOn w:val="Normal"/>
+    <w:link w:val="ListParagraphChar"/>
     <w:uiPriority w:val="34"/>
     <w:qFormat/>
     <w:rsid w:val="00A0058F"/>
@@ -13289,10 +13311,10 @@
       <w:contextualSpacing/>
     </w:pPr>
   </w:style>
-  <w:style w:type="character" w:customStyle="1" w:styleId="u1Char">
-    <w:name w:val="Đầu đề 1 Char"/>
-    <w:basedOn w:val="Phngmcinhcuaoanvn"/>
-    <w:link w:val="u1"/>
+  <w:style w:type="character" w:customStyle="1" w:styleId="Heading1Char">
+    <w:name w:val="Heading 1 Char"/>
+    <w:basedOn w:val="DefaultParagraphFont"/>
+    <w:link w:val="Heading1"/>
     <w:uiPriority w:val="9"/>
     <w:rsid w:val="001A20C1"/>
     <w:rPr>
@@ -13303,10 +13325,10 @@
       <w:szCs w:val="32"/>
     </w:rPr>
   </w:style>
-  <w:style w:type="character" w:customStyle="1" w:styleId="u2Char">
-    <w:name w:val="Đầu đề 2 Char"/>
-    <w:basedOn w:val="Phngmcinhcuaoanvn"/>
-    <w:link w:val="u2"/>
+  <w:style w:type="character" w:customStyle="1" w:styleId="Heading2Char">
+    <w:name w:val="Heading 2 Char"/>
+    <w:basedOn w:val="DefaultParagraphFont"/>
+    <w:link w:val="Heading2"/>
     <w:uiPriority w:val="9"/>
     <w:rsid w:val="001A20C1"/>
     <w:rPr>
@@ -13316,10 +13338,10 @@
       <w:szCs w:val="26"/>
     </w:rPr>
   </w:style>
-  <w:style w:type="character" w:customStyle="1" w:styleId="u3Char">
-    <w:name w:val="Đầu đề 3 Char"/>
-    <w:basedOn w:val="Phngmcinhcuaoanvn"/>
-    <w:link w:val="u3"/>
+  <w:style w:type="character" w:customStyle="1" w:styleId="Heading3Char">
+    <w:name w:val="Heading 3 Char"/>
+    <w:basedOn w:val="DefaultParagraphFont"/>
+    <w:link w:val="Heading3"/>
     <w:uiPriority w:val="9"/>
     <w:rsid w:val="00922652"/>
     <w:rPr>
@@ -13332,7 +13354,7 @@
   </w:style>
   <w:style w:type="table" w:customStyle="1" w:styleId="Kiu2">
     <w:name w:val="Kiểu2"/>
-    <w:basedOn w:val="BangThngthng"/>
+    <w:basedOn w:val="TableNormal"/>
     <w:uiPriority w:val="99"/>
     <w:rsid w:val="00922652"/>
     <w:pPr>
@@ -13370,9 +13392,9 @@
       </w:tcPr>
     </w:tblStylePr>
   </w:style>
-  <w:style w:type="character" w:styleId="Siuktni">
+  <w:style w:type="character" w:styleId="Hyperlink">
     <w:name w:val="Hyperlink"/>
-    <w:basedOn w:val="Phngmcinhcuaoanvn"/>
+    <w:basedOn w:val="DefaultParagraphFont"/>
     <w:uiPriority w:val="99"/>
     <w:unhideWhenUsed/>
     <w:rsid w:val="00922652"/>
@@ -13383,7 +13405,7 @@
   </w:style>
   <w:style w:type="paragraph" w:customStyle="1" w:styleId="bang">
     <w:name w:val="bang"/>
-    <w:basedOn w:val="Binhthng"/>
+    <w:basedOn w:val="Normal"/>
     <w:autoRedefine/>
     <w:rsid w:val="006D4C3E"/>
     <w:pPr>
@@ -13401,7 +13423,7 @@
   </w:style>
   <w:style w:type="paragraph" w:customStyle="1" w:styleId="Bangheader">
     <w:name w:val="Bangheader"/>
-    <w:basedOn w:val="u7"/>
+    <w:basedOn w:val="Heading7"/>
     <w:autoRedefine/>
     <w:rsid w:val="006D4C3E"/>
     <w:pPr>
@@ -13423,10 +13445,10 @@
       <w:lang w:val="en-US" w:eastAsia="ja-JP"/>
     </w:rPr>
   </w:style>
-  <w:style w:type="character" w:customStyle="1" w:styleId="u7Char">
-    <w:name w:val="Đầu đề 7 Char"/>
-    <w:basedOn w:val="Phngmcinhcuaoanvn"/>
-    <w:link w:val="u7"/>
+  <w:style w:type="character" w:customStyle="1" w:styleId="Heading7Char">
+    <w:name w:val="Heading 7 Char"/>
+    <w:basedOn w:val="DefaultParagraphFont"/>
+    <w:link w:val="Heading7"/>
     <w:uiPriority w:val="9"/>
     <w:semiHidden/>
     <w:rsid w:val="006D4C3E"/>
@@ -13437,10 +13459,10 @@
       <w:color w:val="1F4D78" w:themeColor="accent1" w:themeShade="7F"/>
     </w:rPr>
   </w:style>
-  <w:style w:type="character" w:customStyle="1" w:styleId="u4Char">
-    <w:name w:val="Đầu đề 4 Char"/>
-    <w:basedOn w:val="Phngmcinhcuaoanvn"/>
-    <w:link w:val="u4"/>
+  <w:style w:type="character" w:customStyle="1" w:styleId="Heading4Char">
+    <w:name w:val="Heading 4 Char"/>
+    <w:basedOn w:val="DefaultParagraphFont"/>
+    <w:link w:val="Heading4"/>
     <w:uiPriority w:val="9"/>
     <w:rsid w:val="001A20C1"/>
     <w:rPr>
@@ -13450,17 +13472,17 @@
       <w:iCs/>
     </w:rPr>
   </w:style>
-  <w:style w:type="character" w:customStyle="1" w:styleId="oancuaDanhsachChar">
-    <w:name w:val="Đoạn của Danh sách Char"/>
+  <w:style w:type="character" w:customStyle="1" w:styleId="ListParagraphChar">
+    <w:name w:val="List Paragraph Char"/>
     <w:aliases w:val="lp1 Char,List Paragraph1 Char,List Paragraph11 Char,Steps Char,Bullet 1 Char,bullet Char"/>
-    <w:basedOn w:val="Phngmcinhcuaoanvn"/>
-    <w:link w:val="oancuaDanhsach"/>
+    <w:basedOn w:val="DefaultParagraphFont"/>
+    <w:link w:val="ListParagraph"/>
     <w:uiPriority w:val="34"/>
     <w:rsid w:val="001F6E50"/>
   </w:style>
   <w:style w:type="character" w:customStyle="1" w:styleId="fontstyle01">
     <w:name w:val="fontstyle01"/>
-    <w:basedOn w:val="Phngmcinhcuaoanvn"/>
+    <w:basedOn w:val="DefaultParagraphFont"/>
     <w:rsid w:val="00CB507B"/>
     <w:rPr>
       <w:rFonts w:ascii="Helvetica" w:hAnsi="Helvetica" w:hint="default"/>
@@ -13473,10 +13495,10 @@
       <w:szCs w:val="14"/>
     </w:rPr>
   </w:style>
-  <w:style w:type="paragraph" w:styleId="Chuthich">
+  <w:style w:type="paragraph" w:styleId="Caption">
     <w:name w:val="caption"/>
-    <w:basedOn w:val="Binhthng"/>
-    <w:next w:val="Binhthng"/>
+    <w:basedOn w:val="Normal"/>
+    <w:next w:val="Normal"/>
     <w:uiPriority w:val="35"/>
     <w:unhideWhenUsed/>
     <w:qFormat/>
@@ -13495,10 +13517,10 @@
       <w:lang w:eastAsia="en-GB"/>
     </w:rPr>
   </w:style>
-  <w:style w:type="paragraph" w:styleId="utrang">
+  <w:style w:type="paragraph" w:styleId="Header">
     <w:name w:val="header"/>
-    <w:basedOn w:val="Binhthng"/>
-    <w:link w:val="utrangChar"/>
+    <w:basedOn w:val="Normal"/>
+    <w:link w:val="HeaderChar"/>
     <w:uiPriority w:val="99"/>
     <w:unhideWhenUsed/>
     <w:rsid w:val="00ED72BA"/>
@@ -13510,17 +13532,17 @@
       <w:spacing w:after="0" w:line="240" w:lineRule="auto"/>
     </w:pPr>
   </w:style>
-  <w:style w:type="character" w:customStyle="1" w:styleId="utrangChar">
-    <w:name w:val="Đầu trang Char"/>
-    <w:basedOn w:val="Phngmcinhcuaoanvn"/>
-    <w:link w:val="utrang"/>
+  <w:style w:type="character" w:customStyle="1" w:styleId="HeaderChar">
+    <w:name w:val="Header Char"/>
+    <w:basedOn w:val="DefaultParagraphFont"/>
+    <w:link w:val="Header"/>
     <w:uiPriority w:val="99"/>
     <w:rsid w:val="00ED72BA"/>
   </w:style>
-  <w:style w:type="paragraph" w:styleId="Chntrang">
+  <w:style w:type="paragraph" w:styleId="Footer">
     <w:name w:val="footer"/>
-    <w:basedOn w:val="Binhthng"/>
-    <w:link w:val="ChntrangChar"/>
+    <w:basedOn w:val="Normal"/>
+    <w:link w:val="FooterChar"/>
     <w:uiPriority w:val="99"/>
     <w:unhideWhenUsed/>
     <w:rsid w:val="00ED72BA"/>
@@ -13532,16 +13554,16 @@
       <w:spacing w:after="0" w:line="240" w:lineRule="auto"/>
     </w:pPr>
   </w:style>
-  <w:style w:type="character" w:customStyle="1" w:styleId="ChntrangChar">
-    <w:name w:val="Chân trang Char"/>
-    <w:basedOn w:val="Phngmcinhcuaoanvn"/>
-    <w:link w:val="Chntrang"/>
+  <w:style w:type="character" w:customStyle="1" w:styleId="FooterChar">
+    <w:name w:val="Footer Char"/>
+    <w:basedOn w:val="DefaultParagraphFont"/>
+    <w:link w:val="Footer"/>
     <w:uiPriority w:val="99"/>
     <w:rsid w:val="00ED72BA"/>
   </w:style>
   <w:style w:type="paragraph" w:customStyle="1" w:styleId="template">
     <w:name w:val="template"/>
-    <w:basedOn w:val="Binhthng"/>
+    <w:basedOn w:val="Normal"/>
     <w:rsid w:val="00BB79D7"/>
     <w:pPr>
       <w:spacing w:after="0" w:line="240" w:lineRule="exact"/>
@@ -13555,7 +13577,7 @@
   </w:style>
   <w:style w:type="paragraph" w:customStyle="1" w:styleId="TableText">
     <w:name w:val="Table Text"/>
-    <w:basedOn w:val="Binhthng"/>
+    <w:basedOn w:val="Normal"/>
     <w:rsid w:val="00EF0EE9"/>
     <w:pPr>
       <w:spacing w:before="40" w:after="40" w:line="240" w:lineRule="auto"/>
@@ -13567,9 +13589,9 @@
       <w:lang w:val="en-US"/>
     </w:rPr>
   </w:style>
-  <w:style w:type="paragraph" w:styleId="Danhsach">
+  <w:style w:type="paragraph" w:styleId="List">
     <w:name w:val="List"/>
-    <w:basedOn w:val="Binhthng"/>
+    <w:basedOn w:val="Normal"/>
     <w:semiHidden/>
     <w:rsid w:val="00DC1306"/>
     <w:pPr>
@@ -13596,7 +13618,7 @@
   </w:style>
   <w:style w:type="paragraph" w:customStyle="1" w:styleId="TableHead">
     <w:name w:val="Table Head"/>
-    <w:basedOn w:val="u3"/>
+    <w:basedOn w:val="Heading3"/>
     <w:next w:val="TableText"/>
     <w:rsid w:val="008D09B0"/>
     <w:pPr>
@@ -13613,10 +13635,10 @@
       <w:lang w:val="en-US"/>
     </w:rPr>
   </w:style>
-  <w:style w:type="character" w:customStyle="1" w:styleId="u5Char">
-    <w:name w:val="Đầu đề 5 Char"/>
-    <w:basedOn w:val="Phngmcinhcuaoanvn"/>
-    <w:link w:val="u5"/>
+  <w:style w:type="character" w:customStyle="1" w:styleId="Heading5Char">
+    <w:name w:val="Heading 5 Char"/>
+    <w:basedOn w:val="DefaultParagraphFont"/>
+    <w:link w:val="Heading5"/>
     <w:uiPriority w:val="9"/>
     <w:rsid w:val="00FE5691"/>
     <w:rPr>
@@ -13627,7 +13649,7 @@
   </w:style>
   <w:style w:type="paragraph" w:customStyle="1" w:styleId="Normalunindented">
     <w:name w:val="Normal (unindented)"/>
-    <w:basedOn w:val="Binhthng"/>
+    <w:basedOn w:val="Normal"/>
     <w:qFormat/>
     <w:rsid w:val="00D70464"/>
     <w:pPr>
@@ -13663,9 +13685,9 @@
       <w:ind w:hanging="990"/>
     </w:pPr>
   </w:style>
-  <w:style w:type="paragraph" w:styleId="ThngthngWeb">
+  <w:style w:type="paragraph" w:styleId="NormalWeb">
     <w:name w:val="Normal (Web)"/>
-    <w:basedOn w:val="Binhthng"/>
+    <w:basedOn w:val="Normal"/>
     <w:uiPriority w:val="99"/>
     <w:semiHidden/>
     <w:unhideWhenUsed/>
@@ -13682,8 +13704,8 @@
   </w:style>
   <w:style w:type="paragraph" w:customStyle="1" w:styleId="Fig-Graphic">
     <w:name w:val="Fig-Graphic"/>
-    <w:basedOn w:val="Binhthng"/>
-    <w:next w:val="Binhthng"/>
+    <w:basedOn w:val="Normal"/>
+    <w:next w:val="Normal"/>
     <w:qFormat/>
     <w:rsid w:val="00F42ACB"/>
     <w:pPr>
@@ -13707,7 +13729,7 @@
   </w:style>
   <w:style w:type="paragraph" w:customStyle="1" w:styleId="TableTextsmall">
     <w:name w:val="Table Text small"/>
-    <w:basedOn w:val="Binhthng"/>
+    <w:basedOn w:val="Normal"/>
     <w:rsid w:val="00F42ACB"/>
     <w:pPr>
       <w:spacing w:after="20" w:line="240" w:lineRule="exact"/>
@@ -13722,7 +13744,7 @@
   </w:style>
   <w:style w:type="paragraph" w:customStyle="1" w:styleId="level5">
     <w:name w:val="level 5"/>
-    <w:basedOn w:val="Binhthng"/>
+    <w:basedOn w:val="Normal"/>
     <w:rsid w:val="001D3B23"/>
     <w:pPr>
       <w:tabs>
@@ -13740,7 +13762,7 @@
   </w:style>
   <w:style w:type="paragraph" w:customStyle="1" w:styleId="level4text">
     <w:name w:val="level 4 text"/>
-    <w:basedOn w:val="Binhthng"/>
+    <w:basedOn w:val="Normal"/>
     <w:rsid w:val="001D3B23"/>
     <w:pPr>
       <w:spacing w:after="120" w:line="240" w:lineRule="exact"/>
@@ -13753,10 +13775,10 @@
       <w:lang w:val="en-US"/>
     </w:rPr>
   </w:style>
-  <w:style w:type="paragraph" w:styleId="ThnVnban">
+  <w:style w:type="paragraph" w:styleId="BodyText">
     <w:name w:val="Body Text"/>
-    <w:basedOn w:val="Binhthng"/>
-    <w:link w:val="ThnVnbanChar"/>
+    <w:basedOn w:val="Normal"/>
+    <w:link w:val="BodyTextChar"/>
     <w:rsid w:val="00ED2706"/>
     <w:pPr>
       <w:spacing w:after="60" w:line="240" w:lineRule="auto"/>
@@ -13769,10 +13791,10 @@
       <w:lang w:val="en-AU"/>
     </w:rPr>
   </w:style>
-  <w:style w:type="character" w:customStyle="1" w:styleId="ThnVnbanChar">
-    <w:name w:val="Thân Văn bản Char"/>
-    <w:basedOn w:val="Phngmcinhcuaoanvn"/>
-    <w:link w:val="ThnVnban"/>
+  <w:style w:type="character" w:customStyle="1" w:styleId="BodyTextChar">
+    <w:name w:val="Body Text Char"/>
+    <w:basedOn w:val="DefaultParagraphFont"/>
+    <w:link w:val="BodyText"/>
     <w:rsid w:val="00ED2706"/>
     <w:rPr>
       <w:rFonts w:ascii="Times New Roman" w:eastAsia="Times New Roman" w:hAnsi="Times New Roman" w:cs="Times New Roman"/>
@@ -13783,8 +13805,8 @@
   </w:style>
   <w:style w:type="paragraph" w:customStyle="1" w:styleId="InfoBlue">
     <w:name w:val="InfoBlue"/>
-    <w:basedOn w:val="Binhthng"/>
-    <w:next w:val="ThnVnban"/>
+    <w:basedOn w:val="Normal"/>
+    <w:next w:val="BodyText"/>
     <w:autoRedefine/>
     <w:rsid w:val="00ED2706"/>
     <w:pPr>
@@ -13803,7 +13825,7 @@
   </w:style>
   <w:style w:type="character" w:styleId="FollowedHyperlink">
     <w:name w:val="FollowedHyperlink"/>
-    <w:basedOn w:val="Phngmcinhcuaoanvn"/>
+    <w:basedOn w:val="DefaultParagraphFont"/>
     <w:uiPriority w:val="99"/>
     <w:semiHidden/>
     <w:unhideWhenUsed/>
@@ -13813,10 +13835,10 @@
       <w:u w:val="single"/>
     </w:rPr>
   </w:style>
-  <w:style w:type="paragraph" w:styleId="uMucluc">
+  <w:style w:type="paragraph" w:styleId="TOCHeading">
     <w:name w:val="TOC Heading"/>
-    <w:basedOn w:val="u1"/>
-    <w:next w:val="Binhthng"/>
+    <w:basedOn w:val="Heading1"/>
+    <w:next w:val="Normal"/>
     <w:uiPriority w:val="39"/>
     <w:unhideWhenUsed/>
     <w:qFormat/>
@@ -13830,10 +13852,10 @@
       <w:lang w:val="en-US"/>
     </w:rPr>
   </w:style>
-  <w:style w:type="paragraph" w:styleId="Mucluc1">
+  <w:style w:type="paragraph" w:styleId="TOC1">
     <w:name w:val="toc 1"/>
-    <w:basedOn w:val="Binhthng"/>
-    <w:next w:val="Binhthng"/>
+    <w:basedOn w:val="Normal"/>
+    <w:next w:val="Normal"/>
     <w:autoRedefine/>
     <w:uiPriority w:val="39"/>
     <w:unhideWhenUsed/>
@@ -13842,10 +13864,10 @@
       <w:spacing w:after="100"/>
     </w:pPr>
   </w:style>
-  <w:style w:type="paragraph" w:styleId="Mucluc2">
+  <w:style w:type="paragraph" w:styleId="TOC2">
     <w:name w:val="toc 2"/>
-    <w:basedOn w:val="Binhthng"/>
-    <w:next w:val="Binhthng"/>
+    <w:basedOn w:val="Normal"/>
+    <w:next w:val="Normal"/>
     <w:autoRedefine/>
     <w:uiPriority w:val="39"/>
     <w:unhideWhenUsed/>
@@ -13855,10 +13877,10 @@
       <w:ind w:left="220"/>
     </w:pPr>
   </w:style>
-  <w:style w:type="paragraph" w:styleId="Mucluc3">
+  <w:style w:type="paragraph" w:styleId="TOC3">
     <w:name w:val="toc 3"/>
-    <w:basedOn w:val="Binhthng"/>
-    <w:next w:val="Binhthng"/>
+    <w:basedOn w:val="Normal"/>
+    <w:next w:val="Normal"/>
     <w:autoRedefine/>
     <w:uiPriority w:val="39"/>
     <w:unhideWhenUsed/>
@@ -13870,7 +13892,7 @@
   </w:style>
   <w:style w:type="paragraph" w:customStyle="1" w:styleId="Bang0">
     <w:name w:val="Bang"/>
-    <w:basedOn w:val="Binhthng"/>
+    <w:basedOn w:val="Normal"/>
     <w:autoRedefine/>
     <w:rsid w:val="00B65897"/>
     <w:pPr>
@@ -13885,7 +13907,7 @@
   </w:style>
   <w:style w:type="paragraph" w:customStyle="1" w:styleId="HeadingLv1">
     <w:name w:val="Heading Lv1"/>
-    <w:basedOn w:val="Binhthng"/>
+    <w:basedOn w:val="Normal"/>
     <w:autoRedefine/>
     <w:rsid w:val="00B65897"/>
     <w:pPr>
@@ -13903,9 +13925,9 @@
       <w:lang w:val="en-US"/>
     </w:rPr>
   </w:style>
-  <w:style w:type="character" w:styleId="Nhnmanh">
+  <w:style w:type="character" w:styleId="Emphasis">
     <w:name w:val="Emphasis"/>
-    <w:basedOn w:val="Phngmcinhcuaoanvn"/>
+    <w:basedOn w:val="DefaultParagraphFont"/>
     <w:uiPriority w:val="20"/>
     <w:qFormat/>
     <w:rsid w:val="003744DA"/>
@@ -13914,10 +13936,10 @@
       <w:iCs/>
     </w:rPr>
   </w:style>
-  <w:style w:type="character" w:customStyle="1" w:styleId="u6Char">
-    <w:name w:val="Đầu đề 6 Char"/>
-    <w:basedOn w:val="Phngmcinhcuaoanvn"/>
-    <w:link w:val="u6"/>
+  <w:style w:type="character" w:customStyle="1" w:styleId="Heading6Char">
+    <w:name w:val="Heading 6 Char"/>
+    <w:basedOn w:val="DefaultParagraphFont"/>
+    <w:link w:val="Heading6"/>
     <w:uiPriority w:val="9"/>
     <w:rsid w:val="001969F1"/>
     <w:rPr>
@@ -13925,10 +13947,10 @@
       <w:color w:val="1F4D78" w:themeColor="accent1" w:themeShade="7F"/>
     </w:rPr>
   </w:style>
-  <w:style w:type="paragraph" w:styleId="Tiuphu">
+  <w:style w:type="paragraph" w:styleId="Subtitle">
     <w:name w:val="Subtitle"/>
-    <w:basedOn w:val="Binhthng"/>
-    <w:next w:val="Binhthng"/>
+    <w:basedOn w:val="Normal"/>
+    <w:next w:val="Normal"/>
     <w:uiPriority w:val="11"/>
     <w:qFormat/>
     <w:pPr>
@@ -13945,7 +13967,7 @@
     </w:rPr>
   </w:style>
   <w:style w:type="table" w:customStyle="1" w:styleId="a">
-    <w:basedOn w:val="BangThngthng"/>
+    <w:basedOn w:val="TableNormal"/>
     <w:tblPr>
       <w:tblStyleRowBandSize w:val="1"/>
       <w:tblStyleColBandSize w:val="1"/>
@@ -13956,7 +13978,7 @@
     </w:tblPr>
   </w:style>
   <w:style w:type="table" w:customStyle="1" w:styleId="a0">
-    <w:basedOn w:val="BangThngthng"/>
+    <w:basedOn w:val="TableNormal"/>
     <w:tblPr>
       <w:tblStyleRowBandSize w:val="1"/>
       <w:tblStyleColBandSize w:val="1"/>
@@ -13967,7 +13989,7 @@
     </w:tblPr>
   </w:style>
   <w:style w:type="table" w:customStyle="1" w:styleId="a1">
-    <w:basedOn w:val="BangThngthng"/>
+    <w:basedOn w:val="TableNormal"/>
     <w:tblPr>
       <w:tblStyleRowBandSize w:val="1"/>
       <w:tblStyleColBandSize w:val="1"/>
@@ -13978,7 +14000,7 @@
     </w:tblPr>
   </w:style>
   <w:style w:type="table" w:customStyle="1" w:styleId="a2">
-    <w:basedOn w:val="BangThngthng"/>
+    <w:basedOn w:val="TableNormal"/>
     <w:tblPr>
       <w:tblStyleRowBandSize w:val="1"/>
       <w:tblStyleColBandSize w:val="1"/>
@@ -13989,7 +14011,7 @@
     </w:tblPr>
   </w:style>
   <w:style w:type="table" w:customStyle="1" w:styleId="a3">
-    <w:basedOn w:val="BangThngthng"/>
+    <w:basedOn w:val="TableNormal"/>
     <w:tblPr>
       <w:tblStyleRowBandSize w:val="1"/>
       <w:tblStyleColBandSize w:val="1"/>
@@ -14000,7 +14022,7 @@
     </w:tblPr>
   </w:style>
   <w:style w:type="table" w:customStyle="1" w:styleId="a4">
-    <w:basedOn w:val="BangThngthng"/>
+    <w:basedOn w:val="TableNormal"/>
     <w:tblPr>
       <w:tblStyleRowBandSize w:val="1"/>
       <w:tblStyleColBandSize w:val="1"/>
@@ -14011,7 +14033,7 @@
     </w:tblPr>
   </w:style>
   <w:style w:type="table" w:customStyle="1" w:styleId="a5">
-    <w:basedOn w:val="BangThngthng"/>
+    <w:basedOn w:val="TableNormal"/>
     <w:pPr>
       <w:spacing w:after="0" w:line="240" w:lineRule="auto"/>
     </w:pPr>
@@ -14033,7 +14055,7 @@
     </w:tcPr>
   </w:style>
   <w:style w:type="table" w:customStyle="1" w:styleId="a6">
-    <w:basedOn w:val="BangThngthng"/>
+    <w:basedOn w:val="TableNormal"/>
     <w:tblPr>
       <w:tblStyleRowBandSize w:val="1"/>
       <w:tblStyleColBandSize w:val="1"/>
@@ -14044,7 +14066,7 @@
     </w:tblPr>
   </w:style>
   <w:style w:type="table" w:customStyle="1" w:styleId="a7">
-    <w:basedOn w:val="BangThngthng"/>
+    <w:basedOn w:val="TableNormal"/>
     <w:pPr>
       <w:spacing w:after="0" w:line="240" w:lineRule="auto"/>
     </w:pPr>
@@ -14066,7 +14088,7 @@
     </w:tcPr>
   </w:style>
   <w:style w:type="table" w:customStyle="1" w:styleId="a8">
-    <w:basedOn w:val="BangThngthng"/>
+    <w:basedOn w:val="TableNormal"/>
     <w:pPr>
       <w:spacing w:after="0" w:line="240" w:lineRule="auto"/>
     </w:pPr>

</xml_diff>

<commit_message>
[requirement] Create UseCases Diagram
</commit_message>
<xml_diff>
--- a/Document/02_Requirement/tanh/LiveBox_Report3_Software_Requirement_Specification.docx
+++ b/Document/02_Requirement/tanh/LiveBox_Report3_Software_Requirement_Specification.docx
@@ -3575,13 +3575,7 @@
       </w:pPr>
       <w:r>
         <w:lastRenderedPageBreak/>
-        <w:t>1.2.</w:t>
-      </w:r>
-      <w:r>
-        <w:t>3</w:t>
-      </w:r>
-      <w:r>
-        <w:t xml:space="preserve"> </w:t>
+        <w:t xml:space="preserve">1.2.3 </w:t>
       </w:r>
       <w:r>
         <w:t>Voice Connection Setup</w:t>
@@ -3641,24 +3635,22 @@
           </wp:inline>
         </w:drawing>
       </w:r>
-      <w:bookmarkStart w:id="5" w:name="_GoBack"/>
+    </w:p>
+    <w:p>
+      <w:pPr>
+        <w:pStyle w:val="Heading3"/>
+      </w:pPr>
+      <w:bookmarkStart w:id="5" w:name="_Toc187341935"/>
+      <w:r>
+        <w:t>1.</w:t>
+      </w:r>
+      <w:r>
+        <w:t>3</w:t>
+      </w:r>
+      <w:r>
+        <w:t xml:space="preserve"> User Requirements</w:t>
+      </w:r>
       <w:bookmarkEnd w:id="5"/>
-    </w:p>
-    <w:p>
-      <w:pPr>
-        <w:pStyle w:val="Heading3"/>
-      </w:pPr>
-      <w:bookmarkStart w:id="6" w:name="_Toc187341935"/>
-      <w:r>
-        <w:t>1.</w:t>
-      </w:r>
-      <w:r>
-        <w:t>3</w:t>
-      </w:r>
-      <w:r>
-        <w:t xml:space="preserve"> User Requirements</w:t>
-      </w:r>
-      <w:bookmarkEnd w:id="6"/>
     </w:p>
     <w:p>
       <w:pPr>
@@ -4642,18 +4634,10 @@
     </w:p>
     <w:p>
       <w:pPr>
-        <w:jc w:val="both"/>
-        <w:rPr>
-          <w:i/>
-          <w:color w:val="0000FF"/>
-        </w:rPr>
-      </w:pPr>
-      <w:r>
-        <w:rPr>
-          <w:i/>
-          <w:color w:val="0000FF"/>
-        </w:rPr>
-        <w:t>In this section, you need to provide the UC diagram(s) to show the actor-UCs and UC-UC relationships like the sample below. You can have multiple UC diagrams for the system, each diagram is for one actor or one workflow]</w:t>
+        <w:pStyle w:val="Heading5"/>
+      </w:pPr>
+      <w:r>
+        <w:t>1.3.3.1 UCs for Server Owner (P01)</w:t>
       </w:r>
     </w:p>
     <w:p>
@@ -4686,138 +4670,272 @@
         <w:jc w:val="center"/>
       </w:pPr>
       <w:r>
+        <w:lastRenderedPageBreak/>
         <w:t>[Insert Server Owner UC Diagram Here]</w:t>
       </w:r>
       <w:r>
         <w:br/>
       </w:r>
+      <w:r>
+        <w:rPr>
+          <w:noProof/>
+        </w:rPr>
+        <w:drawing>
+          <wp:inline distT="0" distB="0" distL="0" distR="0" wp14:anchorId="410B09B0" wp14:editId="728769B0">
+            <wp:extent cx="5746750" cy="5527917"/>
+            <wp:effectExtent l="0" t="0" r="0" b="0"/>
+            <wp:docPr id="5" name="Picture 5" descr="C:\Users\Admin\AppData\Local\Microsoft\Windows\INetCache\Content.MSO\3C0A72F8.tmp"/>
+            <wp:cNvGraphicFramePr>
+              <a:graphicFrameLocks xmlns:a="http://schemas.openxmlformats.org/drawingml/2006/main" noChangeAspect="1"/>
+            </wp:cNvGraphicFramePr>
+            <a:graphic xmlns:a="http://schemas.openxmlformats.org/drawingml/2006/main">
+              <a:graphicData uri="http://schemas.openxmlformats.org/drawingml/2006/picture">
+                <pic:pic xmlns:pic="http://schemas.openxmlformats.org/drawingml/2006/picture">
+                  <pic:nvPicPr>
+                    <pic:cNvPr id="0" name="Picture 3" descr="C:\Users\Admin\AppData\Local\Microsoft\Windows\INetCache\Content.MSO\3C0A72F8.tmp"/>
+                    <pic:cNvPicPr>
+                      <a:picLocks noChangeAspect="1" noChangeArrowheads="1"/>
+                    </pic:cNvPicPr>
+                  </pic:nvPicPr>
+                  <pic:blipFill>
+                    <a:blip r:embed="rId13" cstate="print">
+                      <a:extLst>
+                        <a:ext uri="{28A0092B-C50C-407E-A947-70E740481C1C}">
+                          <a14:useLocalDpi xmlns:a14="http://schemas.microsoft.com/office/drawing/2010/main" val="0"/>
+                        </a:ext>
+                      </a:extLst>
+                    </a:blip>
+                    <a:srcRect/>
+                    <a:stretch>
+                      <a:fillRect/>
+                    </a:stretch>
+                  </pic:blipFill>
+                  <pic:spPr bwMode="auto">
+                    <a:xfrm>
+                      <a:off x="0" y="0"/>
+                      <a:ext cx="5746750" cy="5527917"/>
+                    </a:xfrm>
+                    <a:prstGeom prst="rect">
+                      <a:avLst/>
+                    </a:prstGeom>
+                    <a:noFill/>
+                    <a:ln>
+                      <a:noFill/>
+                    </a:ln>
+                  </pic:spPr>
+                </pic:pic>
+              </a:graphicData>
+            </a:graphic>
+          </wp:inline>
+        </w:drawing>
+      </w:r>
     </w:p>
     <w:p>
       <w:pPr>
         <w:pStyle w:val="Heading5"/>
       </w:pPr>
       <w:r>
-        <w:t>1.3.3.1 UCs for Server Owner (P01)</w:t>
-      </w:r>
-    </w:p>
-    <w:p>
-      <w:pPr>
-        <w:jc w:val="center"/>
-        <w:rPr>
-          <w:i/>
-          <w:lang w:val="vi-VN"/>
-        </w:rPr>
-      </w:pPr>
-      <w:r>
-        <w:rPr>
-          <w:i/>
+        <w:t>1.3.3.</w:t>
+      </w:r>
+      <w:r>
+        <w:t>2</w:t>
+      </w:r>
+      <w:r>
+        <w:t xml:space="preserve"> </w:t>
+      </w:r>
+      <w:r>
+        <w:t>UCs for Active Member (P02)</w:t>
+      </w:r>
+    </w:p>
+    <w:p>
+      <w:r>
+        <w:t>This diagram captures the core communication features used by regular active members in the server.</w:t>
+      </w:r>
+    </w:p>
+    <w:p>
+      <w:r>
+        <w:t>- UC-204: Rời khỏi server</w:t>
+      </w:r>
+    </w:p>
+    <w:p>
+      <w:r>
+        <w:t>- UC-301: Gửi và nhận tin nhắn thời gian thực</w:t>
+      </w:r>
+    </w:p>
+    <w:p>
+      <w:r>
+        <w:t>- UC-303: Xem danh sách thành viên và trạng thái online</w:t>
+      </w:r>
+    </w:p>
+    <w:p>
+      <w:r>
+        <w:t>- UC-401: Tham gia và rời voice channel</w:t>
+      </w:r>
+    </w:p>
+    <w:p>
+      <w:r>
+        <w:t>- UC-501: Thông báo tin nhắn chưa đọc</w:t>
+      </w:r>
+    </w:p>
+    <w:p>
+      <w:r>
+        <w:t>- UC-601: Cập nhật hồ sơ cá nhân</w:t>
+      </w:r>
+    </w:p>
+    <w:p>
+      <w:r>
+        <w:t>- UC-103: Đăng xuất an toàn</w:t>
+      </w:r>
+    </w:p>
+    <w:p>
+      <w:r>
+        <w:lastRenderedPageBreak/>
+        <w:t>[Insert Active Member UC Diagram Here]</w:t>
+      </w:r>
+      <w:r>
+        <w:br/>
+      </w:r>
+      <w:r>
+        <w:rPr>
           <w:noProof/>
         </w:rPr>
-        <w:t>Diagram</w:t>
-      </w:r>
-    </w:p>
-    <w:p/>
-    <w:p>
-      <w:r>
-        <w:t>This diagram captures the core communication features used by regular active members in the server.</w:t>
-      </w:r>
-    </w:p>
-    <w:p>
-      <w:r>
-        <w:t>- UC-204: Rời khỏi server</w:t>
-      </w:r>
-    </w:p>
-    <w:p>
-      <w:r>
-        <w:t>- UC-301: Gửi và nhận tin nhắn thời gian thực</w:t>
-      </w:r>
-    </w:p>
-    <w:p>
-      <w:r>
-        <w:t>- UC-303: Xem danh sách thành viên và trạng thái online</w:t>
-      </w:r>
-    </w:p>
-    <w:p>
-      <w:r>
-        <w:t>- UC-401: Tham gia và rời voice channel</w:t>
-      </w:r>
-    </w:p>
-    <w:p>
-      <w:r>
-        <w:t>- UC-501: Thông báo tin nhắn chưa đọc</w:t>
-      </w:r>
-    </w:p>
-    <w:p>
-      <w:r>
-        <w:t>- UC-601: Cập nhật hồ sơ cá nhân</w:t>
-      </w:r>
-    </w:p>
-    <w:p>
-      <w:r>
-        <w:t>- UC-103: Đăng xuất an toàn</w:t>
-      </w:r>
-    </w:p>
-    <w:p>
-      <w:r>
-        <w:t>[Insert Active Member UC Diagram Here]</w:t>
-      </w:r>
+        <w:drawing>
+          <wp:inline distT="0" distB="0" distL="0" distR="0" wp14:anchorId="71E5A3EE" wp14:editId="2908C70F">
+            <wp:extent cx="5746750" cy="6162579"/>
+            <wp:effectExtent l="0" t="0" r="0" b="0"/>
+            <wp:docPr id="8" name="Picture 8" descr="C:\Users\Admin\AppData\Local\Microsoft\Windows\INetCache\Content.MSO\423D8272.tmp"/>
+            <wp:cNvGraphicFramePr>
+              <a:graphicFrameLocks xmlns:a="http://schemas.openxmlformats.org/drawingml/2006/main" noChangeAspect="1"/>
+            </wp:cNvGraphicFramePr>
+            <a:graphic xmlns:a="http://schemas.openxmlformats.org/drawingml/2006/main">
+              <a:graphicData uri="http://schemas.openxmlformats.org/drawingml/2006/picture">
+                <pic:pic xmlns:pic="http://schemas.openxmlformats.org/drawingml/2006/picture">
+                  <pic:nvPicPr>
+                    <pic:cNvPr id="0" name="Picture 15" descr="C:\Users\Admin\AppData\Local\Microsoft\Windows\INetCache\Content.MSO\423D8272.tmp"/>
+                    <pic:cNvPicPr>
+                      <a:picLocks noChangeAspect="1" noChangeArrowheads="1"/>
+                    </pic:cNvPicPr>
+                  </pic:nvPicPr>
+                  <pic:blipFill>
+                    <a:blip r:embed="rId14" cstate="print">
+                      <a:extLst>
+                        <a:ext uri="{28A0092B-C50C-407E-A947-70E740481C1C}">
+                          <a14:useLocalDpi xmlns:a14="http://schemas.microsoft.com/office/drawing/2010/main" val="0"/>
+                        </a:ext>
+                      </a:extLst>
+                    </a:blip>
+                    <a:srcRect/>
+                    <a:stretch>
+                      <a:fillRect/>
+                    </a:stretch>
+                  </pic:blipFill>
+                  <pic:spPr bwMode="auto">
+                    <a:xfrm>
+                      <a:off x="0" y="0"/>
+                      <a:ext cx="5746750" cy="6162579"/>
+                    </a:xfrm>
+                    <a:prstGeom prst="rect">
+                      <a:avLst/>
+                    </a:prstGeom>
+                    <a:noFill/>
+                    <a:ln>
+                      <a:noFill/>
+                    </a:ln>
+                  </pic:spPr>
+                </pic:pic>
+              </a:graphicData>
+            </a:graphic>
+          </wp:inline>
+        </w:drawing>
+      </w:r>
+    </w:p>
+    <w:p>
+      <w:pPr>
+        <w:pStyle w:val="Heading5"/>
+      </w:pPr>
+      <w:r>
+        <w:t>1.3.3.3 UCs for Guest User (P03)</w:t>
+      </w:r>
+    </w:p>
+    <w:p>
+      <w:r>
+        <w:t>This diagram focuses on the onboarding flow for new or guest users entering the platform.</w:t>
+      </w:r>
+    </w:p>
+    <w:p>
+      <w:r>
+        <w:t>- UC-101: Đăng ký tài khoản mới</w:t>
+      </w:r>
+    </w:p>
+    <w:p>
+      <w:r>
+        <w:t>- UC-102: Đăng nhập và duy trì phiên làm việc</w:t>
+      </w:r>
+    </w:p>
+    <w:p>
+      <w:r>
+        <w:t>[Insert Guest User UC Diagram Here]</w:t>
+      </w:r>
+    </w:p>
+    <w:p>
+      <w:r>
+        <w:rPr>
+          <w:noProof/>
+        </w:rPr>
+        <w:lastRenderedPageBreak/>
+        <w:drawing>
+          <wp:inline distT="0" distB="0" distL="0" distR="0" wp14:anchorId="2C0A3A82" wp14:editId="17CCA391">
+            <wp:extent cx="5746750" cy="3869424"/>
+            <wp:effectExtent l="0" t="0" r="0" b="0"/>
+            <wp:docPr id="9" name="Picture 9" descr="C:\Users\Admin\AppData\Local\Microsoft\Windows\INetCache\Content.MSO\9C857B50.tmp"/>
+            <wp:cNvGraphicFramePr>
+              <a:graphicFrameLocks xmlns:a="http://schemas.openxmlformats.org/drawingml/2006/main" noChangeAspect="1"/>
+            </wp:cNvGraphicFramePr>
+            <a:graphic xmlns:a="http://schemas.openxmlformats.org/drawingml/2006/main">
+              <a:graphicData uri="http://schemas.openxmlformats.org/drawingml/2006/picture">
+                <pic:pic xmlns:pic="http://schemas.openxmlformats.org/drawingml/2006/picture">
+                  <pic:nvPicPr>
+                    <pic:cNvPr id="0" name="Picture 17" descr="C:\Users\Admin\AppData\Local\Microsoft\Windows\INetCache\Content.MSO\9C857B50.tmp"/>
+                    <pic:cNvPicPr>
+                      <a:picLocks noChangeAspect="1" noChangeArrowheads="1"/>
+                    </pic:cNvPicPr>
+                  </pic:nvPicPr>
+                  <pic:blipFill>
+                    <a:blip r:embed="rId15" cstate="print">
+                      <a:extLst>
+                        <a:ext uri="{28A0092B-C50C-407E-A947-70E740481C1C}">
+                          <a14:useLocalDpi xmlns:a14="http://schemas.microsoft.com/office/drawing/2010/main" val="0"/>
+                        </a:ext>
+                      </a:extLst>
+                    </a:blip>
+                    <a:srcRect/>
+                    <a:stretch>
+                      <a:fillRect/>
+                    </a:stretch>
+                  </pic:blipFill>
+                  <pic:spPr bwMode="auto">
+                    <a:xfrm>
+                      <a:off x="0" y="0"/>
+                      <a:ext cx="5746750" cy="3869424"/>
+                    </a:xfrm>
+                    <a:prstGeom prst="rect">
+                      <a:avLst/>
+                    </a:prstGeom>
+                    <a:noFill/>
+                    <a:ln>
+                      <a:noFill/>
+                    </a:ln>
+                  </pic:spPr>
+                </pic:pic>
+              </a:graphicData>
+            </a:graphic>
+          </wp:inline>
+        </w:drawing>
+      </w:r>
+      <w:bookmarkStart w:id="6" w:name="_GoBack"/>
+      <w:bookmarkEnd w:id="6"/>
       <w:r>
         <w:br/>
-      </w:r>
-    </w:p>
-    <w:p>
-      <w:pPr>
-        <w:pStyle w:val="Heading5"/>
-      </w:pPr>
-      <w:r>
-        <w:lastRenderedPageBreak/>
-        <w:t>1.3.3.2 UCs for Active Member (P02)</w:t>
-      </w:r>
-    </w:p>
-    <w:p>
-      <w:pPr>
-        <w:jc w:val="center"/>
-        <w:rPr>
-          <w:i/>
-        </w:rPr>
-      </w:pPr>
-      <w:r>
-        <w:rPr>
-          <w:i/>
-          <w:noProof/>
-        </w:rPr>
-        <w:t>Diagram</w:t>
-      </w:r>
-    </w:p>
-    <w:p>
-      <w:r>
-        <w:t>This diagram focuses on the onboarding flow for new or guest users entering the platform.</w:t>
-      </w:r>
-    </w:p>
-    <w:p>
-      <w:r>
-        <w:t>- UC-101: Đăng ký tài khoản mới</w:t>
-      </w:r>
-    </w:p>
-    <w:p>
-      <w:r>
-        <w:t>- UC-102: Đăng nhập và duy trì phiên làm việc</w:t>
-      </w:r>
-    </w:p>
-    <w:p>
-      <w:r>
-        <w:t>[Insert Guest User UC Diagram Here]</w:t>
-      </w:r>
-      <w:r>
-        <w:br/>
-      </w:r>
-    </w:p>
-    <w:p>
-      <w:pPr>
-        <w:pStyle w:val="Heading5"/>
-      </w:pPr>
-      <w:r>
-        <w:t>1.3.3.3 UCs for Guest User (P03)</w:t>
       </w:r>
     </w:p>
     <w:p/>
@@ -4893,7 +5011,7 @@
                     <pic:cNvPicPr preferRelativeResize="0"/>
                   </pic:nvPicPr>
                   <pic:blipFill>
-                    <a:blip r:embed="rId13"/>
+                    <a:blip r:embed="rId16"/>
                     <a:srcRect/>
                     <a:stretch>
                       <a:fillRect/>
@@ -4921,6 +5039,7 @@
         <w:pStyle w:val="Heading4"/>
       </w:pPr>
       <w:r>
+        <w:lastRenderedPageBreak/>
         <w:t>1.4.2 Screen Authorization</w:t>
       </w:r>
     </w:p>
@@ -5545,7 +5664,6 @@
               <w:spacing w:after="0"/>
             </w:pPr>
             <w:r>
-              <w:lastRenderedPageBreak/>
               <w:t>1</w:t>
             </w:r>
           </w:p>
@@ -5716,7 +5834,7 @@
                     <pic:cNvPicPr preferRelativeResize="0"/>
                   </pic:nvPicPr>
                   <pic:blipFill>
-                    <a:blip r:embed="rId14"/>
+                    <a:blip r:embed="rId17"/>
                     <a:srcRect/>
                     <a:stretch>
                       <a:fillRect/>
@@ -6108,6 +6226,7 @@
       </w:pPr>
       <w:bookmarkStart w:id="10" w:name="_Toc187341939"/>
       <w:r>
+        <w:lastRenderedPageBreak/>
         <w:t>2.1 &lt;&lt;Feature Name1&gt;&gt;</w:t>
       </w:r>
       <w:bookmarkEnd w:id="10"/>
@@ -6364,7 +6483,6 @@
         <w:jc w:val="both"/>
       </w:pPr>
       <w:r>
-        <w:lastRenderedPageBreak/>
         <w:t>An actor is a person or other entity external to the software system being specified who interacts with the system and performs use cases to accomplish tasks. Name the primary actor that will be initiating this UC and any other secondary actors who will participate in completing execution of the UC.</w:t>
       </w:r>
     </w:p>
@@ -6808,6 +6926,7 @@
               <w:jc w:val="right"/>
             </w:pPr>
             <w:r>
+              <w:lastRenderedPageBreak/>
               <w:t>Normal Sequence/Flow</w:t>
             </w:r>
           </w:p>
@@ -7182,7 +7301,6 @@
               <w:rPr>
                 <w:color w:val="000000"/>
               </w:rPr>
-              <w:lastRenderedPageBreak/>
               <w:t>User types in the Google account details and chooses to login</w:t>
             </w:r>
           </w:p>
@@ -8387,7 +8505,7 @@
                     <pic:cNvPicPr preferRelativeResize="0"/>
                   </pic:nvPicPr>
                   <pic:blipFill>
-                    <a:blip r:embed="rId15"/>
+                    <a:blip r:embed="rId18"/>
                     <a:srcRect/>
                     <a:stretch>
                       <a:fillRect/>
@@ -8710,7 +8828,7 @@
                     <pic:cNvPicPr preferRelativeResize="0"/>
                   </pic:nvPicPr>
                   <pic:blipFill>
-                    <a:blip r:embed="rId16"/>
+                    <a:blip r:embed="rId19"/>
                     <a:srcRect/>
                     <a:stretch>
                       <a:fillRect/>
@@ -11313,7 +11431,7 @@
       <w:bookmarkEnd w:id="47"/>
     </w:p>
     <w:sectPr>
-      <w:footerReference w:type="default" r:id="rId17"/>
+      <w:footerReference w:type="default" r:id="rId20"/>
       <w:pgSz w:w="11906" w:h="16838"/>
       <w:pgMar w:top="1440" w:right="1416" w:bottom="1440" w:left="1440" w:header="708" w:footer="708" w:gutter="0"/>
       <w:pgNumType w:start="1"/>

</xml_diff>

<commit_message>
[Design] API design rule
</commit_message>
<xml_diff>
--- a/Document/02_Requirement/tanh/LiveBox_Report3_Software_Requirement_Specification.docx
+++ b/Document/02_Requirement/tanh/LiveBox_Report3_Software_Requirement_Specification.docx
@@ -3844,12 +3844,28 @@
     </w:p>
     <w:p>
       <w:pPr>
+        <w:rPr>
+          <w:rFonts w:asciiTheme="majorHAnsi" w:eastAsiaTheme="majorEastAsia" w:hAnsiTheme="majorHAnsi" w:cstheme="majorBidi"/>
+          <w:b/>
+          <w:i/>
+          <w:iCs/>
+        </w:rPr>
+      </w:pPr>
+      <w:r>
+        <w:br w:type="page"/>
+      </w:r>
+    </w:p>
+    <w:p>
+      <w:pPr>
         <w:pStyle w:val="Heading4"/>
         <w:rPr>
           <w:lang w:val="vi-VN"/>
         </w:rPr>
       </w:pPr>
-      <w:r>
+      <w:bookmarkStart w:id="6" w:name="_GoBack"/>
+      <w:bookmarkEnd w:id="6"/>
+      <w:r>
+        <w:lastRenderedPageBreak/>
         <w:t>1.3.2 Use Cases (UC)</w:t>
       </w:r>
     </w:p>
@@ -3947,7 +3963,6 @@
           </w:tcPr>
           <w:p>
             <w:r>
-              <w:lastRenderedPageBreak/>
               <w:t>UC-101</w:t>
             </w:r>
           </w:p>
@@ -4468,6 +4483,7 @@
           </w:tcPr>
           <w:p>
             <w:r>
+              <w:lastRenderedPageBreak/>
               <w:t>UC-401</w:t>
             </w:r>
           </w:p>
@@ -4520,7 +4536,6 @@
           </w:tcPr>
           <w:p>
             <w:r>
-              <w:lastRenderedPageBreak/>
               <w:t>UC-501</w:t>
             </w:r>
           </w:p>
@@ -4932,8 +4947,6 @@
           </wp:inline>
         </w:drawing>
       </w:r>
-      <w:bookmarkStart w:id="6" w:name="_GoBack"/>
-      <w:bookmarkEnd w:id="6"/>
       <w:r>
         <w:br/>
       </w:r>

</xml_diff>

<commit_message>
[Requirement] ERD, Screen Follow and update SRS
</commit_message>
<xml_diff>
--- a/Document/02_Requirement/tanh/LiveBox_Report3_Software_Requirement_Specification.docx
+++ b/Document/02_Requirement/tanh/LiveBox_Report3_Software_Requirement_Specification.docx
@@ -3862,8 +3862,6 @@
           <w:lang w:val="vi-VN"/>
         </w:rPr>
       </w:pPr>
-      <w:bookmarkStart w:id="6" w:name="_GoBack"/>
-      <w:bookmarkEnd w:id="6"/>
       <w:r>
         <w:lastRenderedPageBreak/>
         <w:t>1.3.2 Use Cases (UC)</w:t>
@@ -4644,6 +4642,7 @@
         <w:pStyle w:val="Heading4"/>
       </w:pPr>
       <w:r>
+        <w:lastRenderedPageBreak/>
         <w:t>1.3.3 Use Case Diagrams</w:t>
       </w:r>
     </w:p>
@@ -4656,36 +4655,10 @@
       </w:r>
     </w:p>
     <w:p>
-      <w:r>
-        <w:t>This diagram illustrates the capabilities of the Server Owner, whose main goals are managing the server, channels, and members.</w:t>
-      </w:r>
-    </w:p>
-    <w:p>
-      <w:r>
-        <w:t>- UC-201: Tạo server mới</w:t>
-      </w:r>
-    </w:p>
-    <w:p>
-      <w:r>
-        <w:t>- UC-202: Mời thành viên qua invite link</w:t>
-      </w:r>
-    </w:p>
-    <w:p>
-      <w:r>
-        <w:t>- UC-203: Kick / Ban thành viên khỏi server</w:t>
-      </w:r>
-    </w:p>
-    <w:p>
-      <w:r>
-        <w:t>- UC-302: Tạo và quản lý kênh text trong server</w:t>
-      </w:r>
-    </w:p>
-    <w:p>
       <w:pPr>
         <w:jc w:val="center"/>
       </w:pPr>
       <w:r>
-        <w:lastRenderedPageBreak/>
         <w:t>[Insert Server Owner UC Diagram Here]</w:t>
       </w:r>
       <w:r>
@@ -4750,6 +4723,7 @@
         <w:pStyle w:val="Heading5"/>
       </w:pPr>
       <w:r>
+        <w:lastRenderedPageBreak/>
         <w:t>1.3.3.</w:t>
       </w:r>
       <w:r>
@@ -4760,52 +4734,6 @@
       </w:r>
       <w:r>
         <w:t>UCs for Active Member (P02)</w:t>
-      </w:r>
-    </w:p>
-    <w:p>
-      <w:r>
-        <w:t>This diagram captures the core communication features used by regular active members in the server.</w:t>
-      </w:r>
-    </w:p>
-    <w:p>
-      <w:r>
-        <w:t>- UC-204: Rời khỏi server</w:t>
-      </w:r>
-    </w:p>
-    <w:p>
-      <w:r>
-        <w:t>- UC-301: Gửi và nhận tin nhắn thời gian thực</w:t>
-      </w:r>
-    </w:p>
-    <w:p>
-      <w:r>
-        <w:t>- UC-303: Xem danh sách thành viên và trạng thái online</w:t>
-      </w:r>
-    </w:p>
-    <w:p>
-      <w:r>
-        <w:t>- UC-401: Tham gia và rời voice channel</w:t>
-      </w:r>
-    </w:p>
-    <w:p>
-      <w:r>
-        <w:t>- UC-501: Thông báo tin nhắn chưa đọc</w:t>
-      </w:r>
-    </w:p>
-    <w:p>
-      <w:r>
-        <w:t>- UC-601: Cập nhật hồ sơ cá nhân</w:t>
-      </w:r>
-    </w:p>
-    <w:p>
-      <w:r>
-        <w:t>- UC-103: Đăng xuất an toàn</w:t>
-      </w:r>
-    </w:p>
-    <w:p>
-      <w:r>
-        <w:lastRenderedPageBreak/>
-        <w:t>[Insert Active Member UC Diagram Here]</w:t>
       </w:r>
       <w:r>
         <w:br/>
@@ -4870,26 +4798,6 @@
       </w:pPr>
       <w:r>
         <w:t>1.3.3.3 UCs for Guest User (P03)</w:t>
-      </w:r>
-    </w:p>
-    <w:p>
-      <w:r>
-        <w:t>This diagram focuses on the onboarding flow for new or guest users entering the platform.</w:t>
-      </w:r>
-    </w:p>
-    <w:p>
-      <w:r>
-        <w:t>- UC-101: Đăng ký tài khoản mới</w:t>
-      </w:r>
-    </w:p>
-    <w:p>
-      <w:r>
-        <w:t>- UC-102: Đăng nhập và duy trì phiên làm việc</w:t>
-      </w:r>
-    </w:p>
-    <w:p>
-      <w:r>
-        <w:t>[Insert Guest User UC Diagram Here]</w:t>
       </w:r>
     </w:p>
     <w:p>
@@ -4956,11 +4864,11 @@
       <w:pPr>
         <w:pStyle w:val="Heading3"/>
       </w:pPr>
-      <w:bookmarkStart w:id="7" w:name="_Toc187341936"/>
+      <w:bookmarkStart w:id="6" w:name="_Toc187341936"/>
       <w:r>
         <w:t>1.4 System Functionalities</w:t>
       </w:r>
-      <w:bookmarkEnd w:id="7"/>
+      <w:bookmarkEnd w:id="6"/>
     </w:p>
     <w:p>
       <w:pPr>
@@ -5775,11 +5683,11 @@
       <w:pPr>
         <w:pStyle w:val="Heading3"/>
       </w:pPr>
-      <w:bookmarkStart w:id="8" w:name="_Toc187341937"/>
+      <w:bookmarkStart w:id="7" w:name="_Toc187341937"/>
       <w:r>
         <w:t>1.5 Entity Relationship Diagram</w:t>
       </w:r>
-      <w:bookmarkEnd w:id="8"/>
+      <w:bookmarkEnd w:id="7"/>
     </w:p>
     <w:p>
       <w:pPr>
@@ -6164,11 +6072,11 @@
       <w:pPr>
         <w:pStyle w:val="Heading2"/>
       </w:pPr>
-      <w:bookmarkStart w:id="9" w:name="_Toc187341938"/>
+      <w:bookmarkStart w:id="8" w:name="_Toc187341938"/>
       <w:r>
         <w:t>2. Use Case Specifications</w:t>
       </w:r>
-      <w:bookmarkEnd w:id="9"/>
+      <w:bookmarkEnd w:id="8"/>
     </w:p>
     <w:p>
       <w:pPr>
@@ -6237,12 +6145,12 @@
       <w:pPr>
         <w:pStyle w:val="Heading3"/>
       </w:pPr>
-      <w:bookmarkStart w:id="10" w:name="_Toc187341939"/>
+      <w:bookmarkStart w:id="9" w:name="_Toc187341939"/>
       <w:r>
         <w:lastRenderedPageBreak/>
         <w:t>2.1 &lt;&lt;Feature Name1&gt;&gt;</w:t>
       </w:r>
-      <w:bookmarkEnd w:id="10"/>
+      <w:bookmarkEnd w:id="9"/>
     </w:p>
     <w:p>
       <w:pPr>
@@ -7542,7 +7450,7 @@
       <w:pPr>
         <w:pStyle w:val="Heading3"/>
       </w:pPr>
-      <w:bookmarkStart w:id="11" w:name="_Toc187341940"/>
+      <w:bookmarkStart w:id="10" w:name="_Toc187341940"/>
       <w:r>
         <w:t>2.</w:t>
       </w:r>
@@ -7560,7 +7468,7 @@
       <w:r>
         <w:t xml:space="preserve"> Feature</w:t>
       </w:r>
-      <w:bookmarkEnd w:id="11"/>
+      <w:bookmarkEnd w:id="10"/>
     </w:p>
     <w:p>
       <w:r>
@@ -7583,12 +7491,12 @@
       <w:pPr>
         <w:pStyle w:val="Heading2"/>
       </w:pPr>
-      <w:bookmarkStart w:id="12" w:name="_Toc187341941"/>
+      <w:bookmarkStart w:id="11" w:name="_Toc187341941"/>
       <w:r>
         <w:lastRenderedPageBreak/>
         <w:t>3. Functional Requirements</w:t>
       </w:r>
-      <w:bookmarkEnd w:id="12"/>
+      <w:bookmarkEnd w:id="11"/>
     </w:p>
     <w:p>
       <w:pPr>
@@ -7597,10 +7505,10 @@
           <w:color w:val="0000FF"/>
         </w:rPr>
       </w:pPr>
-      <w:bookmarkStart w:id="13" w:name="_Toc143617359"/>
-      <w:bookmarkStart w:id="14" w:name="_Toc146703157"/>
-      <w:bookmarkStart w:id="15" w:name="_Toc179689383"/>
-      <w:bookmarkStart w:id="16" w:name="_Hlk180308893"/>
+      <w:bookmarkStart w:id="12" w:name="_Toc143617359"/>
+      <w:bookmarkStart w:id="13" w:name="_Toc146703157"/>
+      <w:bookmarkStart w:id="14" w:name="_Toc179689383"/>
+      <w:bookmarkStart w:id="15" w:name="_Hlk180308893"/>
       <w:r>
         <w:rPr>
           <w:i/>
@@ -7613,50 +7521,50 @@
       <w:pPr>
         <w:pStyle w:val="Heading3"/>
       </w:pPr>
-      <w:bookmarkStart w:id="17" w:name="_Toc187228345"/>
-      <w:bookmarkStart w:id="18" w:name="_Toc187341942"/>
+      <w:bookmarkStart w:id="16" w:name="_Toc187228345"/>
+      <w:bookmarkStart w:id="17" w:name="_Toc187341942"/>
+      <w:bookmarkEnd w:id="12"/>
       <w:bookmarkEnd w:id="13"/>
       <w:bookmarkEnd w:id="14"/>
       <w:bookmarkEnd w:id="15"/>
+      <w:r>
+        <w:t xml:space="preserve">3.1 </w:t>
+      </w:r>
+      <w:r>
+        <w:rPr>
+          <w:lang w:val="vi-VN"/>
+        </w:rPr>
+        <w:t>Feature Name</w:t>
+      </w:r>
+      <w:r>
+        <w:t>1</w:t>
+      </w:r>
       <w:bookmarkEnd w:id="16"/>
-      <w:r>
-        <w:t xml:space="preserve">3.1 </w:t>
+      <w:bookmarkEnd w:id="17"/>
+    </w:p>
+    <w:p>
+      <w:pPr>
+        <w:pStyle w:val="Heading4"/>
+      </w:pPr>
+      <w:bookmarkStart w:id="18" w:name="_Toc143617360"/>
+      <w:bookmarkStart w:id="19" w:name="_Toc179689384"/>
+      <w:bookmarkStart w:id="20" w:name="_Toc187228346"/>
+      <w:bookmarkStart w:id="21" w:name="_Hlk144402728"/>
+      <w:r>
+        <w:t>3.1</w:t>
       </w:r>
       <w:r>
         <w:rPr>
           <w:lang w:val="vi-VN"/>
         </w:rPr>
-        <w:t>Feature Name</w:t>
-      </w:r>
-      <w:r>
-        <w:t>1</w:t>
-      </w:r>
-      <w:bookmarkEnd w:id="17"/>
+        <w:t>.1 SubFeature Name</w:t>
+      </w:r>
       <w:bookmarkEnd w:id="18"/>
-    </w:p>
-    <w:p>
-      <w:pPr>
-        <w:pStyle w:val="Heading4"/>
-      </w:pPr>
-      <w:bookmarkStart w:id="19" w:name="_Toc143617360"/>
-      <w:bookmarkStart w:id="20" w:name="_Toc179689384"/>
-      <w:bookmarkStart w:id="21" w:name="_Toc187228346"/>
-      <w:bookmarkStart w:id="22" w:name="_Hlk144402728"/>
-      <w:r>
-        <w:t>3.1</w:t>
-      </w:r>
-      <w:r>
-        <w:rPr>
-          <w:lang w:val="vi-VN"/>
-        </w:rPr>
-        <w:t>.1 SubFeature Name</w:t>
+      <w:r>
+        <w:t>1.1</w:t>
       </w:r>
       <w:bookmarkEnd w:id="19"/>
-      <w:r>
-        <w:t>1.1</w:t>
-      </w:r>
       <w:bookmarkEnd w:id="20"/>
-      <w:bookmarkEnd w:id="21"/>
     </w:p>
     <w:p>
       <w:pPr>
@@ -8081,69 +7989,94 @@
           <w:lang w:val="vi-VN"/>
         </w:rPr>
       </w:pPr>
-      <w:bookmarkStart w:id="23" w:name="_Toc179689385"/>
-      <w:bookmarkStart w:id="24" w:name="_Toc187228347"/>
+      <w:bookmarkStart w:id="22" w:name="_Toc179689385"/>
+      <w:bookmarkStart w:id="23" w:name="_Toc187228347"/>
+      <w:bookmarkEnd w:id="21"/>
+      <w:r>
+        <w:t>3.1</w:t>
+      </w:r>
+      <w:r>
+        <w:rPr>
+          <w:lang w:val="vi-VN"/>
+        </w:rPr>
+        <w:t>.</w:t>
+      </w:r>
+      <w:r>
+        <w:t>2</w:t>
+      </w:r>
+      <w:r>
+        <w:rPr>
+          <w:lang w:val="vi-VN"/>
+        </w:rPr>
+        <w:t xml:space="preserve"> SubFeature Name</w:t>
+      </w:r>
+      <w:r>
+        <w:t>1.2</w:t>
+      </w:r>
       <w:bookmarkEnd w:id="22"/>
-      <w:r>
-        <w:t>3.1</w:t>
-      </w:r>
-      <w:r>
-        <w:rPr>
-          <w:lang w:val="vi-VN"/>
-        </w:rPr>
-        <w:t>.</w:t>
-      </w:r>
-      <w:r>
-        <w:t>2</w:t>
-      </w:r>
-      <w:r>
-        <w:rPr>
-          <w:lang w:val="vi-VN"/>
-        </w:rPr>
-        <w:t xml:space="preserve"> SubFeature Name</w:t>
-      </w:r>
-      <w:r>
-        <w:t>1.2</w:t>
-      </w:r>
       <w:bookmarkEnd w:id="23"/>
+    </w:p>
+    <w:p>
+      <w:r>
+        <w:t>…</w:t>
+      </w:r>
+    </w:p>
+    <w:p>
+      <w:pPr>
+        <w:pStyle w:val="Heading3"/>
+      </w:pPr>
+      <w:bookmarkStart w:id="24" w:name="_Toc179689386"/>
+      <w:bookmarkStart w:id="25" w:name="_Toc187228348"/>
+      <w:bookmarkStart w:id="26" w:name="_Toc187341943"/>
+      <w:r>
+        <w:t>3.2 User Authentication</w:t>
+      </w:r>
       <w:bookmarkEnd w:id="24"/>
-    </w:p>
-    <w:p>
-      <w:r>
-        <w:t>…</w:t>
-      </w:r>
-    </w:p>
-    <w:p>
-      <w:pPr>
-        <w:pStyle w:val="Heading3"/>
-      </w:pPr>
-      <w:bookmarkStart w:id="25" w:name="_Toc179689386"/>
-      <w:bookmarkStart w:id="26" w:name="_Toc187228348"/>
-      <w:bookmarkStart w:id="27" w:name="_Toc187341943"/>
-      <w:r>
-        <w:t>3.2 User Authentication</w:t>
-      </w:r>
       <w:bookmarkEnd w:id="25"/>
       <w:bookmarkEnd w:id="26"/>
+    </w:p>
+    <w:p>
+      <w:pPr>
+        <w:pStyle w:val="Heading4"/>
+      </w:pPr>
+      <w:bookmarkStart w:id="27" w:name="_Toc179689388"/>
+      <w:bookmarkStart w:id="28" w:name="_Toc187228349"/>
+      <w:bookmarkStart w:id="29" w:name="_Toc179689387"/>
+      <w:r>
+        <w:t>3.2.1 User Register</w:t>
+      </w:r>
       <w:bookmarkEnd w:id="27"/>
+      <w:bookmarkEnd w:id="28"/>
+    </w:p>
+    <w:p>
+      <w:pPr>
+        <w:spacing w:after="60"/>
+      </w:pPr>
+      <w:r>
+        <w:t>…</w:t>
+      </w:r>
     </w:p>
     <w:p>
       <w:pPr>
         <w:pStyle w:val="Heading4"/>
-      </w:pPr>
-      <w:bookmarkStart w:id="28" w:name="_Toc179689388"/>
-      <w:bookmarkStart w:id="29" w:name="_Toc187228349"/>
-      <w:bookmarkStart w:id="30" w:name="_Toc179689387"/>
-      <w:r>
-        <w:t>3.2.1 User Register</w:t>
-      </w:r>
-      <w:bookmarkEnd w:id="28"/>
+        <w:rPr>
+          <w:lang w:val="vi-VN"/>
+        </w:rPr>
+      </w:pPr>
+      <w:bookmarkStart w:id="30" w:name="_Toc187228350"/>
+      <w:r>
+        <w:t>3.2.2</w:t>
+      </w:r>
+      <w:r>
+        <w:rPr>
+          <w:lang w:val="vi-VN"/>
+        </w:rPr>
+        <w:t xml:space="preserve"> User Login</w:t>
+      </w:r>
       <w:bookmarkEnd w:id="29"/>
-    </w:p>
-    <w:p>
-      <w:pPr>
-        <w:spacing w:after="60"/>
-      </w:pPr>
+      <w:bookmarkEnd w:id="30"/>
+    </w:p>
+    <w:p>
       <w:r>
         <w:t>…</w:t>
       </w:r>
@@ -8151,21 +8084,11 @@
     <w:p>
       <w:pPr>
         <w:pStyle w:val="Heading4"/>
-        <w:rPr>
-          <w:lang w:val="vi-VN"/>
-        </w:rPr>
-      </w:pPr>
-      <w:bookmarkStart w:id="31" w:name="_Toc187228350"/>
-      <w:r>
-        <w:t>3.2.2</w:t>
-      </w:r>
-      <w:r>
-        <w:rPr>
-          <w:lang w:val="vi-VN"/>
-        </w:rPr>
-        <w:t xml:space="preserve"> User Login</w:t>
-      </w:r>
-      <w:bookmarkEnd w:id="30"/>
+      </w:pPr>
+      <w:bookmarkStart w:id="31" w:name="_Toc187228351"/>
+      <w:r>
+        <w:t>3.2.3 Password Reset</w:t>
+      </w:r>
       <w:bookmarkEnd w:id="31"/>
     </w:p>
     <w:p>
@@ -8175,26 +8098,11 @@
     </w:p>
     <w:p>
       <w:pPr>
-        <w:pStyle w:val="Heading4"/>
-      </w:pPr>
-      <w:bookmarkStart w:id="32" w:name="_Toc187228351"/>
-      <w:r>
-        <w:t>3.2.3 Password Reset</w:t>
-      </w:r>
-      <w:bookmarkEnd w:id="32"/>
-    </w:p>
-    <w:p>
-      <w:r>
-        <w:t>…</w:t>
-      </w:r>
-    </w:p>
-    <w:p>
-      <w:pPr>
         <w:pStyle w:val="Heading3"/>
       </w:pPr>
-      <w:bookmarkStart w:id="33" w:name="_Toc179689390"/>
-      <w:bookmarkStart w:id="34" w:name="_Toc187228353"/>
-      <w:bookmarkStart w:id="35" w:name="_Toc187341944"/>
+      <w:bookmarkStart w:id="32" w:name="_Toc179689390"/>
+      <w:bookmarkStart w:id="33" w:name="_Toc187228353"/>
+      <w:bookmarkStart w:id="34" w:name="_Toc187341944"/>
       <w:r>
         <w:lastRenderedPageBreak/>
         <w:t>3.</w:t>
@@ -8202,27 +8110,27 @@
       <w:r>
         <w:t>3 System Administration</w:t>
       </w:r>
+      <w:bookmarkEnd w:id="32"/>
       <w:bookmarkEnd w:id="33"/>
       <w:bookmarkEnd w:id="34"/>
+    </w:p>
+    <w:p>
+      <w:pPr>
+        <w:pStyle w:val="Heading4"/>
+      </w:pPr>
+      <w:bookmarkStart w:id="35" w:name="_Toc179689391"/>
+      <w:bookmarkStart w:id="36" w:name="_Toc187228354"/>
+      <w:r>
+        <w:t>3.</w:t>
+      </w:r>
+      <w:r>
+        <w:t xml:space="preserve">3.1 </w:t>
+      </w:r>
       <w:bookmarkEnd w:id="35"/>
-    </w:p>
-    <w:p>
-      <w:pPr>
-        <w:pStyle w:val="Heading4"/>
-      </w:pPr>
-      <w:bookmarkStart w:id="36" w:name="_Toc179689391"/>
-      <w:bookmarkStart w:id="37" w:name="_Toc187228354"/>
-      <w:r>
-        <w:t>3.</w:t>
-      </w:r>
-      <w:r>
-        <w:t xml:space="preserve">3.1 </w:t>
+      <w:r>
+        <w:t>Master Data</w:t>
       </w:r>
       <w:bookmarkEnd w:id="36"/>
-      <w:r>
-        <w:t>Master Data</w:t>
-      </w:r>
-      <w:bookmarkEnd w:id="37"/>
     </w:p>
     <w:p>
       <w:pPr>
@@ -9103,66 +9011,66 @@
       <w:pPr>
         <w:pStyle w:val="Heading4"/>
       </w:pPr>
-      <w:bookmarkStart w:id="38" w:name="_Toc187228355"/>
+      <w:bookmarkStart w:id="37" w:name="_Toc187228355"/>
       <w:r>
         <w:t>3.</w:t>
       </w:r>
       <w:r>
         <w:t>3.2 User Management</w:t>
       </w:r>
+      <w:bookmarkEnd w:id="37"/>
+    </w:p>
+    <w:p>
+      <w:pPr>
+        <w:pStyle w:val="Heading5"/>
+      </w:pPr>
+      <w:r>
+        <w:t>3.</w:t>
+      </w:r>
+      <w:r>
+        <w:t>3.2.1 User List</w:t>
+      </w:r>
+    </w:p>
+    <w:p>
+      <w:r>
+        <w:t>…</w:t>
+      </w:r>
+    </w:p>
+    <w:p>
+      <w:pPr>
+        <w:pStyle w:val="Heading5"/>
+      </w:pPr>
+      <w:r>
+        <w:t>3.</w:t>
+      </w:r>
+      <w:r>
+        <w:t>3.2.2 User Details</w:t>
+      </w:r>
+    </w:p>
+    <w:p>
+      <w:r>
+        <w:t>…</w:t>
+      </w:r>
+    </w:p>
+    <w:p>
+      <w:pPr>
+        <w:pStyle w:val="Heading2"/>
+      </w:pPr>
+      <w:bookmarkStart w:id="38" w:name="_Toc187341945"/>
+      <w:r>
+        <w:t>4. Non-Functional Requirements</w:t>
+      </w:r>
       <w:bookmarkEnd w:id="38"/>
     </w:p>
     <w:p>
       <w:pPr>
-        <w:pStyle w:val="Heading5"/>
-      </w:pPr>
-      <w:r>
-        <w:t>3.</w:t>
-      </w:r>
-      <w:r>
-        <w:t>3.2.1 User List</w:t>
-      </w:r>
-    </w:p>
-    <w:p>
-      <w:r>
-        <w:t>…</w:t>
-      </w:r>
-    </w:p>
-    <w:p>
-      <w:pPr>
-        <w:pStyle w:val="Heading5"/>
-      </w:pPr>
-      <w:r>
-        <w:t>3.</w:t>
-      </w:r>
-      <w:r>
-        <w:t>3.2.2 User Details</w:t>
-      </w:r>
-    </w:p>
-    <w:p>
-      <w:r>
-        <w:t>…</w:t>
-      </w:r>
-    </w:p>
-    <w:p>
-      <w:pPr>
-        <w:pStyle w:val="Heading2"/>
-      </w:pPr>
-      <w:bookmarkStart w:id="39" w:name="_Toc187341945"/>
-      <w:r>
-        <w:t>4. Non-Functional Requirements</w:t>
+        <w:pStyle w:val="Heading3"/>
+      </w:pPr>
+      <w:bookmarkStart w:id="39" w:name="_Toc187341946"/>
+      <w:r>
+        <w:t>3.1 External Interfaces</w:t>
       </w:r>
       <w:bookmarkEnd w:id="39"/>
-    </w:p>
-    <w:p>
-      <w:pPr>
-        <w:pStyle w:val="Heading3"/>
-      </w:pPr>
-      <w:bookmarkStart w:id="40" w:name="_Toc187341946"/>
-      <w:r>
-        <w:t>3.1 External Interfaces</w:t>
-      </w:r>
-      <w:bookmarkEnd w:id="40"/>
     </w:p>
     <w:p>
       <w:pPr>
@@ -9183,11 +9091,11 @@
       <w:pPr>
         <w:pStyle w:val="Heading3"/>
       </w:pPr>
-      <w:bookmarkStart w:id="41" w:name="_Toc187341947"/>
+      <w:bookmarkStart w:id="40" w:name="_Toc187341947"/>
       <w:r>
         <w:t>3.2 Quality Attributes</w:t>
       </w:r>
-      <w:bookmarkEnd w:id="41"/>
+      <w:bookmarkEnd w:id="40"/>
     </w:p>
     <w:p>
       <w:pPr>
@@ -9208,8 +9116,8 @@
       <w:pPr>
         <w:pStyle w:val="Heading4"/>
       </w:pPr>
-      <w:bookmarkStart w:id="42" w:name="_heading=h.1y810tw" w:colFirst="0" w:colLast="0"/>
-      <w:bookmarkEnd w:id="42"/>
+      <w:bookmarkStart w:id="41" w:name="_heading=h.1y810tw" w:colFirst="0" w:colLast="0"/>
+      <w:bookmarkEnd w:id="41"/>
       <w:r>
         <w:t xml:space="preserve">3.2.1 Usability </w:t>
       </w:r>
@@ -9234,8 +9142,8 @@
       <w:pPr>
         <w:pStyle w:val="Heading4"/>
       </w:pPr>
-      <w:bookmarkStart w:id="43" w:name="_heading=h.4i7ojhp" w:colFirst="0" w:colLast="0"/>
-      <w:bookmarkEnd w:id="43"/>
+      <w:bookmarkStart w:id="42" w:name="_heading=h.4i7ojhp" w:colFirst="0" w:colLast="0"/>
+      <w:bookmarkEnd w:id="42"/>
       <w:r>
         <w:t>3.2.2 Performance</w:t>
       </w:r>
@@ -9342,12 +9250,12 @@
       <w:pPr>
         <w:pStyle w:val="Heading2"/>
       </w:pPr>
-      <w:bookmarkStart w:id="44" w:name="_Toc187341948"/>
+      <w:bookmarkStart w:id="43" w:name="_Toc187341948"/>
       <w:r>
         <w:lastRenderedPageBreak/>
         <w:t>5. Requirement Appendix</w:t>
       </w:r>
-      <w:bookmarkEnd w:id="44"/>
+      <w:bookmarkEnd w:id="43"/>
     </w:p>
     <w:p>
       <w:pPr>
@@ -9369,11 +9277,11 @@
       <w:pPr>
         <w:pStyle w:val="Heading3"/>
       </w:pPr>
-      <w:bookmarkStart w:id="45" w:name="_Toc187341949"/>
+      <w:bookmarkStart w:id="44" w:name="_Toc187341949"/>
       <w:r>
         <w:t>5.1 Business Rules</w:t>
       </w:r>
-      <w:bookmarkEnd w:id="45"/>
+      <w:bookmarkEnd w:id="44"/>
     </w:p>
     <w:p>
       <w:pPr>
@@ -10047,11 +9955,11 @@
       <w:pPr>
         <w:pStyle w:val="Heading3"/>
       </w:pPr>
-      <w:bookmarkStart w:id="46" w:name="_Toc187341950"/>
+      <w:bookmarkStart w:id="45" w:name="_Toc187341950"/>
       <w:r>
         <w:t>5.2 System Messages</w:t>
       </w:r>
-      <w:bookmarkEnd w:id="46"/>
+      <w:bookmarkEnd w:id="45"/>
     </w:p>
     <w:tbl>
       <w:tblPr>
@@ -11437,11 +11345,16 @@
       <w:pPr>
         <w:pStyle w:val="Heading3"/>
       </w:pPr>
-      <w:bookmarkStart w:id="47" w:name="_Toc187341951"/>
-      <w:r>
-        <w:t>5.3 Other Requirements…</w:t>
-      </w:r>
+      <w:bookmarkStart w:id="46" w:name="_Toc187341951"/>
+      <w:r>
+        <w:t>5.3 Other Requirement</w:t>
+      </w:r>
+      <w:bookmarkStart w:id="47" w:name="_GoBack"/>
       <w:bookmarkEnd w:id="47"/>
+      <w:r>
+        <w:t>s…</w:t>
+      </w:r>
+      <w:bookmarkEnd w:id="46"/>
     </w:p>
     <w:sectPr>
       <w:footerReference w:type="default" r:id="rId20"/>

</xml_diff>